<commit_message>
fix(docs): dấu ** lọt vào tài liệu thay vì in đậm
Hai lỗi trong hàm dựng bảng:

1. Ô nhiều dòng thì phép kiểm tra ** chạy trên CẢ CHUỖI, nên với ô như
   "**Loại dịch vụ**\nService type" thì chuỗi không kết thúc bằng ** và dấu
   lọt nguyên vào file. Nay tách từng dòng rồi mới xét.

2. Cụm in đậm nằm GIỮA câu cũng không xử lý được — "Doanh thu **+750.000 đ**"
   chỉ in đậm khi ** bọc trọn dòng. Nay tách theo cặp ** và in đậm các đoạn ở
   vị trí lẻ, nên đậm được cả cụm giữa câu.

Đã kiểm lại toàn tài liệu: không còn dấu ** nào sót.

Co-Authored-By: Claude Opus 5 <noreply@anthropic.com>
</commit_message>
<xml_diff>
--- a/docs/HeyE-Kiem-soat-chi-phi-Huong-dan.docx
+++ b/docs/HeyE-Kiem-soat-chi-phi-Huong-dan.docx
@@ -1768,11 +1768,21 @@
             <w:r/>
             <w:r>
               <w:rPr>
-                <w:b w:val="0"/>
+                <w:b/>
                 <w:sz w:val="17"/>
               </w:rPr>
-              <w:t>**Loại dịch vụ**</w:t>
-              <w:br/>
+              <w:t>Loại dịch vụ</w:t>
+            </w:r>
+          </w:p>
+          <w:p>
+            <w:pPr>
+              <w:spacing w:after="20"/>
+            </w:pPr>
+            <w:r>
+              <w:rPr>
+                <w:b w:val="0"/>
+                <w:sz w:val="17"/>
+              </w:rPr>
               <w:t>Service type</w:t>
             </w:r>
           </w:p>
@@ -1844,11 +1854,21 @@
             <w:r/>
             <w:r>
               <w:rPr>
-                <w:b w:val="0"/>
+                <w:b/>
                 <w:sz w:val="17"/>
               </w:rPr>
-              <w:t>**Bảng giá**</w:t>
-              <w:br/>
+              <w:t>Bảng giá</w:t>
+            </w:r>
+          </w:p>
+          <w:p>
+            <w:pPr>
+              <w:spacing w:after="20"/>
+            </w:pPr>
+            <w:r>
+              <w:rPr>
+                <w:b w:val="0"/>
+                <w:sz w:val="17"/>
+              </w:rPr>
               <w:t>Rate card</w:t>
             </w:r>
           </w:p>
@@ -1920,11 +1940,21 @@
             <w:r/>
             <w:r>
               <w:rPr>
-                <w:b w:val="0"/>
+                <w:b/>
                 <w:sz w:val="17"/>
               </w:rPr>
-              <w:t>**Giá vốn**</w:t>
-              <w:br/>
+              <w:t>Giá vốn</w:t>
+            </w:r>
+          </w:p>
+          <w:p>
+            <w:pPr>
+              <w:spacing w:after="20"/>
+            </w:pPr>
+            <w:r>
+              <w:rPr>
+                <w:b w:val="0"/>
+                <w:sz w:val="17"/>
+              </w:rPr>
               <w:t>Cost rate</w:t>
             </w:r>
           </w:p>
@@ -1996,11 +2026,21 @@
             <w:r/>
             <w:r>
               <w:rPr>
-                <w:b w:val="0"/>
+                <w:b/>
                 <w:sz w:val="17"/>
               </w:rPr>
-              <w:t>**Hợp đồng**</w:t>
-              <w:br/>
+              <w:t>Hợp đồng</w:t>
+            </w:r>
+          </w:p>
+          <w:p>
+            <w:pPr>
+              <w:spacing w:after="20"/>
+            </w:pPr>
+            <w:r>
+              <w:rPr>
+                <w:b w:val="0"/>
+                <w:sz w:val="17"/>
+              </w:rPr>
               <w:t>Budget</w:t>
             </w:r>
           </w:p>
@@ -2072,11 +2112,21 @@
             <w:r/>
             <w:r>
               <w:rPr>
-                <w:b w:val="0"/>
+                <w:b/>
                 <w:sz w:val="17"/>
               </w:rPr>
-              <w:t>**Hạng mục**</w:t>
-              <w:br/>
+              <w:t>Hạng mục</w:t>
+            </w:r>
+          </w:p>
+          <w:p>
+            <w:pPr>
+              <w:spacing w:after="20"/>
+            </w:pPr>
+            <w:r>
+              <w:rPr>
+                <w:b w:val="0"/>
+                <w:sz w:val="17"/>
+              </w:rPr>
               <w:t>Service</w:t>
             </w:r>
           </w:p>
@@ -2686,10 +2736,17 @@
             <w:r/>
             <w:r>
               <w:rPr>
-                <w:b w:val="0"/>
-                <w:sz w:val="19"/>
-              </w:rPr>
-              <w:t>**Hạng mục** trong hợp đồng</w:t>
+                <w:b/>
+                <w:sz w:val="19"/>
+              </w:rPr>
+              <w:t>Hạng mục</w:t>
+            </w:r>
+            <w:r>
+              <w:rPr>
+                <w:b w:val="0"/>
+                <w:sz w:val="19"/>
+              </w:rPr>
+              <w:t xml:space="preserve"> trong hợp đồng</w:t>
             </w:r>
           </w:p>
         </w:tc>
@@ -2913,7 +2970,14 @@
                 <w:b w:val="0"/>
                 <w:sz w:val="19"/>
               </w:rPr>
-              <w:t>Doanh thu **+750.000 đ**</w:t>
+              <w:t xml:space="preserve">Doanh thu </w:t>
+            </w:r>
+            <w:r>
+              <w:rPr>
+                <w:b/>
+                <w:sz w:val="19"/>
+              </w:rPr>
+              <w:t>+750.000 đ</w:t>
             </w:r>
           </w:p>
         </w:tc>
@@ -2931,7 +2995,14 @@
                 <w:b w:val="0"/>
                 <w:sz w:val="19"/>
               </w:rPr>
-              <w:t>Chi phí **−365.018 đ**</w:t>
+              <w:t xml:space="preserve">Chi phí </w:t>
+            </w:r>
+            <w:r>
+              <w:rPr>
+                <w:b/>
+                <w:sz w:val="19"/>
+              </w:rPr>
+              <w:t>−365.018 đ</w:t>
             </w:r>
           </w:p>
         </w:tc>
@@ -2946,12 +3017,6 @@
               <w:spacing w:after="20"/>
             </w:pPr>
             <w:r/>
-            <w:r>
-              <w:rPr>
-                <w:b w:val="0"/>
-                <w:sz w:val="19"/>
-              </w:rPr>
-            </w:r>
           </w:p>
         </w:tc>
         <w:tc>
@@ -2981,12 +3046,6 @@
               <w:spacing w:after="20"/>
             </w:pPr>
             <w:r/>
-            <w:r>
-              <w:rPr>
-                <w:b w:val="0"/>
-                <w:sz w:val="19"/>
-              </w:rPr>
-            </w:r>
           </w:p>
         </w:tc>
       </w:tr>
@@ -7042,11 +7101,21 @@
             <w:r/>
             <w:r>
               <w:rPr>
-                <w:b w:val="0"/>
+                <w:b/>
                 <w:sz w:val="17"/>
               </w:rPr>
-              <w:t>**Theo giờ**</w:t>
-              <w:br/>
+              <w:t>Theo giờ</w:t>
+            </w:r>
+          </w:p>
+          <w:p>
+            <w:pPr>
+              <w:spacing w:after="20"/>
+            </w:pPr>
+            <w:r>
+              <w:rPr>
+                <w:b w:val="0"/>
+                <w:sz w:val="17"/>
+              </w:rPr>
               <w:t>Time &amp; materials</w:t>
             </w:r>
           </w:p>
@@ -7118,11 +7187,21 @@
             <w:r/>
             <w:r>
               <w:rPr>
-                <w:b w:val="0"/>
+                <w:b/>
                 <w:sz w:val="17"/>
               </w:rPr>
-              <w:t>**Trọn gói**</w:t>
-              <w:br/>
+              <w:t>Trọn gói</w:t>
+            </w:r>
+          </w:p>
+          <w:p>
+            <w:pPr>
+              <w:spacing w:after="20"/>
+            </w:pPr>
+            <w:r>
+              <w:rPr>
+                <w:b w:val="0"/>
+                <w:sz w:val="17"/>
+              </w:rPr>
               <w:t>Fixed</w:t>
             </w:r>
           </w:p>
@@ -7194,11 +7273,21 @@
             <w:r/>
             <w:r>
               <w:rPr>
-                <w:b w:val="0"/>
+                <w:b/>
                 <w:sz w:val="17"/>
               </w:rPr>
-              <w:t>**Phần trăm**</w:t>
-              <w:br/>
+              <w:t>Phần trăm</w:t>
+            </w:r>
+          </w:p>
+          <w:p>
+            <w:pPr>
+              <w:spacing w:after="20"/>
+            </w:pPr>
+            <w:r>
+              <w:rPr>
+                <w:b w:val="0"/>
+                <w:sz w:val="17"/>
+              </w:rPr>
               <w:t>Percentage</w:t>
             </w:r>
           </w:p>
@@ -7270,11 +7359,21 @@
             <w:r/>
             <w:r>
               <w:rPr>
-                <w:b w:val="0"/>
+                <w:b/>
                 <w:sz w:val="17"/>
               </w:rPr>
-              <w:t>**Không tính tiền**</w:t>
-              <w:br/>
+              <w:t>Không tính tiền</w:t>
+            </w:r>
+          </w:p>
+          <w:p>
+            <w:pPr>
+              <w:spacing w:after="20"/>
+            </w:pPr>
+            <w:r>
+              <w:rPr>
+                <w:b w:val="0"/>
+                <w:sz w:val="17"/>
+              </w:rPr>
               <w:t>Non-billable</w:t>
             </w:r>
           </w:p>
@@ -11882,11 +11981,21 @@
             <w:r/>
             <w:r>
               <w:rPr>
-                <w:b w:val="0"/>
-                <w:sz w:val="19"/>
-              </w:rPr>
-              <w:t>**Thời gian**</w:t>
-              <w:br/>
+                <w:b/>
+                <w:sz w:val="19"/>
+              </w:rPr>
+              <w:t>Thời gian</w:t>
+            </w:r>
+          </w:p>
+          <w:p>
+            <w:pPr>
+              <w:spacing w:after="20"/>
+            </w:pPr>
+            <w:r>
+              <w:rPr>
+                <w:b w:val="0"/>
+                <w:sz w:val="19"/>
+              </w:rPr>
               <w:t>Time</w:t>
             </w:r>
           </w:p>
@@ -11996,11 +12105,21 @@
             <w:r/>
             <w:r>
               <w:rPr>
-                <w:b w:val="0"/>
-                <w:sz w:val="19"/>
-              </w:rPr>
-              <w:t>**Chi phí**</w:t>
-              <w:br/>
+                <w:b/>
+                <w:sz w:val="19"/>
+              </w:rPr>
+              <w:t>Chi phí</w:t>
+            </w:r>
+          </w:p>
+          <w:p>
+            <w:pPr>
+              <w:spacing w:after="20"/>
+            </w:pPr>
+            <w:r>
+              <w:rPr>
+                <w:b w:val="0"/>
+                <w:sz w:val="19"/>
+              </w:rPr>
               <w:t>Cost</w:t>
             </w:r>
           </w:p>

</xml_diff>

<commit_message>
docs: bỏ chương Vấn đề, cắt gọn phần mở đầu
Chương "Vấn đề đang giải quyết" là phần bán ý tưởng, không phải hướng dẫn dùng.
Người đọc tài liệu này đã dùng sản phẩm rồi, không cần thuyết phục lại. Bỏ hẳn,
vào thẳng mô hình dữ liệu.

Trang bìa bỏ dòng tiếng Anh và rút bảng thông tin từ 5 dòng còn 4.

Các đoạn dẫn nhập đầu mỗi chương rút còn một câu — bỏ những câu chỉ nhắc lại
tiêu đề như "Đọc kỹ phần này trước khi thao tác" hay "Đây là điểm hay bị nhầm
nhất".

Còn 13 chương, đánh số lại toàn bộ cho khớp mục lục.

Co-Authored-By: Claude Opus 5 <noreply@anthropic.com>
</commit_message>
<xml_diff>
--- a/docs/HeyE-Kiem-soat-chi-phi-Huong-dan.docx
+++ b/docs/HeyE-Kiem-soat-chi-phi-Huong-dan.docx
@@ -2,6 +2,7 @@
 <file path=word/document.xml><?xml version="1.0" encoding="utf-8"?>
 <w:document xmlns:wpc="http://schemas.microsoft.com/office/word/2010/wordprocessingCanvas" xmlns:mo="http://schemas.microsoft.com/office/mac/office/2008/main" xmlns:mc="http://schemas.openxmlformats.org/markup-compatibility/2006" xmlns:mv="urn:schemas-microsoft-com:mac:vml" xmlns:o="urn:schemas-microsoft-com:office:office" xmlns:r="http://schemas.openxmlformats.org/officeDocument/2006/relationships" xmlns:m="http://schemas.openxmlformats.org/officeDocument/2006/math" xmlns:v="urn:schemas-microsoft-com:vml" xmlns:wp14="http://schemas.microsoft.com/office/word/2010/wordprocessingDrawing" xmlns:wp="http://schemas.openxmlformats.org/drawingml/2006/wordprocessingDrawing" xmlns:w10="urn:schemas-microsoft-com:office:word" xmlns:w="http://schemas.openxmlformats.org/wordprocessingml/2006/main" xmlns:w14="http://schemas.microsoft.com/office/word/2010/wordml" xmlns:wpg="http://schemas.microsoft.com/office/word/2010/wordprocessingGroup" xmlns:wpi="http://schemas.microsoft.com/office/word/2010/wordprocessingInk" xmlns:wne="http://schemas.microsoft.com/office/word/2006/wordml" xmlns:wps="http://schemas.microsoft.com/office/word/2010/wordprocessingShape" mc:Ignorable="w14 wp14">
   <w:body>
+    <w:p/>
     <w:p/>
     <w:p/>
     <w:p/>
@@ -28,23 +29,10 @@
           <w:color w:val="6B6B80"/>
           <w:sz w:val="28"/>
         </w:rPr>
-        <w:t>Tài liệu hướng dẫn tính năng và cấu hình</w:t>
+        <w:t>Hướng dẫn tính năng và cấu hình</w:t>
       </w:r>
     </w:p>
     <w:p/>
-    <w:p>
-      <w:pPr>
-        <w:jc w:val="center"/>
-      </w:pPr>
-      <w:r>
-        <w:rPr>
-          <w:i/>
-          <w:color w:val="6B6B80"/>
-          <w:sz w:val="22"/>
-        </w:rPr>
-        <w:t>Cost Control Module — Feature &amp; Configuration Guide</w:t>
-      </w:r>
-    </w:p>
     <w:p/>
     <w:p/>
     <w:p/>
@@ -87,7 +75,7 @@
               <w:rPr>
                 <w:sz w:val="20"/>
               </w:rPr>
-              <w:t>v1.0</w:t>
+              <w:t>v1.0 — 24/08/2026</w:t>
             </w:r>
           </w:p>
         </w:tc>
@@ -104,7 +92,7 @@
                 <w:b/>
                 <w:sz w:val="20"/>
               </w:rPr>
-              <w:t>Ngày phát hành</w:t>
+              <w:t>Đối tượng đọc</w:t>
             </w:r>
           </w:p>
         </w:tc>
@@ -118,7 +106,7 @@
               <w:rPr>
                 <w:sz w:val="20"/>
               </w:rPr>
-              <w:t>24/08/2026</w:t>
+              <w:t>PM, BA, Sale, Kế toán, Dev, QC</w:t>
             </w:r>
           </w:p>
         </w:tc>
@@ -135,7 +123,7 @@
                 <w:b/>
                 <w:sz w:val="20"/>
               </w:rPr>
-              <w:t>Đối tượng đọc</w:t>
+              <w:t>Phạm vi</w:t>
             </w:r>
           </w:p>
         </w:tc>
@@ -149,7 +137,7 @@
               <w:rPr>
                 <w:sz w:val="20"/>
               </w:rPr>
-              <w:t>Toàn bộ team — PM, BA, Sale, Kế toán, Dev, QC</w:t>
+              <w:t>Module Tài chính — 8 màn hình</w:t>
             </w:r>
           </w:p>
         </w:tc>
@@ -166,7 +154,7 @@
                 <w:b/>
                 <w:sz w:val="20"/>
               </w:rPr>
-              <w:t>Phạm vi</w:t>
+              <w:t>Trạng thái</w:t>
             </w:r>
           </w:p>
         </w:tc>
@@ -180,38 +168,7 @@
               <w:rPr>
                 <w:sz w:val="20"/>
               </w:rPr>
-              <w:t>Module Tài chính: 8 màn hình + cấu hình</w:t>
-            </w:r>
-          </w:p>
-        </w:tc>
-      </w:tr>
-      <w:tr>
-        <w:tc>
-          <w:tcPr>
-            <w:tcW w:type="dxa" w:w="2551"/>
-          </w:tcPr>
-          <w:p>
-            <w:r/>
-            <w:r>
-              <w:rPr>
-                <w:b/>
-                <w:sz w:val="20"/>
-              </w:rPr>
-              <w:t>Trạng thái</w:t>
-            </w:r>
-          </w:p>
-        </w:tc>
-        <w:tc>
-          <w:tcPr>
-            <w:tcW w:type="dxa" w:w="6520"/>
-          </w:tcPr>
-          <w:p>
-            <w:r/>
-            <w:r>
-              <w:rPr>
-                <w:sz w:val="20"/>
-              </w:rPr>
-              <w:t>Đã hoàn thiện, đang chạy trên bản demo</w:t>
+              <w:t>Đang chạy trên bản demo</w:t>
             </w:r>
           </w:p>
         </w:tc>
@@ -337,7 +294,7 @@
                 <w:b/>
                 <w:sz w:val="19"/>
               </w:rPr>
-              <w:t>Vấn đề đang giải quyết</w:t>
+              <w:t>Mô hình dữ liệu — 5 khái niệm cốt lõi</w:t>
             </w:r>
           </w:p>
         </w:tc>
@@ -355,7 +312,7 @@
                 <w:b w:val="0"/>
                 <w:sz w:val="19"/>
               </w:rPr>
-              <w:t>Vì sao cần module này</w:t>
+              <w:t>Hiểu đúng trước khi dùng</w:t>
             </w:r>
           </w:p>
         </w:tc>
@@ -393,7 +350,7 @@
                 <w:b/>
                 <w:sz w:val="19"/>
               </w:rPr>
-              <w:t>Mô hình dữ liệu — 5 khái niệm cốt lõi</w:t>
+              <w:t>Hai trục tính tiền: Giá bán và Giá vốn</w:t>
             </w:r>
           </w:p>
         </w:tc>
@@ -411,7 +368,7 @@
                 <w:b w:val="0"/>
                 <w:sz w:val="19"/>
               </w:rPr>
-              <w:t>Hiểu đúng trước khi dùng</w:t>
+              <w:t>Nền tảng của mọi con số</w:t>
             </w:r>
           </w:p>
         </w:tc>
@@ -449,7 +406,7 @@
                 <w:b/>
                 <w:sz w:val="19"/>
               </w:rPr>
-              <w:t>Hai trục tính tiền: Giá bán và Giá vốn</w:t>
+              <w:t>Màn 1 — Loại dịch vụ</w:t>
             </w:r>
           </w:p>
         </w:tc>
@@ -467,7 +424,7 @@
                 <w:b w:val="0"/>
                 <w:sz w:val="19"/>
               </w:rPr>
-              <w:t>Nền tảng của mọi con số</w:t>
+              <w:t>Danh mục gốc, khai một lần</w:t>
             </w:r>
           </w:p>
         </w:tc>
@@ -505,7 +462,7 @@
                 <w:b/>
                 <w:sz w:val="19"/>
               </w:rPr>
-              <w:t>Màn 1 — Loại dịch vụ</w:t>
+              <w:t>Màn 2 — Bảng giá</w:t>
             </w:r>
           </w:p>
         </w:tc>
@@ -523,7 +480,7 @@
                 <w:b w:val="0"/>
                 <w:sz w:val="19"/>
               </w:rPr>
-              <w:t>Danh mục gốc, khai một lần</w:t>
+              <w:t>Đơn giá bán theo từng khách</w:t>
             </w:r>
           </w:p>
         </w:tc>
@@ -561,7 +518,7 @@
                 <w:b/>
                 <w:sz w:val="19"/>
               </w:rPr>
-              <w:t>Màn 2 — Bảng giá</w:t>
+              <w:t>Màn 3 — Giá vốn nhân sự</w:t>
             </w:r>
           </w:p>
         </w:tc>
@@ -579,7 +536,7 @@
                 <w:b w:val="0"/>
                 <w:sz w:val="19"/>
               </w:rPr>
-              <w:t>Đơn giá bán theo từng khách</w:t>
+              <w:t>Một giờ của mỗi người tốn bao nhiêu</w:t>
             </w:r>
           </w:p>
         </w:tc>
@@ -617,7 +574,7 @@
                 <w:b/>
                 <w:sz w:val="19"/>
               </w:rPr>
-              <w:t>Màn 3 — Giá vốn nhân sự</w:t>
+              <w:t>Màn 4 — Hợp đồng</w:t>
             </w:r>
           </w:p>
         </w:tc>
@@ -635,7 +592,7 @@
                 <w:b w:val="0"/>
                 <w:sz w:val="19"/>
               </w:rPr>
-              <w:t>Một giờ của mỗi người tốn bao nhiêu</w:t>
+              <w:t>Nơi ra lãi lỗ</w:t>
             </w:r>
           </w:p>
         </w:tc>
@@ -673,7 +630,7 @@
                 <w:b/>
                 <w:sz w:val="19"/>
               </w:rPr>
-              <w:t>Màn 4 — Hợp đồng</w:t>
+              <w:t>Màn 5 — Giờ của tôi</w:t>
             </w:r>
           </w:p>
         </w:tc>
@@ -691,7 +648,7 @@
                 <w:b w:val="0"/>
                 <w:sz w:val="19"/>
               </w:rPr>
-              <w:t>Nơi ra lãi lỗ</w:t>
+              <w:t>Nhân viên ghi giờ</w:t>
             </w:r>
           </w:p>
         </w:tc>
@@ -729,7 +686,7 @@
                 <w:b/>
                 <w:sz w:val="19"/>
               </w:rPr>
-              <w:t>Màn 5 — Giờ của tôi</w:t>
+              <w:t>Màn 6 — Giờ toàn công ty</w:t>
             </w:r>
           </w:p>
         </w:tc>
@@ -747,7 +704,7 @@
                 <w:b w:val="0"/>
                 <w:sz w:val="19"/>
               </w:rPr>
-              <w:t>Nhân viên ghi giờ</w:t>
+              <w:t>Quản lý duyệt và ghi hộ</w:t>
             </w:r>
           </w:p>
         </w:tc>
@@ -785,7 +742,7 @@
                 <w:b/>
                 <w:sz w:val="19"/>
               </w:rPr>
-              <w:t>Màn 6 — Giờ toàn công ty</w:t>
+              <w:t>Màn 7 — Chi phí</w:t>
             </w:r>
           </w:p>
         </w:tc>
@@ -803,7 +760,7 @@
                 <w:b w:val="0"/>
                 <w:sz w:val="19"/>
               </w:rPr>
-              <w:t>Quản lý duyệt và ghi hộ</w:t>
+              <w:t>Tiền chi ra ngoài lương</w:t>
             </w:r>
           </w:p>
         </w:tc>
@@ -841,7 +798,7 @@
                 <w:b/>
                 <w:sz w:val="19"/>
               </w:rPr>
-              <w:t>Màn 7 — Chi phí</w:t>
+              <w:t>Màn 8 — Biểu đồ và báo cáo</w:t>
             </w:r>
           </w:p>
         </w:tc>
@@ -859,7 +816,7 @@
                 <w:b w:val="0"/>
                 <w:sz w:val="19"/>
               </w:rPr>
-              <w:t>Tiền chi ra ngoài lương</w:t>
+              <w:t>Đọc số ra quyết định</w:t>
             </w:r>
           </w:p>
         </w:tc>
@@ -897,7 +854,7 @@
                 <w:b/>
                 <w:sz w:val="19"/>
               </w:rPr>
-              <w:t>Màn 8 — Biểu đồ và báo cáo</w:t>
+              <w:t>Quy tắc nghiệp vụ quan trọng</w:t>
             </w:r>
           </w:p>
         </w:tc>
@@ -915,7 +872,7 @@
                 <w:b w:val="0"/>
                 <w:sz w:val="19"/>
               </w:rPr>
-              <w:t>Đọc số ra quyết định</w:t>
+              <w:t>Những điều dễ hiểu sai</w:t>
             </w:r>
           </w:p>
         </w:tc>
@@ -953,7 +910,7 @@
                 <w:b/>
                 <w:sz w:val="19"/>
               </w:rPr>
-              <w:t>Quy tắc nghiệp vụ quan trọng</w:t>
+              <w:t>Danh mục case dữ liệu mẫu</w:t>
             </w:r>
           </w:p>
         </w:tc>
@@ -971,7 +928,7 @@
                 <w:b w:val="0"/>
                 <w:sz w:val="19"/>
               </w:rPr>
-              <w:t>Những điều dễ hiểu sai</w:t>
+              <w:t>Đối chiếu khi kiểm thử</w:t>
             </w:r>
           </w:p>
         </w:tc>
@@ -992,62 +949,6 @@
                 <w:sz w:val="19"/>
               </w:rPr>
               <w:t>13</w:t>
-            </w:r>
-          </w:p>
-        </w:tc>
-        <w:tc>
-          <w:tcPr>
-            <w:tcW w:type="dxa" w:w="3685"/>
-          </w:tcPr>
-          <w:p>
-            <w:pPr>
-              <w:spacing w:after="20"/>
-            </w:pPr>
-            <w:r/>
-            <w:r>
-              <w:rPr>
-                <w:b/>
-                <w:sz w:val="19"/>
-              </w:rPr>
-              <w:t>Danh mục case dữ liệu mẫu</w:t>
-            </w:r>
-          </w:p>
-        </w:tc>
-        <w:tc>
-          <w:tcPr>
-            <w:tcW w:type="dxa" w:w="4932"/>
-          </w:tcPr>
-          <w:p>
-            <w:pPr>
-              <w:spacing w:after="20"/>
-            </w:pPr>
-            <w:r/>
-            <w:r>
-              <w:rPr>
-                <w:b w:val="0"/>
-                <w:sz w:val="19"/>
-              </w:rPr>
-              <w:t>Đối chiếu khi kiểm thử</w:t>
-            </w:r>
-          </w:p>
-        </w:tc>
-      </w:tr>
-      <w:tr>
-        <w:tc>
-          <w:tcPr>
-            <w:tcW w:type="dxa" w:w="680"/>
-          </w:tcPr>
-          <w:p>
-            <w:pPr>
-              <w:spacing w:after="20"/>
-            </w:pPr>
-            <w:r/>
-            <w:r>
-              <w:rPr>
-                <w:b w:val="0"/>
-                <w:sz w:val="19"/>
-              </w:rPr>
-              <w:t>14</w:t>
             </w:r>
           </w:p>
         </w:tc>
@@ -1104,15 +1005,7 @@
         <w:pStyle w:val="Heading1"/>
       </w:pPr>
       <w:r>
-        <w:t>1. Vấn đề đang giải quyết</w:t>
-      </w:r>
-    </w:p>
-    <w:p>
-      <w:pPr>
-        <w:pStyle w:val="Heading2"/>
-      </w:pPr>
-      <w:r>
-        <w:t>1.1 Trước khi có module này</w:t>
+        <w:t>1. Mô hình dữ liệu — 5 khái niệm cốt lõi</w:t>
       </w:r>
     </w:p>
     <w:p>
@@ -1121,544 +1014,7 @@
           <w:b w:val="0"/>
           <w:i w:val="0"/>
         </w:rPr>
-        <w:t>Công ty bán phần mềm và dịch vụ triển khai cho ngân hàng. Mỗi hợp đồng kéo dài nhiều tháng, huy động nhiều người với mức lương khác nhau, kèm chi phí mua ngoài như bản quyền nền tảng, thuê thầu phụ, công tác phí.</w:t>
-      </w:r>
-    </w:p>
-    <w:p>
-      <w:r>
-        <w:rPr>
-          <w:b w:val="0"/>
-          <w:i w:val="0"/>
-        </w:rPr>
-        <w:t>Ba câu hỏi sau đây không ai trả lời được bằng số:</w:t>
-      </w:r>
-    </w:p>
-    <w:p>
-      <w:pPr>
-        <w:pStyle w:val="ListBullet"/>
-        <w:spacing w:after="40"/>
-        <w:ind w:left="340"/>
-      </w:pPr>
-      <w:r>
-        <w:t>Hợp đồng Sacombank đang lãi hay lỗ, lãi bao nhiêu phần trăm?</w:t>
-      </w:r>
-    </w:p>
-    <w:p>
-      <w:pPr>
-        <w:pStyle w:val="ListBullet"/>
-        <w:spacing w:after="40"/>
-        <w:ind w:left="340"/>
-      </w:pPr>
-      <w:r>
-        <w:t>Mảng Kiểm thử của cả công ty năm nay đóng góp bao nhiêu doanh thu?</w:t>
-      </w:r>
-    </w:p>
-    <w:p>
-      <w:pPr>
-        <w:pStyle w:val="ListBullet"/>
-        <w:spacing w:after="40"/>
-        <w:ind w:left="340"/>
-      </w:pPr>
-      <w:r>
-        <w:t>Còn bao nhiêu ngân sách trước khi vượt hợp đồng?</w:t>
-      </w:r>
-    </w:p>
-    <w:p>
-      <w:r>
-        <w:rPr>
-          <w:b w:val="0"/>
-          <w:i w:val="0"/>
-        </w:rPr>
-        <w:t>Không trả lời được vì ba mảnh dữ liệu nằm rời rạc: giá bán trong file báo giá, lương trong bảng lương, giờ làm trong đầu mỗi người. Ghép tay thì mất vài ngày, và ghép xong thì số đã cũ.</w:t>
-      </w:r>
-    </w:p>
-    <w:p>
-      <w:pPr>
-        <w:pStyle w:val="Heading2"/>
-      </w:pPr>
-      <w:r>
-        <w:t>1.2 Sau khi có module này</w:t>
-      </w:r>
-    </w:p>
-    <w:tbl>
-      <w:tblPr>
-        <w:tblStyle w:val="TableGrid"/>
-        <w:tblW w:type="auto" w:w="0"/>
-        <w:jc w:val="center"/>
-        <w:tblLook w:firstColumn="1" w:firstRow="1" w:lastColumn="0" w:lastRow="0" w:noHBand="0" w:noVBand="1" w:val="04A0"/>
-      </w:tblPr>
-      <w:tblGrid>
-        <w:gridCol w:w="3213"/>
-        <w:gridCol w:w="3213"/>
-        <w:gridCol w:w="3213"/>
-      </w:tblGrid>
-      <w:tr>
-        <w:tc>
-          <w:tcPr>
-            <w:tcW w:type="dxa" w:w="3515"/>
-            <w:shd w:val="clear" w:fill="5B3DF5"/>
-          </w:tcPr>
-          <w:p>
-            <w:pPr>
-              <w:spacing w:after="20"/>
-            </w:pPr>
-            <w:r/>
-            <w:r>
-              <w:rPr>
-                <w:b/>
-                <w:color w:val="FFFFFF"/>
-                <w:sz w:val="19"/>
-              </w:rPr>
-              <w:t>Câu hỏi</w:t>
-            </w:r>
-          </w:p>
-        </w:tc>
-        <w:tc>
-          <w:tcPr>
-            <w:tcW w:type="dxa" w:w="3685"/>
-            <w:shd w:val="clear" w:fill="5B3DF5"/>
-          </w:tcPr>
-          <w:p>
-            <w:pPr>
-              <w:spacing w:after="20"/>
-            </w:pPr>
-            <w:r/>
-            <w:r>
-              <w:rPr>
-                <w:b/>
-                <w:color w:val="FFFFFF"/>
-                <w:sz w:val="19"/>
-              </w:rPr>
-              <w:t>Trả lời ở đâu</w:t>
-            </w:r>
-          </w:p>
-        </w:tc>
-        <w:tc>
-          <w:tcPr>
-            <w:tcW w:type="dxa" w:w="2098"/>
-            <w:shd w:val="clear" w:fill="5B3DF5"/>
-          </w:tcPr>
-          <w:p>
-            <w:pPr>
-              <w:spacing w:after="20"/>
-            </w:pPr>
-            <w:r/>
-            <w:r>
-              <w:rPr>
-                <w:b/>
-                <w:color w:val="FFFFFF"/>
-                <w:sz w:val="19"/>
-              </w:rPr>
-              <w:t>Mất bao lâu</w:t>
-            </w:r>
-          </w:p>
-        </w:tc>
-      </w:tr>
-      <w:tr>
-        <w:tc>
-          <w:tcPr>
-            <w:tcW w:type="dxa" w:w="3515"/>
-          </w:tcPr>
-          <w:p>
-            <w:pPr>
-              <w:spacing w:after="20"/>
-            </w:pPr>
-            <w:r/>
-            <w:r>
-              <w:rPr>
-                <w:b w:val="0"/>
-                <w:sz w:val="19"/>
-              </w:rPr>
-              <w:t>Hợp đồng này lãi lỗ ra sao</w:t>
-            </w:r>
-          </w:p>
-        </w:tc>
-        <w:tc>
-          <w:tcPr>
-            <w:tcW w:type="dxa" w:w="3685"/>
-          </w:tcPr>
-          <w:p>
-            <w:pPr>
-              <w:spacing w:after="20"/>
-            </w:pPr>
-            <w:r/>
-            <w:r>
-              <w:rPr>
-                <w:b w:val="0"/>
-                <w:sz w:val="19"/>
-              </w:rPr>
-              <w:t>Tab Tổng quan của hợp đồng</w:t>
-            </w:r>
-          </w:p>
-        </w:tc>
-        <w:tc>
-          <w:tcPr>
-            <w:tcW w:type="dxa" w:w="2098"/>
-          </w:tcPr>
-          <w:p>
-            <w:pPr>
-              <w:spacing w:after="20"/>
-            </w:pPr>
-            <w:r/>
-            <w:r>
-              <w:rPr>
-                <w:b w:val="0"/>
-                <w:sz w:val="19"/>
-              </w:rPr>
-              <w:t>Ngay lập tức</w:t>
-            </w:r>
-          </w:p>
-        </w:tc>
-      </w:tr>
-      <w:tr>
-        <w:tc>
-          <w:tcPr>
-            <w:tcW w:type="dxa" w:w="3515"/>
-          </w:tcPr>
-          <w:p>
-            <w:pPr>
-              <w:spacing w:after="20"/>
-            </w:pPr>
-            <w:r/>
-            <w:r>
-              <w:rPr>
-                <w:b w:val="0"/>
-                <w:sz w:val="19"/>
-              </w:rPr>
-              <w:t>Còn bao nhiêu ngân sách</w:t>
-            </w:r>
-          </w:p>
-        </w:tc>
-        <w:tc>
-          <w:tcPr>
-            <w:tcW w:type="dxa" w:w="3685"/>
-          </w:tcPr>
-          <w:p>
-            <w:pPr>
-              <w:spacing w:after="20"/>
-            </w:pPr>
-            <w:r/>
-            <w:r>
-              <w:rPr>
-                <w:b w:val="0"/>
-                <w:sz w:val="19"/>
-              </w:rPr>
-              <w:t>Ô Ngân sách, có thanh tiến độ</w:t>
-            </w:r>
-          </w:p>
-        </w:tc>
-        <w:tc>
-          <w:tcPr>
-            <w:tcW w:type="dxa" w:w="2098"/>
-          </w:tcPr>
-          <w:p>
-            <w:pPr>
-              <w:spacing w:after="20"/>
-            </w:pPr>
-            <w:r/>
-            <w:r>
-              <w:rPr>
-                <w:b w:val="0"/>
-                <w:sz w:val="19"/>
-              </w:rPr>
-              <w:t>Ngay lập tức</w:t>
-            </w:r>
-          </w:p>
-        </w:tc>
-      </w:tr>
-      <w:tr>
-        <w:tc>
-          <w:tcPr>
-            <w:tcW w:type="dxa" w:w="3515"/>
-          </w:tcPr>
-          <w:p>
-            <w:pPr>
-              <w:spacing w:after="20"/>
-            </w:pPr>
-            <w:r/>
-            <w:r>
-              <w:rPr>
-                <w:b w:val="0"/>
-                <w:sz w:val="19"/>
-              </w:rPr>
-              <w:t>Khi nào ngân sách cạn</w:t>
-            </w:r>
-          </w:p>
-        </w:tc>
-        <w:tc>
-          <w:tcPr>
-            <w:tcW w:type="dxa" w:w="3685"/>
-          </w:tcPr>
-          <w:p>
-            <w:pPr>
-              <w:spacing w:after="20"/>
-            </w:pPr>
-            <w:r/>
-            <w:r>
-              <w:rPr>
-                <w:b w:val="0"/>
-                <w:sz w:val="19"/>
-              </w:rPr>
-              <w:t>Cảnh báo đỏ trên biểu đồ</w:t>
-            </w:r>
-          </w:p>
-        </w:tc>
-        <w:tc>
-          <w:tcPr>
-            <w:tcW w:type="dxa" w:w="2098"/>
-          </w:tcPr>
-          <w:p>
-            <w:pPr>
-              <w:spacing w:after="20"/>
-            </w:pPr>
-            <w:r/>
-            <w:r>
-              <w:rPr>
-                <w:b w:val="0"/>
-                <w:sz w:val="19"/>
-              </w:rPr>
-              <w:t>Ngay lập tức</w:t>
-            </w:r>
-          </w:p>
-        </w:tc>
-      </w:tr>
-      <w:tr>
-        <w:tc>
-          <w:tcPr>
-            <w:tcW w:type="dxa" w:w="3515"/>
-          </w:tcPr>
-          <w:p>
-            <w:pPr>
-              <w:spacing w:after="20"/>
-            </w:pPr>
-            <w:r/>
-            <w:r>
-              <w:rPr>
-                <w:b w:val="0"/>
-                <w:sz w:val="19"/>
-              </w:rPr>
-              <w:t>Ai chưa ghi giờ tuần này</w:t>
-            </w:r>
-          </w:p>
-        </w:tc>
-        <w:tc>
-          <w:tcPr>
-            <w:tcW w:type="dxa" w:w="3685"/>
-          </w:tcPr>
-          <w:p>
-            <w:pPr>
-              <w:spacing w:after="20"/>
-            </w:pPr>
-            <w:r/>
-            <w:r>
-              <w:rPr>
-                <w:b w:val="0"/>
-                <w:sz w:val="19"/>
-              </w:rPr>
-              <w:t>Giờ toàn công ty, ô đỏ</w:t>
-            </w:r>
-          </w:p>
-        </w:tc>
-        <w:tc>
-          <w:tcPr>
-            <w:tcW w:type="dxa" w:w="2098"/>
-          </w:tcPr>
-          <w:p>
-            <w:pPr>
-              <w:spacing w:after="20"/>
-            </w:pPr>
-            <w:r/>
-            <w:r>
-              <w:rPr>
-                <w:b w:val="0"/>
-                <w:sz w:val="19"/>
-              </w:rPr>
-              <w:t>Ngay lập tức</w:t>
-            </w:r>
-          </w:p>
-        </w:tc>
-      </w:tr>
-      <w:tr>
-        <w:tc>
-          <w:tcPr>
-            <w:tcW w:type="dxa" w:w="3515"/>
-          </w:tcPr>
-          <w:p>
-            <w:pPr>
-              <w:spacing w:after="20"/>
-            </w:pPr>
-            <w:r/>
-            <w:r>
-              <w:rPr>
-                <w:b w:val="0"/>
-                <w:sz w:val="19"/>
-              </w:rPr>
-              <w:t>Chi phí nào chưa được duyệt</w:t>
-            </w:r>
-          </w:p>
-        </w:tc>
-        <w:tc>
-          <w:tcPr>
-            <w:tcW w:type="dxa" w:w="3685"/>
-          </w:tcPr>
-          <w:p>
-            <w:pPr>
-              <w:spacing w:after="20"/>
-            </w:pPr>
-            <w:r/>
-            <w:r>
-              <w:rPr>
-                <w:b w:val="0"/>
-                <w:sz w:val="19"/>
-              </w:rPr>
-              <w:t>Màn Chi phí, chip lọc</w:t>
-            </w:r>
-          </w:p>
-        </w:tc>
-        <w:tc>
-          <w:tcPr>
-            <w:tcW w:type="dxa" w:w="2098"/>
-          </w:tcPr>
-          <w:p>
-            <w:pPr>
-              <w:spacing w:after="20"/>
-            </w:pPr>
-            <w:r/>
-            <w:r>
-              <w:rPr>
-                <w:b w:val="0"/>
-                <w:sz w:val="19"/>
-              </w:rPr>
-              <w:t>Ngay lập tức</w:t>
-            </w:r>
-          </w:p>
-        </w:tc>
-      </w:tr>
-      <w:tr>
-        <w:tc>
-          <w:tcPr>
-            <w:tcW w:type="dxa" w:w="3515"/>
-          </w:tcPr>
-          <w:p>
-            <w:pPr>
-              <w:spacing w:after="20"/>
-            </w:pPr>
-            <w:r/>
-            <w:r>
-              <w:rPr>
-                <w:b w:val="0"/>
-                <w:sz w:val="19"/>
-              </w:rPr>
-              <w:t>Giờ nào làm mà không ra tiền</w:t>
-            </w:r>
-          </w:p>
-        </w:tc>
-        <w:tc>
-          <w:tcPr>
-            <w:tcW w:type="dxa" w:w="3685"/>
-          </w:tcPr>
-          <w:p>
-            <w:pPr>
-              <w:spacing w:after="20"/>
-            </w:pPr>
-            <w:r/>
-            <w:r>
-              <w:rPr>
-                <w:b w:val="0"/>
-                <w:sz w:val="19"/>
-              </w:rPr>
-              <w:t>Ô Chi phí, dòng Giờ không ra tiền</w:t>
-            </w:r>
-          </w:p>
-        </w:tc>
-        <w:tc>
-          <w:tcPr>
-            <w:tcW w:type="dxa" w:w="2098"/>
-          </w:tcPr>
-          <w:p>
-            <w:pPr>
-              <w:spacing w:after="20"/>
-            </w:pPr>
-            <w:r/>
-            <w:r>
-              <w:rPr>
-                <w:b w:val="0"/>
-                <w:sz w:val="19"/>
-              </w:rPr>
-              <w:t>Ngay lập tức</w:t>
-            </w:r>
-          </w:p>
-        </w:tc>
-      </w:tr>
-    </w:tbl>
-    <w:p>
-      <w:pPr>
-        <w:spacing w:after="40"/>
-      </w:pPr>
-    </w:p>
-    <w:p>
-      <w:pPr>
-        <w:pStyle w:val="Heading2"/>
-      </w:pPr>
-      <w:r>
-        <w:t>1.3 Nguyên tắc thiết kế</w:t>
-      </w:r>
-    </w:p>
-    <w:tbl>
-      <w:tblPr>
-        <w:tblStyle w:val="TableGrid"/>
-        <w:tblW w:type="auto" w:w="0"/>
-        <w:tblLook w:firstColumn="1" w:firstRow="1" w:lastColumn="0" w:lastRow="0" w:noHBand="0" w:noVBand="1" w:val="04A0"/>
-      </w:tblPr>
-      <w:tblGrid>
-        <w:gridCol w:w="9638"/>
-      </w:tblGrid>
-      <w:tr>
-        <w:tc>
-          <w:tcPr>
-            <w:tcW w:type="dxa" w:w="9638"/>
-            <w:shd w:val="clear" w:fill="EEF0FE"/>
-          </w:tcPr>
-          <w:p>
-            <w:pPr>
-              <w:spacing w:after="60" w:before="60"/>
-            </w:pPr>
-            <w:r/>
-            <w:r>
-              <w:rPr>
-                <w:sz w:val="19"/>
-              </w:rPr>
-              <w:t>Module này dựng theo mô hình của Productive.io — phần mềm quản trị công ty dịch vụ được dùng rộng rãi trên thế giới. Cách sắp xếp màn hình, tên gọi và công thức tính đều bám theo chuẩn đó, nên mỗi nhãn tiếng Việt đều kèm thuật ngữ tiếng Anh gốc để đối chiếu khi cần.</w:t>
-            </w:r>
-          </w:p>
-        </w:tc>
-      </w:tr>
-    </w:tbl>
-    <w:p>
-      <w:pPr>
-        <w:spacing w:after="40"/>
-      </w:pPr>
-    </w:p>
-    <w:p>
-      <w:r>
-        <w:br w:type="page"/>
-      </w:r>
-    </w:p>
-    <w:p>
-      <w:pPr>
-        <w:pStyle w:val="Heading1"/>
-      </w:pPr>
-      <w:r>
-        <w:t>2. Mô hình dữ liệu — 5 khái niệm cốt lõi</w:t>
-      </w:r>
-    </w:p>
-    <w:p>
-      <w:r>
-        <w:rPr>
-          <w:b w:val="0"/>
-          <w:i w:val="0"/>
-        </w:rPr>
-        <w:t>Đọc kỹ phần này trước khi thao tác. Phần lớn lỗi nhập liệu đến từ việc nhầm lẫn giữa năm khái niệm dưới đây.</w:t>
+        <w:t>Phần lớn lỗi nhập liệu đến từ nhầm lẫn giữa năm khái niệm này.</w:t>
       </w:r>
     </w:p>
     <w:tbl>
@@ -2197,7 +1553,7 @@
         <w:pStyle w:val="Heading2"/>
       </w:pPr>
       <w:r>
-        <w:t>2.1 Quan hệ giữa chúng</w:t>
+        <w:t>1.1 Quan hệ giữa chúng</w:t>
       </w:r>
     </w:p>
     <w:p>
@@ -2206,7 +1562,7 @@
           <w:b w:val="0"/>
           <w:i w:val="0"/>
         </w:rPr>
-        <w:t>Chuỗi phụ thuộc chạy từ trên xuống. Không có bước trước thì không làm được bước sau:</w:t>
+        <w:t>Không có bước trước thì không làm được bước sau:</w:t>
       </w:r>
     </w:p>
     <w:tbl>
@@ -2261,7 +1617,7 @@
         <w:pStyle w:val="Heading2"/>
       </w:pPr>
       <w:r>
-        <w:t>2.2 Hai trục độc lập: Loại dịch vụ và Nhóm hạng mục</w:t>
+        <w:t>1.2 Hai trục độc lập: Loại dịch vụ và Nhóm hạng mục</w:t>
       </w:r>
     </w:p>
     <w:p>
@@ -2270,7 +1626,7 @@
           <w:b w:val="0"/>
           <w:i w:val="0"/>
         </w:rPr>
-        <w:t>Đây là điểm hay bị nhầm nhất. Hai trục này vuông góc nhau, không thay thế được cho nhau:</w:t>
+        <w:t>Hai trục vuông góc nhau, không thay thế cho nhau:</w:t>
       </w:r>
     </w:p>
     <w:tbl>
@@ -2621,7 +1977,7 @@
         <w:pStyle w:val="Heading1"/>
       </w:pPr>
       <w:r>
-        <w:t>3. Hai trục tính tiền: Giá bán và Giá vốn</w:t>
+        <w:t>2. Hai trục tính tiền: Giá bán và Giá vốn</w:t>
       </w:r>
     </w:p>
     <w:p>
@@ -2630,7 +1986,7 @@
           <w:b w:val="0"/>
           <w:i w:val="0"/>
         </w:rPr>
-        <w:t>Mọi con số lãi lỗ đều đến từ hiệu của hai trục này. Chúng gắn vào hai thứ khác nhau và do hai người khác nhau quản lý.</w:t>
+        <w:t>Lãi lỗ là hiệu của hai trục này. Chúng gắn vào hai thứ khác nhau.</w:t>
       </w:r>
     </w:p>
     <w:tbl>
@@ -3060,7 +2416,7 @@
         <w:pStyle w:val="Heading2"/>
       </w:pPr>
       <w:r>
-        <w:t>3.1 Giá vốn được tính thế nào</w:t>
+        <w:t>2.1 Giá vốn được tính thế nào</w:t>
       </w:r>
     </w:p>
     <w:p>
@@ -3129,7 +2485,7 @@
         <w:pStyle w:val="Heading2"/>
       </w:pPr>
       <w:r>
-        <w:t>3.2 Chi phí gián tiếp (Overhead)</w:t>
+        <w:t>2.2 Chi phí gián tiếp (Overhead)</w:t>
       </w:r>
     </w:p>
     <w:p>
@@ -3434,7 +2790,7 @@
         <w:pStyle w:val="Heading1"/>
       </w:pPr>
       <w:r>
-        <w:t>4. Màn 1 — Loại dịch vụ</w:t>
+        <w:t>3. Màn 1 — Loại dịch vụ</w:t>
       </w:r>
     </w:p>
     <w:p>
@@ -3443,7 +2799,7 @@
           <w:b w:val="0"/>
           <w:i w:val="0"/>
         </w:rPr>
-        <w:t>Danh mục gốc của toàn hệ thống. Khai một lần, dùng lại cho mọi hợp đồng và mọi khách. Đây là trung tâm lợi nhuận: nhờ nó mới gộp được báo cáo “mảng Kiểm thử lãi bao nhiêu” từ tất cả dự án.</w:t>
+        <w:t>Khai một lần, dùng cho mọi hợp đồng. Nhờ nó mới gộp được báo cáo “mảng Kiểm thử lãi bao nhiêu” từ tất cả dự án.</w:t>
       </w:r>
     </w:p>
     <w:p>
@@ -3901,7 +3257,7 @@
         <w:pStyle w:val="Heading2"/>
       </w:pPr>
       <w:r>
-        <w:t>4.1 Menu ba chấm — 4 thao tác</w:t>
+        <w:t>3.1 Menu ba chấm — 4 thao tác</w:t>
       </w:r>
     </w:p>
     <w:tbl>
@@ -4253,7 +3609,7 @@
         <w:pStyle w:val="Heading1"/>
       </w:pPr>
       <w:r>
-        <w:t>5. Màn 2 — Bảng giá</w:t>
+        <w:t>4. Màn 2 — Bảng giá</w:t>
       </w:r>
     </w:p>
     <w:p>
@@ -4262,7 +3618,7 @@
           <w:b w:val="0"/>
           <w:i w:val="0"/>
         </w:rPr>
-        <w:t>Bảng giá chỉ chứa ĐƠN GIÁ, không chứa số lượng. Số lượng thuộc về hợp đồng. Nhờ tách như vậy, một bảng giá dùng lại được cho nhiều hợp đồng của cùng một khách, không phải nhớ và gõ lại giá đã đàm phán.</w:t>
+        <w:t>Chỉ chứa ĐƠN GIÁ, không chứa số lượng — số lượng thuộc về hợp đồng. Nhờ vậy một bảng dùng lại được cho nhiều hợp đồng của cùng một khách.</w:t>
       </w:r>
     </w:p>
     <w:p>
@@ -4571,7 +3927,7 @@
         <w:pStyle w:val="Heading2"/>
       </w:pPr>
       <w:r>
-        <w:t>5.1 Bảng chuẩn công ty và bảng riêng khách</w:t>
+        <w:t>4.1 Bảng chuẩn công ty và bảng riêng khách</w:t>
       </w:r>
     </w:p>
     <w:tbl>
@@ -5072,7 +4428,7 @@
         <w:pStyle w:val="Heading2"/>
       </w:pPr>
       <w:r>
-        <w:t>5.2 Vì sao dòng giá cần TÊN RIÊNG</w:t>
+        <w:t>4.2 Vì sao dòng giá cần TÊN RIÊNG</w:t>
       </w:r>
     </w:p>
     <w:p>
@@ -5143,7 +4499,7 @@
         <w:pStyle w:val="Heading1"/>
       </w:pPr>
       <w:r>
-        <w:t>6. Màn 3 — Giá vốn nhân sự</w:t>
+        <w:t>5. Màn 3 — Giá vốn nhân sự</w:t>
       </w:r>
     </w:p>
     <w:tbl>
@@ -5440,7 +4796,7 @@
         <w:pStyle w:val="Heading2"/>
       </w:pPr>
       <w:r>
-        <w:t>6.1 Năm kỳ lương được hỗ trợ</w:t>
+        <w:t>5.1 Năm kỳ lương được hỗ trợ</w:t>
       </w:r>
     </w:p>
     <w:tbl>
@@ -6053,7 +5409,7 @@
         <w:pStyle w:val="Heading2"/>
       </w:pPr>
       <w:r>
-        <w:t>6.2 Sáu ô tóm tắt</w:t>
+        <w:t>5.2 Sáu ô tóm tắt</w:t>
       </w:r>
     </w:p>
     <w:tbl>
@@ -6388,7 +5744,7 @@
         <w:pStyle w:val="Heading1"/>
       </w:pPr>
       <w:r>
-        <w:t>7. Màn 4 — Hợp đồng</w:t>
+        <w:t>6. Màn 4 — Hợp đồng</w:t>
       </w:r>
     </w:p>
     <w:p>
@@ -6397,7 +5753,7 @@
           <w:b w:val="0"/>
           <w:i w:val="0"/>
         </w:rPr>
-        <w:t>Hợp đồng là nơi ra lãi lỗ. Mỗi hợp đồng tính lãi riêng. Một dự án dài có thể chia thành nhiều hợp đồng theo giai đoạn để theo dõi từng chặng.</w:t>
+        <w:t>Mỗi hợp đồng tính lãi riêng. Dự án dài chia thành nhiều hợp đồng theo giai đoạn để theo dõi từng chặng.</w:t>
       </w:r>
     </w:p>
     <w:p>
@@ -6467,7 +5823,7 @@
         <w:pStyle w:val="Heading2"/>
       </w:pPr>
       <w:r>
-        <w:t>7.1 Vỏ màn hợp đồng</w:t>
+        <w:t>6.1 Vỏ màn hợp đồng</w:t>
       </w:r>
     </w:p>
     <w:p>
@@ -6794,7 +6150,7 @@
         <w:pStyle w:val="Heading2"/>
       </w:pPr>
       <w:r>
-        <w:t>7.2 Tab Hạng mục — nơi khai những gì đang bán</w:t>
+        <w:t>6.2 Tab Hạng mục — nơi khai những gì đang bán</w:t>
       </w:r>
     </w:p>
     <w:p>
@@ -6991,7 +6347,7 @@
         <w:pStyle w:val="Heading2"/>
       </w:pPr>
       <w:r>
-        <w:t>7.3 Bốn cách tính tiền</w:t>
+        <w:t>6.3 Bốn cách tính tiền</w:t>
       </w:r>
     </w:p>
     <w:tbl>
@@ -7479,7 +6835,7 @@
         <w:pStyle w:val="Heading2"/>
       </w:pPr>
       <w:r>
-        <w:t>7.4 Cột Theo dõi — hai icon bấm được</w:t>
+        <w:t>6.4 Cột Theo dõi — hai icon bấm được</w:t>
       </w:r>
     </w:p>
     <w:tbl>
@@ -7714,7 +7070,7 @@
         <w:pStyle w:val="Heading2"/>
       </w:pPr>
       <w:r>
-        <w:t>7.5 Ước tính và Số lượng khác nhau thế nào</w:t>
+        <w:t>6.5 Ước tính và Số lượng khác nhau thế nào</w:t>
       </w:r>
     </w:p>
     <w:tbl>
@@ -7969,7 +7325,7 @@
         <w:pStyle w:val="Heading2"/>
       </w:pPr>
       <w:r>
-        <w:t>7.6 Hai đường thêm hạng mục</w:t>
+        <w:t>6.6 Hai đường thêm hạng mục</w:t>
       </w:r>
     </w:p>
     <w:tbl>
@@ -8117,7 +7473,7 @@
         <w:pStyle w:val="Heading1"/>
       </w:pPr>
       <w:r>
-        <w:t>8. Màn 5 — Giờ của tôi</w:t>
+        <w:t>7. Màn 5 — Giờ của tôi</w:t>
       </w:r>
     </w:p>
     <w:p>
@@ -8134,7 +7490,7 @@
         <w:pStyle w:val="Heading2"/>
       </w:pPr>
       <w:r>
-        <w:t>8.1 Chế độ Ngày</w:t>
+        <w:t>7.1 Chế độ Ngày</w:t>
       </w:r>
     </w:p>
     <w:p>
@@ -8233,7 +7589,7 @@
         <w:pStyle w:val="Heading2"/>
       </w:pPr>
       <w:r>
-        <w:t>8.2 Ba cách nhập thời lượng</w:t>
+        <w:t>7.2 Ba cách nhập thời lượng</w:t>
       </w:r>
     </w:p>
     <w:tbl>
@@ -8545,7 +7901,7 @@
         <w:pStyle w:val="Heading2"/>
       </w:pPr>
       <w:r>
-        <w:t>8.3 Menu ba chấm trên mỗi dòng giờ</w:t>
+        <w:t>7.3 Menu ba chấm trên mỗi dòng giờ</w:t>
       </w:r>
     </w:p>
     <w:tbl>
@@ -8799,7 +8155,7 @@
         <w:pStyle w:val="Heading2"/>
       </w:pPr>
       <w:r>
-        <w:t>8.4 Chế độ Bảng chấm công</w:t>
+        <w:t>7.4 Chế độ Bảng chấm công</w:t>
       </w:r>
     </w:p>
     <w:p>
@@ -8869,7 +8225,7 @@
         <w:pStyle w:val="Heading2"/>
       </w:pPr>
       <w:r>
-        <w:t>8.5 Chế độ Lịch</w:t>
+        <w:t>7.5 Chế độ Lịch</w:t>
       </w:r>
     </w:p>
     <w:p>
@@ -8984,7 +8340,7 @@
         <w:pStyle w:val="Heading1"/>
       </w:pPr>
       <w:r>
-        <w:t>9. Màn 6 — Giờ toàn công ty</w:t>
+        <w:t>8. Màn 6 — Giờ toàn công ty</w:t>
       </w:r>
     </w:p>
     <w:p>
@@ -9001,7 +8357,7 @@
         <w:pStyle w:val="Heading2"/>
       </w:pPr>
       <w:r>
-        <w:t>9.1 Chế độ Bảng chấm công — ai thiếu giờ</w:t>
+        <w:t>8.1 Chế độ Bảng chấm công — ai thiếu giờ</w:t>
       </w:r>
     </w:p>
     <w:p>
@@ -9282,7 +8638,7 @@
         <w:pStyle w:val="Heading2"/>
       </w:pPr>
       <w:r>
-        <w:t>9.2 Chế độ Bảng — lọc và gộp nhóm</w:t>
+        <w:t>8.2 Chế độ Bảng — lọc và gộp nhóm</w:t>
       </w:r>
     </w:p>
     <w:p>
@@ -9528,7 +8884,7 @@
         <w:pStyle w:val="Heading1"/>
       </w:pPr>
       <w:r>
-        <w:t>10. Màn 7 — Chi phí</w:t>
+        <w:t>9. Màn 7 — Chi phí</w:t>
       </w:r>
     </w:p>
     <w:p>
@@ -9734,7 +9090,7 @@
         <w:pStyle w:val="Heading2"/>
       </w:pPr>
       <w:r>
-        <w:t>10.1 Hai trục trạng thái độc lập</w:t>
+        <w:t>9.1 Hai trục trạng thái độc lập</w:t>
       </w:r>
     </w:p>
     <w:p>
@@ -9999,7 +9355,7 @@
         <w:pStyle w:val="Heading2"/>
       </w:pPr>
       <w:r>
-        <w:t>10.2 Trạng thái duyệt ảnh hưởng số liệu ra sao</w:t>
+        <w:t>9.2 Trạng thái duyệt ảnh hưởng số liệu ra sao</w:t>
       </w:r>
     </w:p>
     <w:tbl>
@@ -10447,7 +9803,7 @@
         <w:pStyle w:val="Heading2"/>
       </w:pPr>
       <w:r>
-        <w:t>10.3 Hộp thoại nhập chi phí</w:t>
+        <w:t>9.3 Hộp thoại nhập chi phí</w:t>
       </w:r>
     </w:p>
     <w:p>
@@ -10864,7 +10220,7 @@
         <w:pStyle w:val="Heading2"/>
       </w:pPr>
       <w:r>
-        <w:t>10.4 Tab Chi phí trong hợp đồng</w:t>
+        <w:t>9.4 Tab Chi phí trong hợp đồng</w:t>
       </w:r>
     </w:p>
     <w:p>
@@ -10939,7 +10295,7 @@
         <w:pStyle w:val="Heading1"/>
       </w:pPr>
       <w:r>
-        <w:t>11. Màn 8 — Biểu đồ và báo cáo</w:t>
+        <w:t>10. Màn 8 — Biểu đồ và báo cáo</w:t>
       </w:r>
     </w:p>
     <w:p>
@@ -11009,7 +10365,7 @@
         <w:pStyle w:val="Heading2"/>
       </w:pPr>
       <w:r>
-        <w:t>11.1 Bốn nhóm điều khiển</w:t>
+        <w:t>10.1 Bốn nhóm điều khiển</w:t>
       </w:r>
     </w:p>
     <w:tbl>
@@ -11321,7 +10677,7 @@
         <w:pStyle w:val="Heading2"/>
       </w:pPr>
       <w:r>
-        <w:t>11.2 Đọc biểu đồ</w:t>
+        <w:t>10.2 Đọc biểu đồ</w:t>
       </w:r>
     </w:p>
     <w:tbl>
@@ -11892,7 +11248,7 @@
         <w:pStyle w:val="Heading2"/>
       </w:pPr>
       <w:r>
-        <w:t>11.3 Ba ô số liệu</w:t>
+        <w:t>10.3 Ba ô số liệu</w:t>
       </w:r>
     </w:p>
     <w:tbl>
@@ -12172,7 +11528,7 @@
         <w:pStyle w:val="Heading2"/>
       </w:pPr>
       <w:r>
-        <w:t>11.4 Vì sao “Đã dùng” có thể VƯỢT tổng hợp đồng</w:t>
+        <w:t>10.4 Vì sao “Đã dùng” có thể VƯỢT tổng hợp đồng</w:t>
       </w:r>
     </w:p>
     <w:p>
@@ -12239,7 +11595,7 @@
         <w:pStyle w:val="Heading2"/>
       </w:pPr>
       <w:r>
-        <w:t>11.5 Trần giờ ghi nhận</w:t>
+        <w:t>10.5 Trần giờ ghi nhận</w:t>
       </w:r>
     </w:p>
     <w:p>
@@ -12261,7 +11617,7 @@
         <w:pStyle w:val="Heading1"/>
       </w:pPr>
       <w:r>
-        <w:t>12. Quy tắc nghiệp vụ quan trọng</w:t>
+        <w:t>11. Quy tắc nghiệp vụ quan trọng</w:t>
       </w:r>
     </w:p>
     <w:p>
@@ -12278,7 +11634,7 @@
         <w:pStyle w:val="Heading2"/>
       </w:pPr>
       <w:r>
-        <w:t>12.1 Doanh thu tính trên giờ TÍNH TIỀN, chi phí tính trên giờ ĐÃ LÀM</w:t>
+        <w:t>11.1 Doanh thu tính trên giờ TÍNH TIỀN, chi phí tính trên giờ ĐÃ LÀM</w:t>
       </w:r>
     </w:p>
     <w:tbl>
@@ -12331,7 +11687,7 @@
         <w:pStyle w:val="Heading2"/>
       </w:pPr>
       <w:r>
-        <w:t>12.2 Chỉ giờ ĐÃ DUYỆT mới ra doanh thu</w:t>
+        <w:t>11.2 Chỉ giờ ĐÃ DUYỆT mới ra doanh thu</w:t>
       </w:r>
     </w:p>
     <w:p>
@@ -12348,7 +11704,7 @@
         <w:pStyle w:val="Heading2"/>
       </w:pPr>
       <w:r>
-        <w:t>12.3 Giá vốn chốt tại thời điểm ghi giờ</w:t>
+        <w:t>11.3 Giá vốn chốt tại thời điểm ghi giờ</w:t>
       </w:r>
     </w:p>
     <w:p>
@@ -12365,7 +11721,7 @@
         <w:pStyle w:val="Heading2"/>
       </w:pPr>
       <w:r>
-        <w:t>12.4 Bốn quy tắc còn lại</w:t>
+        <w:t>11.4 Bốn quy tắc còn lại</w:t>
       </w:r>
     </w:p>
     <w:tbl>
@@ -12589,7 +11945,7 @@
         <w:pStyle w:val="Heading1"/>
       </w:pPr>
       <w:r>
-        <w:t>13. Danh mục case dữ liệu mẫu</w:t>
+        <w:t>12. Danh mục case dữ liệu mẫu</w:t>
       </w:r>
     </w:p>
     <w:p>
@@ -12606,7 +11962,7 @@
         <w:pStyle w:val="Heading2"/>
       </w:pPr>
       <w:r>
-        <w:t>13.1 Hạng mục — cách tính tiền và đơn vị</w:t>
+        <w:t>12.1 Hạng mục — cách tính tiền và đơn vị</w:t>
       </w:r>
     </w:p>
     <w:tbl>
@@ -13198,7 +12554,7 @@
         <w:pStyle w:val="Heading2"/>
       </w:pPr>
       <w:r>
-        <w:t>13.2 Giá vốn — đủ 5 kỳ lương</w:t>
+        <w:t>12.2 Giá vốn — đủ 5 kỳ lương</w:t>
       </w:r>
     </w:p>
     <w:tbl>
@@ -13751,7 +13107,7 @@
         <w:pStyle w:val="Heading2"/>
       </w:pPr>
       <w:r>
-        <w:t>13.3 Chi phí — đủ 4 trạng thái duyệt</w:t>
+        <w:t>12.3 Chi phí — đủ 4 trạng thái duyệt</w:t>
       </w:r>
     </w:p>
     <w:tbl>
@@ -14063,7 +13419,7 @@
         <w:pStyle w:val="Heading2"/>
       </w:pPr>
       <w:r>
-        <w:t>13.4 Chi phí — các biến thể khác</w:t>
+        <w:t>12.4 Chi phí — các biến thể khác</w:t>
       </w:r>
     </w:p>
     <w:tbl>
@@ -14543,7 +13899,7 @@
         <w:pStyle w:val="Heading2"/>
       </w:pPr>
       <w:r>
-        <w:t>13.5 Giờ và hợp đồng</w:t>
+        <w:t>12.5 Giờ và hợp đồng</w:t>
       </w:r>
     </w:p>
     <w:tbl>
@@ -15247,7 +14603,7 @@
         <w:pStyle w:val="Heading2"/>
       </w:pPr>
       <w:r>
-        <w:t>13.6 Loại dịch vụ và bảng giá</w:t>
+        <w:t>12.6 Loại dịch vụ và bảng giá</w:t>
       </w:r>
     </w:p>
     <w:tbl>
@@ -15767,7 +15123,7 @@
         <w:pStyle w:val="Heading1"/>
       </w:pPr>
       <w:r>
-        <w:t>14. Việc còn tồn và giới hạn</w:t>
+        <w:t>13. Việc còn tồn và giới hạn</w:t>
       </w:r>
     </w:p>
     <w:p>
@@ -15784,7 +15140,7 @@
         <w:pStyle w:val="Heading2"/>
       </w:pPr>
       <w:r>
-        <w:t>14.1 Đã chốt KHÔNG làm</w:t>
+        <w:t>13.1 Đã chốt KHÔNG làm</w:t>
       </w:r>
     </w:p>
     <w:tbl>
@@ -16041,7 +15397,7 @@
         <w:pStyle w:val="Heading2"/>
       </w:pPr>
       <w:r>
-        <w:t>14.2 Giới hạn kỹ thuật hiện tại</w:t>
+        <w:t>13.2 Giới hạn kỹ thuật hiện tại</w:t>
       </w:r>
     </w:p>
     <w:tbl>
@@ -16297,7 +15653,7 @@
         <w:pStyle w:val="Heading2"/>
       </w:pPr>
       <w:r>
-        <w:t>14.3 Chạy bản demo trên máy cá nhân</w:t>
+        <w:t>13.3 Chạy bản demo trên máy cá nhân</w:t>
       </w:r>
     </w:p>
     <w:tbl>

</xml_diff>

<commit_message>
docs: bỏ chương Việc còn tồn
Tài liệu này để hướng dẫn dùng, không phải báo cáo tiến độ. Kể những gì chưa
làm chỉ làm người đọc phân tâm khỏi thứ họ đang cần: cách cấu hình và thao tác.

Còn 12 chương, kết thúc ở Danh mục case dữ liệu mẫu.

Co-Authored-By: Claude Opus 5 <noreply@anthropic.com>
</commit_message>
<xml_diff>
--- a/docs/HeyE-Kiem-soat-chi-phi-Huong-dan.docx
+++ b/docs/HeyE-Kiem-soat-chi-phi-Huong-dan.docx
@@ -929,62 +929,6 @@
                 <w:sz w:val="19"/>
               </w:rPr>
               <w:t>Đối chiếu khi kiểm thử</w:t>
-            </w:r>
-          </w:p>
-        </w:tc>
-      </w:tr>
-      <w:tr>
-        <w:tc>
-          <w:tcPr>
-            <w:tcW w:type="dxa" w:w="680"/>
-          </w:tcPr>
-          <w:p>
-            <w:pPr>
-              <w:spacing w:after="20"/>
-            </w:pPr>
-            <w:r/>
-            <w:r>
-              <w:rPr>
-                <w:b w:val="0"/>
-                <w:sz w:val="19"/>
-              </w:rPr>
-              <w:t>13</w:t>
-            </w:r>
-          </w:p>
-        </w:tc>
-        <w:tc>
-          <w:tcPr>
-            <w:tcW w:type="dxa" w:w="3685"/>
-          </w:tcPr>
-          <w:p>
-            <w:pPr>
-              <w:spacing w:after="20"/>
-            </w:pPr>
-            <w:r/>
-            <w:r>
-              <w:rPr>
-                <w:b/>
-                <w:sz w:val="19"/>
-              </w:rPr>
-              <w:t>Việc còn tồn và giới hạn</w:t>
-            </w:r>
-          </w:p>
-        </w:tc>
-        <w:tc>
-          <w:tcPr>
-            <w:tcW w:type="dxa" w:w="4932"/>
-          </w:tcPr>
-          <w:p>
-            <w:pPr>
-              <w:spacing w:after="20"/>
-            </w:pPr>
-            <w:r/>
-            <w:r>
-              <w:rPr>
-                <w:b w:val="0"/>
-                <w:sz w:val="19"/>
-              </w:rPr>
-              <w:t>Minh bạch phạm vi</w:t>
             </w:r>
           </w:p>
         </w:tc>
@@ -15112,600 +15056,6 @@
       <w:pPr>
         <w:spacing w:after="40"/>
       </w:pPr>
-    </w:p>
-    <w:p>
-      <w:r>
-        <w:br w:type="page"/>
-      </w:r>
-    </w:p>
-    <w:p>
-      <w:pPr>
-        <w:pStyle w:val="Heading1"/>
-      </w:pPr>
-      <w:r>
-        <w:t>13. Việc còn tồn và giới hạn</w:t>
-      </w:r>
-    </w:p>
-    <w:p>
-      <w:r>
-        <w:rPr>
-          <w:b w:val="0"/>
-          <w:i w:val="0"/>
-        </w:rPr>
-        <w:t>Phần này ghi minh bạch những gì CHƯA có, để team không kỳ vọng nhầm.</w:t>
-      </w:r>
-    </w:p>
-    <w:p>
-      <w:pPr>
-        <w:pStyle w:val="Heading2"/>
-      </w:pPr>
-      <w:r>
-        <w:t>13.1 Đã chốt KHÔNG làm</w:t>
-      </w:r>
-    </w:p>
-    <w:tbl>
-      <w:tblPr>
-        <w:tblStyle w:val="TableGrid"/>
-        <w:tblW w:type="auto" w:w="0"/>
-        <w:jc w:val="center"/>
-        <w:tblLook w:firstColumn="1" w:firstRow="1" w:lastColumn="0" w:lastRow="0" w:noHBand="0" w:noVBand="1" w:val="04A0"/>
-      </w:tblPr>
-      <w:tblGrid>
-        <w:gridCol w:w="4819"/>
-        <w:gridCol w:w="4819"/>
-      </w:tblGrid>
-      <w:tr>
-        <w:tc>
-          <w:tcPr>
-            <w:tcW w:type="dxa" w:w="3061"/>
-            <w:shd w:val="clear" w:fill="5B3DF5"/>
-          </w:tcPr>
-          <w:p>
-            <w:pPr>
-              <w:spacing w:after="20"/>
-            </w:pPr>
-            <w:r/>
-            <w:r>
-              <w:rPr>
-                <w:b/>
-                <w:color w:val="FFFFFF"/>
-                <w:sz w:val="19"/>
-              </w:rPr>
-              <w:t>Tính năng</w:t>
-            </w:r>
-          </w:p>
-        </w:tc>
-        <w:tc>
-          <w:tcPr>
-            <w:tcW w:type="dxa" w:w="6123"/>
-            <w:shd w:val="clear" w:fill="5B3DF5"/>
-          </w:tcPr>
-          <w:p>
-            <w:pPr>
-              <w:spacing w:after="20"/>
-            </w:pPr>
-            <w:r/>
-            <w:r>
-              <w:rPr>
-                <w:b/>
-                <w:color w:val="FFFFFF"/>
-                <w:sz w:val="19"/>
-              </w:rPr>
-              <w:t>Lý do bỏ</w:t>
-            </w:r>
-          </w:p>
-        </w:tc>
-      </w:tr>
-      <w:tr>
-        <w:tc>
-          <w:tcPr>
-            <w:tcW w:type="dxa" w:w="3061"/>
-          </w:tcPr>
-          <w:p>
-            <w:pPr>
-              <w:spacing w:after="20"/>
-            </w:pPr>
-            <w:r/>
-            <w:r>
-              <w:rPr>
-                <w:b w:val="0"/>
-                <w:sz w:val="19"/>
-              </w:rPr>
-              <w:t>Hoá đơn (Invoices)</w:t>
-            </w:r>
-          </w:p>
-        </w:tc>
-        <w:tc>
-          <w:tcPr>
-            <w:tcW w:type="dxa" w:w="6123"/>
-          </w:tcPr>
-          <w:p>
-            <w:pPr>
-              <w:spacing w:after="20"/>
-            </w:pPr>
-            <w:r/>
-            <w:r>
-              <w:rPr>
-                <w:b w:val="0"/>
-                <w:sz w:val="19"/>
-              </w:rPr>
-              <w:t>Chưa dựng module hoá đơn. Ô thứ ba ở tổng quan thay bằng Chi phí — số thật</w:t>
-            </w:r>
-          </w:p>
-        </w:tc>
-      </w:tr>
-      <w:tr>
-        <w:tc>
-          <w:tcPr>
-            <w:tcW w:type="dxa" w:w="3061"/>
-          </w:tcPr>
-          <w:p>
-            <w:pPr>
-              <w:spacing w:after="20"/>
-            </w:pPr>
-            <w:r/>
-            <w:r>
-              <w:rPr>
-                <w:b w:val="0"/>
-                <w:sz w:val="19"/>
-              </w:rPr>
-              <w:t>Hợp đồng định kỳ (Recurring)</w:t>
-            </w:r>
-          </w:p>
-        </w:tc>
-        <w:tc>
-          <w:tcPr>
-            <w:tcW w:type="dxa" w:w="6123"/>
-          </w:tcPr>
-          <w:p>
-            <w:pPr>
-              <w:spacing w:after="20"/>
-            </w:pPr>
-            <w:r/>
-            <w:r>
-              <w:rPr>
-                <w:b w:val="0"/>
-                <w:sz w:val="19"/>
-              </w:rPr>
-              <w:t>Công ty bán theo dự án, không có hợp đồng lặp theo tháng</w:t>
-            </w:r>
-          </w:p>
-        </w:tc>
-      </w:tr>
-      <w:tr>
-        <w:tc>
-          <w:tcPr>
-            <w:tcW w:type="dxa" w:w="3061"/>
-          </w:tcPr>
-          <w:p>
-            <w:pPr>
-              <w:spacing w:after="20"/>
-            </w:pPr>
-            <w:r/>
-            <w:r>
-              <w:rPr>
-                <w:b w:val="0"/>
-                <w:sz w:val="19"/>
-              </w:rPr>
-              <w:t>Nhật ký hoạt động (Feed)</w:t>
-            </w:r>
-          </w:p>
-        </w:tc>
-        <w:tc>
-          <w:tcPr>
-            <w:tcW w:type="dxa" w:w="6123"/>
-          </w:tcPr>
-          <w:p>
-            <w:pPr>
-              <w:spacing w:after="20"/>
-            </w:pPr>
-            <w:r/>
-            <w:r>
-              <w:rPr>
-                <w:b w:val="0"/>
-                <w:sz w:val="19"/>
-              </w:rPr>
-              <w:t>Chưa cần</w:t>
-            </w:r>
-          </w:p>
-        </w:tc>
-      </w:tr>
-      <w:tr>
-        <w:tc>
-          <w:tcPr>
-            <w:tcW w:type="dxa" w:w="3061"/>
-          </w:tcPr>
-          <w:p>
-            <w:pPr>
-              <w:spacing w:after="20"/>
-            </w:pPr>
-            <w:r/>
-            <w:r>
-              <w:rPr>
-                <w:b w:val="0"/>
-                <w:sz w:val="19"/>
-              </w:rPr>
-              <w:t>Lưu view, xuất file</w:t>
-            </w:r>
-          </w:p>
-        </w:tc>
-        <w:tc>
-          <w:tcPr>
-            <w:tcW w:type="dxa" w:w="6123"/>
-          </w:tcPr>
-          <w:p>
-            <w:pPr>
-              <w:spacing w:after="20"/>
-            </w:pPr>
-            <w:r/>
-            <w:r>
-              <w:rPr>
-                <w:b w:val="0"/>
-                <w:sz w:val="19"/>
-              </w:rPr>
-              <w:t>Chưa cần</w:t>
-            </w:r>
-          </w:p>
-        </w:tc>
-      </w:tr>
-      <w:tr>
-        <w:tc>
-          <w:tcPr>
-            <w:tcW w:type="dxa" w:w="3061"/>
-          </w:tcPr>
-          <w:p>
-            <w:pPr>
-              <w:spacing w:after="20"/>
-            </w:pPr>
-            <w:r/>
-            <w:r>
-              <w:rPr>
-                <w:b w:val="0"/>
-                <w:sz w:val="19"/>
-              </w:rPr>
-              <w:t>Phân quyền chi tiết</w:t>
-            </w:r>
-          </w:p>
-        </w:tc>
-        <w:tc>
-          <w:tcPr>
-            <w:tcW w:type="dxa" w:w="6123"/>
-          </w:tcPr>
-          <w:p>
-            <w:pPr>
-              <w:spacing w:after="20"/>
-            </w:pPr>
-            <w:r/>
-            <w:r>
-              <w:rPr>
-                <w:b w:val="0"/>
-                <w:sz w:val="19"/>
-              </w:rPr>
-              <w:t>Chưa cần ở giai đoạn này</w:t>
-            </w:r>
-          </w:p>
-        </w:tc>
-      </w:tr>
-    </w:tbl>
-    <w:p>
-      <w:pPr>
-        <w:spacing w:after="40"/>
-      </w:pPr>
-    </w:p>
-    <w:p>
-      <w:pPr>
-        <w:pStyle w:val="Heading2"/>
-      </w:pPr>
-      <w:r>
-        <w:t>13.2 Giới hạn kỹ thuật hiện tại</w:t>
-      </w:r>
-    </w:p>
-    <w:tbl>
-      <w:tblPr>
-        <w:tblStyle w:val="TableGrid"/>
-        <w:tblW w:type="auto" w:w="0"/>
-        <w:jc w:val="center"/>
-        <w:tblLook w:firstColumn="1" w:firstRow="1" w:lastColumn="0" w:lastRow="0" w:noHBand="0" w:noVBand="1" w:val="04A0"/>
-      </w:tblPr>
-      <w:tblGrid>
-        <w:gridCol w:w="3213"/>
-        <w:gridCol w:w="3213"/>
-        <w:gridCol w:w="3213"/>
-      </w:tblGrid>
-      <w:tr>
-        <w:tc>
-          <w:tcPr>
-            <w:tcW w:type="dxa" w:w="2494"/>
-            <w:shd w:val="clear" w:fill="5B3DF5"/>
-          </w:tcPr>
-          <w:p>
-            <w:pPr>
-              <w:spacing w:after="20"/>
-            </w:pPr>
-            <w:r/>
-            <w:r>
-              <w:rPr>
-                <w:b/>
-                <w:color w:val="FFFFFF"/>
-                <w:sz w:val="17"/>
-              </w:rPr>
-              <w:t>Giới hạn</w:t>
-            </w:r>
-          </w:p>
-        </w:tc>
-        <w:tc>
-          <w:tcPr>
-            <w:tcW w:type="dxa" w:w="3061"/>
-            <w:shd w:val="clear" w:fill="5B3DF5"/>
-          </w:tcPr>
-          <w:p>
-            <w:pPr>
-              <w:spacing w:after="20"/>
-            </w:pPr>
-            <w:r/>
-            <w:r>
-              <w:rPr>
-                <w:b/>
-                <w:color w:val="FFFFFF"/>
-                <w:sz w:val="17"/>
-              </w:rPr>
-              <w:t>Ảnh hưởng</w:t>
-            </w:r>
-          </w:p>
-        </w:tc>
-        <w:tc>
-          <w:tcPr>
-            <w:tcW w:type="dxa" w:w="3628"/>
-            <w:shd w:val="clear" w:fill="5B3DF5"/>
-          </w:tcPr>
-          <w:p>
-            <w:pPr>
-              <w:spacing w:after="20"/>
-            </w:pPr>
-            <w:r/>
-            <w:r>
-              <w:rPr>
-                <w:b/>
-                <w:color w:val="FFFFFF"/>
-                <w:sz w:val="17"/>
-              </w:rPr>
-              <w:t>Khi nào cần xử lý</w:t>
-            </w:r>
-          </w:p>
-        </w:tc>
-      </w:tr>
-      <w:tr>
-        <w:tc>
-          <w:tcPr>
-            <w:tcW w:type="dxa" w:w="2494"/>
-          </w:tcPr>
-          <w:p>
-            <w:pPr>
-              <w:spacing w:after="20"/>
-            </w:pPr>
-            <w:r/>
-            <w:r>
-              <w:rPr>
-                <w:b/>
-                <w:sz w:val="17"/>
-              </w:rPr>
-              <w:t>Lịch nghỉ lễ cố định</w:t>
-            </w:r>
-          </w:p>
-        </w:tc>
-        <w:tc>
-          <w:tcPr>
-            <w:tcW w:type="dxa" w:w="3061"/>
-          </w:tcPr>
-          <w:p>
-            <w:pPr>
-              <w:spacing w:after="20"/>
-            </w:pPr>
-            <w:r/>
-            <w:r>
-              <w:rPr>
-                <w:b w:val="0"/>
-                <w:sz w:val="17"/>
-              </w:rPr>
-              <w:t>Ngày lễ Việt Nam đang gắn cứng trong mã nguồn</w:t>
-            </w:r>
-          </w:p>
-        </w:tc>
-        <w:tc>
-          <w:tcPr>
-            <w:tcW w:type="dxa" w:w="3628"/>
-          </w:tcPr>
-          <w:p>
-            <w:pPr>
-              <w:spacing w:after="20"/>
-            </w:pPr>
-            <w:r/>
-            <w:r>
-              <w:rPr>
-                <w:b w:val="0"/>
-                <w:sz w:val="17"/>
-              </w:rPr>
-              <w:t>Khi thuê người nước ngoài hoặc đổi lịch nghỉ — sẽ sai công suất và giá vốn mỗi giờ</w:t>
-            </w:r>
-          </w:p>
-        </w:tc>
-      </w:tr>
-      <w:tr>
-        <w:tc>
-          <w:tcPr>
-            <w:tcW w:type="dxa" w:w="2494"/>
-          </w:tcPr>
-          <w:p>
-            <w:pPr>
-              <w:spacing w:after="20"/>
-            </w:pPr>
-            <w:r/>
-            <w:r>
-              <w:rPr>
-                <w:b w:val="0"/>
-                <w:sz w:val="17"/>
-              </w:rPr>
-              <w:t>Phần đã xuất hoá đơn = 0</w:t>
-            </w:r>
-          </w:p>
-        </w:tc>
-        <w:tc>
-          <w:tcPr>
-            <w:tcW w:type="dxa" w:w="3061"/>
-          </w:tcPr>
-          <w:p>
-            <w:pPr>
-              <w:spacing w:after="20"/>
-            </w:pPr>
-            <w:r/>
-            <w:r>
-              <w:rPr>
-                <w:b w:val="0"/>
-                <w:sz w:val="17"/>
-              </w:rPr>
-              <w:t>Toàn bộ doanh thu ghi nhận nằm ở cột chờ xuất</w:t>
-            </w:r>
-          </w:p>
-        </w:tc>
-        <w:tc>
-          <w:tcPr>
-            <w:tcW w:type="dxa" w:w="3628"/>
-          </w:tcPr>
-          <w:p>
-            <w:pPr>
-              <w:spacing w:after="20"/>
-            </w:pPr>
-            <w:r/>
-            <w:r>
-              <w:rPr>
-                <w:b w:val="0"/>
-                <w:sz w:val="17"/>
-              </w:rPr>
-              <w:t>Khi dựng module hoá đơn</w:t>
-            </w:r>
-          </w:p>
-        </w:tc>
-      </w:tr>
-      <w:tr>
-        <w:tc>
-          <w:tcPr>
-            <w:tcW w:type="dxa" w:w="2494"/>
-          </w:tcPr>
-          <w:p>
-            <w:pPr>
-              <w:spacing w:after="20"/>
-            </w:pPr>
-            <w:r/>
-            <w:r>
-              <w:rPr>
-                <w:b w:val="0"/>
-                <w:sz w:val="17"/>
-              </w:rPr>
-              <w:t>Chưa có tích hợp lịch ngoài</w:t>
-            </w:r>
-          </w:p>
-        </w:tc>
-        <w:tc>
-          <w:tcPr>
-            <w:tcW w:type="dxa" w:w="3061"/>
-          </w:tcPr>
-          <w:p>
-            <w:pPr>
-              <w:spacing w:after="20"/>
-            </w:pPr>
-            <w:r/>
-            <w:r>
-              <w:rPr>
-                <w:b w:val="0"/>
-                <w:sz w:val="17"/>
-              </w:rPr>
-              <w:t>Panel gợi ý thiếu nhóm “Đã xếp lịch” và “Sự kiện lịch”</w:t>
-            </w:r>
-          </w:p>
-        </w:tc>
-        <w:tc>
-          <w:tcPr>
-            <w:tcW w:type="dxa" w:w="3628"/>
-          </w:tcPr>
-          <w:p>
-            <w:pPr>
-              <w:spacing w:after="20"/>
-            </w:pPr>
-            <w:r/>
-            <w:r>
-              <w:rPr>
-                <w:b w:val="0"/>
-                <w:sz w:val="17"/>
-              </w:rPr>
-              <w:t>Khi cần nối Google Calendar / Outlook</w:t>
-            </w:r>
-          </w:p>
-        </w:tc>
-      </w:tr>
-    </w:tbl>
-    <w:p>
-      <w:pPr>
-        <w:spacing w:after="40"/>
-      </w:pPr>
-    </w:p>
-    <w:p>
-      <w:pPr>
-        <w:pStyle w:val="Heading2"/>
-      </w:pPr>
-      <w:r>
-        <w:t>13.3 Chạy bản demo trên máy cá nhân</w:t>
-      </w:r>
-    </w:p>
-    <w:tbl>
-      <w:tblPr>
-        <w:tblStyle w:val="TableGrid"/>
-        <w:tblW w:type="auto" w:w="0"/>
-        <w:tblLook w:firstColumn="1" w:firstRow="1" w:lastColumn="0" w:lastRow="0" w:noHBand="0" w:noVBand="1" w:val="04A0"/>
-      </w:tblPr>
-      <w:tblGrid>
-        <w:gridCol w:w="9638"/>
-      </w:tblGrid>
-      <w:tr>
-        <w:tc>
-          <w:tcPr>
-            <w:tcW w:type="dxa" w:w="9638"/>
-            <w:shd w:val="clear" w:fill="EEF0FE"/>
-          </w:tcPr>
-          <w:p>
-            <w:pPr>
-              <w:spacing w:after="60" w:before="60"/>
-            </w:pPr>
-            <w:r/>
-            <w:r>
-              <w:rPr>
-                <w:sz w:val="19"/>
-              </w:rPr>
-              <w:t>npx vite dev --config vite.config.local.ts --port 5199</w:t>
-              <w:br/>
-              <w:br/>
-              <w:t>Dùng file cấu hình riêng vì bản gốc nạp plugin của Lovable, plugin đó so đường dẫn kiểu POSIX với đường dẫn Windows nên báo lỗi ngay khi khởi động. File vite.config.ts gốc không đụng tới, deploy vẫn bình thường.</w:t>
-            </w:r>
-          </w:p>
-        </w:tc>
-      </w:tr>
-    </w:tbl>
-    <w:p>
-      <w:pPr>
-        <w:spacing w:after="40"/>
-      </w:pPr>
-    </w:p>
-    <w:p/>
-    <w:p>
-      <w:pPr>
-        <w:jc w:val="center"/>
-      </w:pPr>
-      <w:r>
-        <w:rPr>
-          <w:i/>
-          <w:color w:val="6B6B80"/>
-        </w:rPr>
-        <w:t>— Hết —</w:t>
-      </w:r>
     </w:p>
     <w:sectPr>
       <w:pgSz w:w="11906" w:h="16838"/>

</xml_diff>

<commit_message>
docs: thêm phụ lục 12 hộp thoại thêm/sửa
Tài liệu cũ chỉ chụp màn danh sách, không có hộp thoại nào — team đọc xong vẫn
không biết bấm Thêm thì hiện ra cái gì, trường nào bắt buộc, điền gì vào đâu.

Chương 13 gom đủ 12 hộp thoại, mỗi cái một ảnh thật kèm bảng ba cột: tên
trường, có bắt buộc không, nhập gì. Đánh dấu ✱ cho trường bắt buộc.

Bao gồm cả những hộp thoại có hành vi dễ hiểu sai:
- Xoá loại dịch vụ: đang dùng thì bắt GỘP sang loại khác, không xoá trắng
- Sửa dòng giờ: đổi hạng mục thì chi phí tính lại theo giá vốn hợp đồng mới
- Hai đường thêm hạng mục: nhập tay từ đầu, hay rút từ bảng giá
- Hoàn ứng: chọn Có thì cột thanh toán đổi nhãn thành Chưa hoàn / Đã hoàn

Ảnh chụp từ bản demo đang chạy, gộp về chung thư mục với 17 ảnh cũ. Tổng 29
hình, không hình nào thiếu.

Co-Authored-By: Claude Opus 5 <noreply@anthropic.com>
</commit_message>
<xml_diff>
--- a/docs/HeyE-Kiem-soat-chi-phi-Huong-dan.docx
+++ b/docs/HeyE-Kiem-soat-chi-phi-Huong-dan.docx
@@ -929,6 +929,62 @@
                 <w:sz w:val="19"/>
               </w:rPr>
               <w:t>Đối chiếu khi kiểm thử</w:t>
+            </w:r>
+          </w:p>
+        </w:tc>
+      </w:tr>
+      <w:tr>
+        <w:tc>
+          <w:tcPr>
+            <w:tcW w:type="dxa" w:w="680"/>
+          </w:tcPr>
+          <w:p>
+            <w:pPr>
+              <w:spacing w:after="20"/>
+            </w:pPr>
+            <w:r/>
+            <w:r>
+              <w:rPr>
+                <w:b w:val="0"/>
+                <w:sz w:val="19"/>
+              </w:rPr>
+              <w:t>13</w:t>
+            </w:r>
+          </w:p>
+        </w:tc>
+        <w:tc>
+          <w:tcPr>
+            <w:tcW w:type="dxa" w:w="3685"/>
+          </w:tcPr>
+          <w:p>
+            <w:pPr>
+              <w:spacing w:after="20"/>
+            </w:pPr>
+            <w:r/>
+            <w:r>
+              <w:rPr>
+                <w:b/>
+                <w:sz w:val="19"/>
+              </w:rPr>
+              <w:t>Phụ lục — Các hộp thoại thêm và sửa</w:t>
+            </w:r>
+          </w:p>
+        </w:tc>
+        <w:tc>
+          <w:tcPr>
+            <w:tcW w:type="dxa" w:w="4932"/>
+          </w:tcPr>
+          <w:p>
+            <w:pPr>
+              <w:spacing w:after="20"/>
+            </w:pPr>
+            <w:r/>
+            <w:r>
+              <w:rPr>
+                <w:b w:val="0"/>
+                <w:sz w:val="19"/>
+              </w:rPr>
+              <w:t>Tra khi đang thao tác</w:t>
             </w:r>
           </w:p>
         </w:tc>
@@ -15047,6 +15103,4802 @@
                 <w:sz w:val="19"/>
               </w:rPr>
               <w:t>Kết luận đối chiếu: dữ liệu mẫu phủ ĐỦ mọi nhánh nghiệp vụ đã cài đặt. Không còn case nào thiếu.</w:t>
+            </w:r>
+          </w:p>
+        </w:tc>
+      </w:tr>
+    </w:tbl>
+    <w:p>
+      <w:pPr>
+        <w:spacing w:after="40"/>
+      </w:pPr>
+    </w:p>
+    <w:p>
+      <w:r>
+        <w:br w:type="page"/>
+      </w:r>
+    </w:p>
+    <w:p>
+      <w:pPr>
+        <w:pStyle w:val="Heading1"/>
+      </w:pPr>
+      <w:r>
+        <w:t>13. Phụ lục — Các hộp thoại thêm và sửa</w:t>
+      </w:r>
+    </w:p>
+    <w:p>
+      <w:r>
+        <w:rPr>
+          <w:b w:val="0"/>
+          <w:i w:val="0"/>
+        </w:rPr>
+        <w:t>Tra cứu khi đang thao tác. Dấu ✱ là trường bắt buộc, thiếu thì nút lưu không bấm được.</w:t>
+      </w:r>
+    </w:p>
+    <w:p>
+      <w:pPr>
+        <w:pStyle w:val="Heading2"/>
+      </w:pPr>
+      <w:r>
+        <w:t>13.1 Thêm loại dịch vụ</w:t>
+      </w:r>
+    </w:p>
+    <w:p>
+      <w:pPr>
+        <w:jc w:val="center"/>
+      </w:pPr>
+      <w:r>
+        <w:drawing>
+          <wp:inline xmlns:a="http://schemas.openxmlformats.org/drawingml/2006/main" xmlns:pic="http://schemas.openxmlformats.org/drawingml/2006/picture">
+            <wp:extent cx="5903999" cy="3739199"/>
+            <wp:docPr id="18" name="Picture 18"/>
+            <wp:cNvGraphicFramePr>
+              <a:graphicFrameLocks noChangeAspect="1"/>
+            </wp:cNvGraphicFramePr>
+            <a:graphic>
+              <a:graphicData uri="http://schemas.openxmlformats.org/drawingml/2006/picture">
+                <pic:pic>
+                  <pic:nvPicPr>
+                    <pic:cNvPr id="0" name="m01-them-loai-dich-vu.png"/>
+                    <pic:cNvPicPr/>
+                  </pic:nvPicPr>
+                  <pic:blipFill>
+                    <a:blip r:embed="rId25"/>
+                    <a:stretch>
+                      <a:fillRect/>
+                    </a:stretch>
+                  </pic:blipFill>
+                  <pic:spPr>
+                    <a:xfrm>
+                      <a:off x="0" y="0"/>
+                      <a:ext cx="5903999" cy="3739199"/>
+                    </a:xfrm>
+                    <a:prstGeom prst="rect"/>
+                  </pic:spPr>
+                </pic:pic>
+              </a:graphicData>
+            </a:graphic>
+          </wp:inline>
+        </w:drawing>
+      </w:r>
+    </w:p>
+    <w:p>
+      <w:pPr>
+        <w:spacing w:after="240"/>
+        <w:jc w:val="center"/>
+      </w:pPr>
+      <w:r>
+        <w:rPr>
+          <w:i/>
+          <w:color w:val="6B6B80"/>
+          <w:sz w:val="18"/>
+        </w:rPr>
+        <w:t>Hình 18 — Hộp thoại thêm loại dịch vụ</w:t>
+      </w:r>
+    </w:p>
+    <w:tbl>
+      <w:tblPr>
+        <w:tblStyle w:val="TableGrid"/>
+        <w:tblW w:type="auto" w:w="0"/>
+        <w:jc w:val="center"/>
+        <w:tblLook w:firstColumn="1" w:firstRow="1" w:lastColumn="0" w:lastRow="0" w:noHBand="0" w:noVBand="1" w:val="04A0"/>
+      </w:tblPr>
+      <w:tblGrid>
+        <w:gridCol w:w="3213"/>
+        <w:gridCol w:w="3213"/>
+        <w:gridCol w:w="3213"/>
+      </w:tblGrid>
+      <w:tr>
+        <w:tc>
+          <w:tcPr>
+            <w:tcW w:type="dxa" w:w="2268"/>
+            <w:shd w:val="clear" w:fill="5B3DF5"/>
+          </w:tcPr>
+          <w:p>
+            <w:pPr>
+              <w:spacing w:after="20"/>
+            </w:pPr>
+            <w:r/>
+            <w:r>
+              <w:rPr>
+                <w:b/>
+                <w:color w:val="FFFFFF"/>
+                <w:sz w:val="19"/>
+              </w:rPr>
+              <w:t>Trường</w:t>
+            </w:r>
+          </w:p>
+        </w:tc>
+        <w:tc>
+          <w:tcPr>
+            <w:tcW w:type="dxa" w:w="1247"/>
+            <w:shd w:val="clear" w:fill="5B3DF5"/>
+          </w:tcPr>
+          <w:p>
+            <w:pPr>
+              <w:spacing w:after="20"/>
+            </w:pPr>
+            <w:r/>
+            <w:r>
+              <w:rPr>
+                <w:b/>
+                <w:color w:val="FFFFFF"/>
+                <w:sz w:val="19"/>
+              </w:rPr>
+              <w:t>Bắt buộc</w:t>
+            </w:r>
+          </w:p>
+        </w:tc>
+        <w:tc>
+          <w:tcPr>
+            <w:tcW w:type="dxa" w:w="5783"/>
+            <w:shd w:val="clear" w:fill="5B3DF5"/>
+          </w:tcPr>
+          <w:p>
+            <w:pPr>
+              <w:spacing w:after="20"/>
+            </w:pPr>
+            <w:r/>
+            <w:r>
+              <w:rPr>
+                <w:b/>
+                <w:color w:val="FFFFFF"/>
+                <w:sz w:val="19"/>
+              </w:rPr>
+              <w:t>Nhập gì</w:t>
+            </w:r>
+          </w:p>
+        </w:tc>
+      </w:tr>
+      <w:tr>
+        <w:tc>
+          <w:tcPr>
+            <w:tcW w:type="dxa" w:w="2268"/>
+          </w:tcPr>
+          <w:p>
+            <w:pPr>
+              <w:spacing w:after="20"/>
+            </w:pPr>
+            <w:r/>
+            <w:r>
+              <w:rPr>
+                <w:b w:val="0"/>
+                <w:sz w:val="19"/>
+              </w:rPr>
+              <w:t>Tên</w:t>
+            </w:r>
+          </w:p>
+        </w:tc>
+        <w:tc>
+          <w:tcPr>
+            <w:tcW w:type="dxa" w:w="1247"/>
+          </w:tcPr>
+          <w:p>
+            <w:pPr>
+              <w:spacing w:after="20"/>
+            </w:pPr>
+            <w:r/>
+            <w:r>
+              <w:rPr>
+                <w:b w:val="0"/>
+                <w:sz w:val="19"/>
+              </w:rPr>
+              <w:t>✱</w:t>
+            </w:r>
+          </w:p>
+        </w:tc>
+        <w:tc>
+          <w:tcPr>
+            <w:tcW w:type="dxa" w:w="5783"/>
+          </w:tcPr>
+          <w:p>
+            <w:pPr>
+              <w:spacing w:after="20"/>
+            </w:pPr>
+            <w:r/>
+            <w:r>
+              <w:rPr>
+                <w:b w:val="0"/>
+                <w:sz w:val="19"/>
+              </w:rPr>
+              <w:t>Tên loại lao động: Phát triển, Kiểm thử, Thiết kế</w:t>
+            </w:r>
+          </w:p>
+        </w:tc>
+      </w:tr>
+      <w:tr>
+        <w:tc>
+          <w:tcPr>
+            <w:tcW w:type="dxa" w:w="2268"/>
+          </w:tcPr>
+          <w:p>
+            <w:pPr>
+              <w:spacing w:after="20"/>
+            </w:pPr>
+            <w:r/>
+            <w:r>
+              <w:rPr>
+                <w:b w:val="0"/>
+                <w:sz w:val="19"/>
+              </w:rPr>
+              <w:t>Mã viết tắt</w:t>
+            </w:r>
+          </w:p>
+        </w:tc>
+        <w:tc>
+          <w:tcPr>
+            <w:tcW w:type="dxa" w:w="1247"/>
+          </w:tcPr>
+          <w:p>
+            <w:pPr>
+              <w:spacing w:after="20"/>
+            </w:pPr>
+            <w:r/>
+          </w:p>
+        </w:tc>
+        <w:tc>
+          <w:tcPr>
+            <w:tcW w:type="dxa" w:w="5783"/>
+          </w:tcPr>
+          <w:p>
+            <w:pPr>
+              <w:spacing w:after="20"/>
+            </w:pPr>
+            <w:r/>
+            <w:r>
+              <w:rPr>
+                <w:b w:val="0"/>
+                <w:sz w:val="19"/>
+              </w:rPr>
+              <w:t>Nhãn ngắn hiện cạnh tên trong bảng: DEV, QC, DESIGN</w:t>
+            </w:r>
+          </w:p>
+        </w:tc>
+      </w:tr>
+      <w:tr>
+        <w:tc>
+          <w:tcPr>
+            <w:tcW w:type="dxa" w:w="2268"/>
+          </w:tcPr>
+          <w:p>
+            <w:pPr>
+              <w:spacing w:after="20"/>
+            </w:pPr>
+            <w:r/>
+            <w:r>
+              <w:rPr>
+                <w:b w:val="0"/>
+                <w:sz w:val="19"/>
+              </w:rPr>
+              <w:t>Màu nhận diện</w:t>
+            </w:r>
+          </w:p>
+        </w:tc>
+        <w:tc>
+          <w:tcPr>
+            <w:tcW w:type="dxa" w:w="1247"/>
+          </w:tcPr>
+          <w:p>
+            <w:pPr>
+              <w:spacing w:after="20"/>
+            </w:pPr>
+            <w:r/>
+          </w:p>
+        </w:tc>
+        <w:tc>
+          <w:tcPr>
+            <w:tcW w:type="dxa" w:w="5783"/>
+          </w:tcPr>
+          <w:p>
+            <w:pPr>
+              <w:spacing w:after="20"/>
+            </w:pPr>
+            <w:r/>
+            <w:r>
+              <w:rPr>
+                <w:b w:val="0"/>
+                <w:sz w:val="19"/>
+              </w:rPr>
+              <w:t>Chấm màu đầu dòng, giúp quét bảng nhanh</w:t>
+            </w:r>
+          </w:p>
+        </w:tc>
+      </w:tr>
+    </w:tbl>
+    <w:p>
+      <w:pPr>
+        <w:spacing w:after="40"/>
+      </w:pPr>
+    </w:p>
+    <w:tbl>
+      <w:tblPr>
+        <w:tblStyle w:val="TableGrid"/>
+        <w:tblW w:type="auto" w:w="0"/>
+        <w:tblLook w:firstColumn="1" w:firstRow="1" w:lastColumn="0" w:lastRow="0" w:noHBand="0" w:noVBand="1" w:val="04A0"/>
+      </w:tblPr>
+      <w:tblGrid>
+        <w:gridCol w:w="9638"/>
+      </w:tblGrid>
+      <w:tr>
+        <w:tc>
+          <w:tcPr>
+            <w:tcW w:type="dxa" w:w="9638"/>
+            <w:shd w:val="clear" w:fill="FEF6E7"/>
+          </w:tcPr>
+          <w:p>
+            <w:pPr>
+              <w:spacing w:after="60" w:before="60"/>
+            </w:pPr>
+            <w:r/>
+            <w:r>
+              <w:rPr>
+                <w:sz w:val="19"/>
+              </w:rPr>
+              <w:t>Đặt tên theo LOẠI VIỆC chứ không theo việc cụ thể. “Kiểm thử” đúng, “Test màn đăng nhập” sai — cái sau là tên hạng mục trong hợp đồng.</w:t>
+            </w:r>
+          </w:p>
+        </w:tc>
+      </w:tr>
+    </w:tbl>
+    <w:p>
+      <w:pPr>
+        <w:spacing w:after="40"/>
+      </w:pPr>
+    </w:p>
+    <w:p>
+      <w:pPr>
+        <w:pStyle w:val="Heading2"/>
+      </w:pPr>
+      <w:r>
+        <w:t>13.2 Gán nhân sự vào loại dịch vụ</w:t>
+      </w:r>
+    </w:p>
+    <w:p>
+      <w:pPr>
+        <w:jc w:val="center"/>
+      </w:pPr>
+      <w:r>
+        <w:drawing>
+          <wp:inline xmlns:a="http://schemas.openxmlformats.org/drawingml/2006/main" xmlns:pic="http://schemas.openxmlformats.org/drawingml/2006/picture">
+            <wp:extent cx="5903999" cy="3739199"/>
+            <wp:docPr id="19" name="Picture 19"/>
+            <wp:cNvGraphicFramePr>
+              <a:graphicFrameLocks noChangeAspect="1"/>
+            </wp:cNvGraphicFramePr>
+            <a:graphic>
+              <a:graphicData uri="http://schemas.openxmlformats.org/drawingml/2006/picture">
+                <pic:pic>
+                  <pic:nvPicPr>
+                    <pic:cNvPr id="0" name="m02-gan-nhan-su.png"/>
+                    <pic:cNvPicPr/>
+                  </pic:nvPicPr>
+                  <pic:blipFill>
+                    <a:blip r:embed="rId26"/>
+                    <a:stretch>
+                      <a:fillRect/>
+                    </a:stretch>
+                  </pic:blipFill>
+                  <pic:spPr>
+                    <a:xfrm>
+                      <a:off x="0" y="0"/>
+                      <a:ext cx="5903999" cy="3739199"/>
+                    </a:xfrm>
+                    <a:prstGeom prst="rect"/>
+                  </pic:spPr>
+                </pic:pic>
+              </a:graphicData>
+            </a:graphic>
+          </wp:inline>
+        </w:drawing>
+      </w:r>
+    </w:p>
+    <w:p>
+      <w:pPr>
+        <w:spacing w:after="240"/>
+        <w:jc w:val="center"/>
+      </w:pPr>
+      <w:r>
+        <w:rPr>
+          <w:i/>
+          <w:color w:val="6B6B80"/>
+          <w:sz w:val="18"/>
+        </w:rPr>
+        <w:t>Hình 19 — Hộp thoại gán nhân sự</w:t>
+      </w:r>
+    </w:p>
+    <w:p>
+      <w:r>
+        <w:rPr>
+          <w:b w:val="0"/>
+          <w:i w:val="0"/>
+        </w:rPr>
+        <w:t>Mở từ menu ba chấm của mỗi dòng. Chỉ người được gán mới chấm giờ vào loại này được.</w:t>
+      </w:r>
+    </w:p>
+    <w:tbl>
+      <w:tblPr>
+        <w:tblStyle w:val="TableGrid"/>
+        <w:tblW w:type="auto" w:w="0"/>
+        <w:jc w:val="center"/>
+        <w:tblLook w:firstColumn="1" w:firstRow="1" w:lastColumn="0" w:lastRow="0" w:noHBand="0" w:noVBand="1" w:val="04A0"/>
+      </w:tblPr>
+      <w:tblGrid>
+        <w:gridCol w:w="4819"/>
+        <w:gridCol w:w="4819"/>
+      </w:tblGrid>
+      <w:tr>
+        <w:tc>
+          <w:tcPr>
+            <w:tcW w:type="dxa" w:w="3685"/>
+            <w:shd w:val="clear" w:fill="5B3DF5"/>
+          </w:tcPr>
+          <w:p>
+            <w:pPr>
+              <w:spacing w:after="20"/>
+            </w:pPr>
+            <w:r/>
+            <w:r>
+              <w:rPr>
+                <w:b/>
+                <w:color w:val="FFFFFF"/>
+                <w:sz w:val="19"/>
+              </w:rPr>
+              <w:t>Thao tác</w:t>
+            </w:r>
+          </w:p>
+        </w:tc>
+        <w:tc>
+          <w:tcPr>
+            <w:tcW w:type="dxa" w:w="5613"/>
+            <w:shd w:val="clear" w:fill="5B3DF5"/>
+          </w:tcPr>
+          <w:p>
+            <w:pPr>
+              <w:spacing w:after="20"/>
+            </w:pPr>
+            <w:r/>
+            <w:r>
+              <w:rPr>
+                <w:b/>
+                <w:color w:val="FFFFFF"/>
+                <w:sz w:val="19"/>
+              </w:rPr>
+              <w:t>Kết quả</w:t>
+            </w:r>
+          </w:p>
+        </w:tc>
+      </w:tr>
+      <w:tr>
+        <w:tc>
+          <w:tcPr>
+            <w:tcW w:type="dxa" w:w="3685"/>
+          </w:tcPr>
+          <w:p>
+            <w:pPr>
+              <w:spacing w:after="20"/>
+            </w:pPr>
+            <w:r/>
+            <w:r>
+              <w:rPr>
+                <w:b w:val="0"/>
+                <w:sz w:val="19"/>
+              </w:rPr>
+              <w:t>Chọn người trong ô “+ Thêm người”</w:t>
+            </w:r>
+          </w:p>
+        </w:tc>
+        <w:tc>
+          <w:tcPr>
+            <w:tcW w:type="dxa" w:w="5613"/>
+          </w:tcPr>
+          <w:p>
+            <w:pPr>
+              <w:spacing w:after="20"/>
+            </w:pPr>
+            <w:r/>
+            <w:r>
+              <w:rPr>
+                <w:b w:val="0"/>
+                <w:sz w:val="19"/>
+              </w:rPr>
+              <w:t>Người đó vào danh sách ngay, không cần bấm lưu</w:t>
+            </w:r>
+          </w:p>
+        </w:tc>
+      </w:tr>
+      <w:tr>
+        <w:tc>
+          <w:tcPr>
+            <w:tcW w:type="dxa" w:w="3685"/>
+          </w:tcPr>
+          <w:p>
+            <w:pPr>
+              <w:spacing w:after="20"/>
+            </w:pPr>
+            <w:r/>
+            <w:r>
+              <w:rPr>
+                <w:b w:val="0"/>
+                <w:sz w:val="19"/>
+              </w:rPr>
+              <w:t>Bấm dấu × cạnh tên</w:t>
+            </w:r>
+          </w:p>
+        </w:tc>
+        <w:tc>
+          <w:tcPr>
+            <w:tcW w:type="dxa" w:w="5613"/>
+          </w:tcPr>
+          <w:p>
+            <w:pPr>
+              <w:spacing w:after="20"/>
+            </w:pPr>
+            <w:r/>
+            <w:r>
+              <w:rPr>
+                <w:b w:val="0"/>
+                <w:sz w:val="19"/>
+              </w:rPr>
+              <w:t>Bỏ gán người đó</w:t>
+            </w:r>
+          </w:p>
+        </w:tc>
+      </w:tr>
+      <w:tr>
+        <w:tc>
+          <w:tcPr>
+            <w:tcW w:type="dxa" w:w="3685"/>
+          </w:tcPr>
+          <w:p>
+            <w:pPr>
+              <w:spacing w:after="20"/>
+            </w:pPr>
+            <w:r/>
+            <w:r>
+              <w:rPr>
+                <w:b w:val="0"/>
+                <w:sz w:val="19"/>
+              </w:rPr>
+              <w:t>Không gán ai</w:t>
+            </w:r>
+          </w:p>
+        </w:tc>
+        <w:tc>
+          <w:tcPr>
+            <w:tcW w:type="dxa" w:w="5613"/>
+          </w:tcPr>
+          <w:p>
+            <w:pPr>
+              <w:spacing w:after="20"/>
+            </w:pPr>
+            <w:r/>
+            <w:r>
+              <w:rPr>
+                <w:b w:val="0"/>
+                <w:sz w:val="19"/>
+              </w:rPr>
+              <w:t>Mọi người đều chấm giờ được — đây là mặc định</w:t>
+            </w:r>
+          </w:p>
+        </w:tc>
+      </w:tr>
+    </w:tbl>
+    <w:p>
+      <w:pPr>
+        <w:spacing w:after="40"/>
+      </w:pPr>
+    </w:p>
+    <w:tbl>
+      <w:tblPr>
+        <w:tblStyle w:val="TableGrid"/>
+        <w:tblW w:type="auto" w:w="0"/>
+        <w:tblLook w:firstColumn="1" w:firstRow="1" w:lastColumn="0" w:lastRow="0" w:noHBand="0" w:noVBand="1" w:val="04A0"/>
+      </w:tblPr>
+      <w:tblGrid>
+        <w:gridCol w:w="9638"/>
+      </w:tblGrid>
+      <w:tr>
+        <w:tc>
+          <w:tcPr>
+            <w:tcW w:type="dxa" w:w="9638"/>
+            <w:shd w:val="clear" w:fill="EEF0FE"/>
+          </w:tcPr>
+          <w:p>
+            <w:pPr>
+              <w:spacing w:after="60" w:before="60"/>
+            </w:pPr>
+            <w:r/>
+            <w:r>
+              <w:rPr>
+                <w:sz w:val="19"/>
+              </w:rPr>
+              <w:t>Cột phụ ngoài danh sách hiện “N người” hoặc “mọi người” — nhìn là biết loại nào đang giới hạn.</w:t>
+            </w:r>
+          </w:p>
+        </w:tc>
+      </w:tr>
+    </w:tbl>
+    <w:p>
+      <w:pPr>
+        <w:spacing w:after="40"/>
+      </w:pPr>
+    </w:p>
+    <w:p>
+      <w:pPr>
+        <w:pStyle w:val="Heading2"/>
+      </w:pPr>
+      <w:r>
+        <w:t>13.3 Xoá loại dịch vụ</w:t>
+      </w:r>
+    </w:p>
+    <w:p>
+      <w:pPr>
+        <w:jc w:val="center"/>
+      </w:pPr>
+      <w:r>
+        <w:drawing>
+          <wp:inline xmlns:a="http://schemas.openxmlformats.org/drawingml/2006/main" xmlns:pic="http://schemas.openxmlformats.org/drawingml/2006/picture">
+            <wp:extent cx="5903999" cy="3739199"/>
+            <wp:docPr id="20" name="Picture 20"/>
+            <wp:cNvGraphicFramePr>
+              <a:graphicFrameLocks noChangeAspect="1"/>
+            </wp:cNvGraphicFramePr>
+            <a:graphic>
+              <a:graphicData uri="http://schemas.openxmlformats.org/drawingml/2006/picture">
+                <pic:pic>
+                  <pic:nvPicPr>
+                    <pic:cNvPr id="0" name="m03-xoa-gop-loai-dich-vu.png"/>
+                    <pic:cNvPicPr/>
+                  </pic:nvPicPr>
+                  <pic:blipFill>
+                    <a:blip r:embed="rId27"/>
+                    <a:stretch>
+                      <a:fillRect/>
+                    </a:stretch>
+                  </pic:blipFill>
+                  <pic:spPr>
+                    <a:xfrm>
+                      <a:off x="0" y="0"/>
+                      <a:ext cx="5903999" cy="3739199"/>
+                    </a:xfrm>
+                    <a:prstGeom prst="rect"/>
+                  </pic:spPr>
+                </pic:pic>
+              </a:graphicData>
+            </a:graphic>
+          </wp:inline>
+        </w:drawing>
+      </w:r>
+    </w:p>
+    <w:p>
+      <w:pPr>
+        <w:spacing w:after="240"/>
+        <w:jc w:val="center"/>
+      </w:pPr>
+      <w:r>
+        <w:rPr>
+          <w:i/>
+          <w:color w:val="6B6B80"/>
+          <w:sz w:val="18"/>
+        </w:rPr>
+        <w:t>Hình 20 — Hộp thoại xoá và gộp</w:t>
+      </w:r>
+    </w:p>
+    <w:p>
+      <w:r>
+        <w:rPr>
+          <w:b w:val="0"/>
+          <w:i w:val="0"/>
+        </w:rPr>
+        <w:t>Loại đang được dùng thì không xoá trắng được. Hệ thống bắt chọn loại thay thế và chuyển toàn bộ dữ liệu sang đó.</w:t>
+      </w:r>
+    </w:p>
+    <w:tbl>
+      <w:tblPr>
+        <w:tblStyle w:val="TableGrid"/>
+        <w:tblW w:type="auto" w:w="0"/>
+        <w:jc w:val="center"/>
+        <w:tblLook w:firstColumn="1" w:firstRow="1" w:lastColumn="0" w:lastRow="0" w:noHBand="0" w:noVBand="1" w:val="04A0"/>
+      </w:tblPr>
+      <w:tblGrid>
+        <w:gridCol w:w="4819"/>
+        <w:gridCol w:w="4819"/>
+      </w:tblGrid>
+      <w:tr>
+        <w:tc>
+          <w:tcPr>
+            <w:tcW w:type="dxa" w:w="3402"/>
+            <w:shd w:val="clear" w:fill="5B3DF5"/>
+          </w:tcPr>
+          <w:p>
+            <w:pPr>
+              <w:spacing w:after="20"/>
+            </w:pPr>
+            <w:r/>
+            <w:r>
+              <w:rPr>
+                <w:b/>
+                <w:color w:val="FFFFFF"/>
+                <w:sz w:val="19"/>
+              </w:rPr>
+              <w:t>Tình huống</w:t>
+            </w:r>
+          </w:p>
+        </w:tc>
+        <w:tc>
+          <w:tcPr>
+            <w:tcW w:type="dxa" w:w="5896"/>
+            <w:shd w:val="clear" w:fill="5B3DF5"/>
+          </w:tcPr>
+          <w:p>
+            <w:pPr>
+              <w:spacing w:after="20"/>
+            </w:pPr>
+            <w:r/>
+            <w:r>
+              <w:rPr>
+                <w:b/>
+                <w:color w:val="FFFFFF"/>
+                <w:sz w:val="19"/>
+              </w:rPr>
+              <w:t>Hộp thoại hiện gì</w:t>
+            </w:r>
+          </w:p>
+        </w:tc>
+      </w:tr>
+      <w:tr>
+        <w:tc>
+          <w:tcPr>
+            <w:tcW w:type="dxa" w:w="3402"/>
+          </w:tcPr>
+          <w:p>
+            <w:pPr>
+              <w:spacing w:after="20"/>
+            </w:pPr>
+            <w:r/>
+            <w:r>
+              <w:rPr>
+                <w:b w:val="0"/>
+                <w:sz w:val="19"/>
+              </w:rPr>
+              <w:t>Loại CHƯA dùng ở đâu</w:t>
+            </w:r>
+          </w:p>
+        </w:tc>
+        <w:tc>
+          <w:tcPr>
+            <w:tcW w:type="dxa" w:w="5896"/>
+          </w:tcPr>
+          <w:p>
+            <w:pPr>
+              <w:spacing w:after="20"/>
+            </w:pPr>
+            <w:r/>
+            <w:r>
+              <w:rPr>
+                <w:b w:val="0"/>
+                <w:sz w:val="19"/>
+              </w:rPr>
+              <w:t>Chỉ hỏi xác nhận, xoá thẳng</w:t>
+            </w:r>
+          </w:p>
+        </w:tc>
+      </w:tr>
+      <w:tr>
+        <w:tc>
+          <w:tcPr>
+            <w:tcW w:type="dxa" w:w="3402"/>
+          </w:tcPr>
+          <w:p>
+            <w:pPr>
+              <w:spacing w:after="20"/>
+            </w:pPr>
+            <w:r/>
+            <w:r>
+              <w:rPr>
+                <w:b w:val="0"/>
+                <w:sz w:val="19"/>
+              </w:rPr>
+              <w:t>Loại ĐANG có dòng giá, giờ hoặc chi phí</w:t>
+            </w:r>
+          </w:p>
+        </w:tc>
+        <w:tc>
+          <w:tcPr>
+            <w:tcW w:type="dxa" w:w="5896"/>
+          </w:tcPr>
+          <w:p>
+            <w:pPr>
+              <w:spacing w:after="20"/>
+            </w:pPr>
+            <w:r/>
+            <w:r>
+              <w:rPr>
+                <w:b w:val="0"/>
+                <w:sz w:val="19"/>
+              </w:rPr>
+              <w:t>Bắt chọn loại thay thế. Mọi dữ liệu chuyển sang loại đó rồi mới xoá</w:t>
+            </w:r>
+          </w:p>
+        </w:tc>
+      </w:tr>
+    </w:tbl>
+    <w:p>
+      <w:pPr>
+        <w:spacing w:after="40"/>
+      </w:pPr>
+    </w:p>
+    <w:tbl>
+      <w:tblPr>
+        <w:tblStyle w:val="TableGrid"/>
+        <w:tblW w:type="auto" w:w="0"/>
+        <w:tblLook w:firstColumn="1" w:firstRow="1" w:lastColumn="0" w:lastRow="0" w:noHBand="0" w:noVBand="1" w:val="04A0"/>
+      </w:tblPr>
+      <w:tblGrid>
+        <w:gridCol w:w="9638"/>
+      </w:tblGrid>
+      <w:tr>
+        <w:tc>
+          <w:tcPr>
+            <w:tcW w:type="dxa" w:w="9638"/>
+            <w:shd w:val="clear" w:fill="FEF6E7"/>
+          </w:tcPr>
+          <w:p>
+            <w:pPr>
+              <w:spacing w:after="60" w:before="60"/>
+            </w:pPr>
+            <w:r/>
+            <w:r>
+              <w:rPr>
+                <w:sz w:val="19"/>
+              </w:rPr>
+              <w:t>Không hoàn tác được. Cân nhắc dùng Lưu trữ nếu chỉ muốn ẩn đi.</w:t>
+            </w:r>
+          </w:p>
+        </w:tc>
+      </w:tr>
+    </w:tbl>
+    <w:p>
+      <w:pPr>
+        <w:spacing w:after="40"/>
+      </w:pPr>
+    </w:p>
+    <w:p>
+      <w:r>
+        <w:br w:type="page"/>
+      </w:r>
+    </w:p>
+    <w:p>
+      <w:pPr>
+        <w:pStyle w:val="Heading2"/>
+      </w:pPr>
+      <w:r>
+        <w:t>13.4 Thêm bảng giá</w:t>
+      </w:r>
+    </w:p>
+    <w:p>
+      <w:pPr>
+        <w:jc w:val="center"/>
+      </w:pPr>
+      <w:r>
+        <w:drawing>
+          <wp:inline xmlns:a="http://schemas.openxmlformats.org/drawingml/2006/main" xmlns:pic="http://schemas.openxmlformats.org/drawingml/2006/picture">
+            <wp:extent cx="5903999" cy="3739199"/>
+            <wp:docPr id="21" name="Picture 21"/>
+            <wp:cNvGraphicFramePr>
+              <a:graphicFrameLocks noChangeAspect="1"/>
+            </wp:cNvGraphicFramePr>
+            <a:graphic>
+              <a:graphicData uri="http://schemas.openxmlformats.org/drawingml/2006/picture">
+                <pic:pic>
+                  <pic:nvPicPr>
+                    <pic:cNvPr id="0" name="m04-them-bang-gia.png"/>
+                    <pic:cNvPicPr/>
+                  </pic:nvPicPr>
+                  <pic:blipFill>
+                    <a:blip r:embed="rId28"/>
+                    <a:stretch>
+                      <a:fillRect/>
+                    </a:stretch>
+                  </pic:blipFill>
+                  <pic:spPr>
+                    <a:xfrm>
+                      <a:off x="0" y="0"/>
+                      <a:ext cx="5903999" cy="3739199"/>
+                    </a:xfrm>
+                    <a:prstGeom prst="rect"/>
+                  </pic:spPr>
+                </pic:pic>
+              </a:graphicData>
+            </a:graphic>
+          </wp:inline>
+        </w:drawing>
+      </w:r>
+    </w:p>
+    <w:p>
+      <w:pPr>
+        <w:spacing w:after="240"/>
+        <w:jc w:val="center"/>
+      </w:pPr>
+      <w:r>
+        <w:rPr>
+          <w:i/>
+          <w:color w:val="6B6B80"/>
+          <w:sz w:val="18"/>
+        </w:rPr>
+        <w:t>Hình 21 — Hộp thoại thêm bảng giá</w:t>
+      </w:r>
+    </w:p>
+    <w:tbl>
+      <w:tblPr>
+        <w:tblStyle w:val="TableGrid"/>
+        <w:tblW w:type="auto" w:w="0"/>
+        <w:jc w:val="center"/>
+        <w:tblLook w:firstColumn="1" w:firstRow="1" w:lastColumn="0" w:lastRow="0" w:noHBand="0" w:noVBand="1" w:val="04A0"/>
+      </w:tblPr>
+      <w:tblGrid>
+        <w:gridCol w:w="3213"/>
+        <w:gridCol w:w="3213"/>
+        <w:gridCol w:w="3213"/>
+      </w:tblGrid>
+      <w:tr>
+        <w:tc>
+          <w:tcPr>
+            <w:tcW w:type="dxa" w:w="2268"/>
+            <w:shd w:val="clear" w:fill="5B3DF5"/>
+          </w:tcPr>
+          <w:p>
+            <w:pPr>
+              <w:spacing w:after="20"/>
+            </w:pPr>
+            <w:r/>
+            <w:r>
+              <w:rPr>
+                <w:b/>
+                <w:color w:val="FFFFFF"/>
+                <w:sz w:val="19"/>
+              </w:rPr>
+              <w:t>Trường</w:t>
+            </w:r>
+          </w:p>
+        </w:tc>
+        <w:tc>
+          <w:tcPr>
+            <w:tcW w:type="dxa" w:w="1247"/>
+            <w:shd w:val="clear" w:fill="5B3DF5"/>
+          </w:tcPr>
+          <w:p>
+            <w:pPr>
+              <w:spacing w:after="20"/>
+            </w:pPr>
+            <w:r/>
+            <w:r>
+              <w:rPr>
+                <w:b/>
+                <w:color w:val="FFFFFF"/>
+                <w:sz w:val="19"/>
+              </w:rPr>
+              <w:t>Bắt buộc</w:t>
+            </w:r>
+          </w:p>
+        </w:tc>
+        <w:tc>
+          <w:tcPr>
+            <w:tcW w:type="dxa" w:w="5783"/>
+            <w:shd w:val="clear" w:fill="5B3DF5"/>
+          </w:tcPr>
+          <w:p>
+            <w:pPr>
+              <w:spacing w:after="20"/>
+            </w:pPr>
+            <w:r/>
+            <w:r>
+              <w:rPr>
+                <w:b/>
+                <w:color w:val="FFFFFF"/>
+                <w:sz w:val="19"/>
+              </w:rPr>
+              <w:t>Nhập gì</w:t>
+            </w:r>
+          </w:p>
+        </w:tc>
+      </w:tr>
+      <w:tr>
+        <w:tc>
+          <w:tcPr>
+            <w:tcW w:type="dxa" w:w="2268"/>
+          </w:tcPr>
+          <w:p>
+            <w:pPr>
+              <w:spacing w:after="20"/>
+            </w:pPr>
+            <w:r/>
+            <w:r>
+              <w:rPr>
+                <w:b w:val="0"/>
+                <w:sz w:val="19"/>
+              </w:rPr>
+              <w:t>Tên bảng giá</w:t>
+            </w:r>
+          </w:p>
+        </w:tc>
+        <w:tc>
+          <w:tcPr>
+            <w:tcW w:type="dxa" w:w="1247"/>
+          </w:tcPr>
+          <w:p>
+            <w:pPr>
+              <w:spacing w:after="20"/>
+            </w:pPr>
+            <w:r/>
+            <w:r>
+              <w:rPr>
+                <w:b w:val="0"/>
+                <w:sz w:val="19"/>
+              </w:rPr>
+              <w:t>✱</w:t>
+            </w:r>
+          </w:p>
+        </w:tc>
+        <w:tc>
+          <w:tcPr>
+            <w:tcW w:type="dxa" w:w="5783"/>
+          </w:tcPr>
+          <w:p>
+            <w:pPr>
+              <w:spacing w:after="20"/>
+            </w:pPr>
+            <w:r/>
+            <w:r>
+              <w:rPr>
+                <w:b w:val="0"/>
+                <w:sz w:val="19"/>
+              </w:rPr>
+              <w:t>Ví dụ: Bảng giá OCB, Giá chuẩn công ty</w:t>
+            </w:r>
+          </w:p>
+        </w:tc>
+      </w:tr>
+      <w:tr>
+        <w:tc>
+          <w:tcPr>
+            <w:tcW w:type="dxa" w:w="2268"/>
+          </w:tcPr>
+          <w:p>
+            <w:pPr>
+              <w:spacing w:after="20"/>
+            </w:pPr>
+            <w:r/>
+            <w:r>
+              <w:rPr>
+                <w:b w:val="0"/>
+                <w:sz w:val="19"/>
+              </w:rPr>
+              <w:t>Khách hàng</w:t>
+            </w:r>
+          </w:p>
+        </w:tc>
+        <w:tc>
+          <w:tcPr>
+            <w:tcW w:type="dxa" w:w="1247"/>
+          </w:tcPr>
+          <w:p>
+            <w:pPr>
+              <w:spacing w:after="20"/>
+            </w:pPr>
+            <w:r/>
+          </w:p>
+        </w:tc>
+        <w:tc>
+          <w:tcPr>
+            <w:tcW w:type="dxa" w:w="5783"/>
+          </w:tcPr>
+          <w:p>
+            <w:pPr>
+              <w:spacing w:after="20"/>
+            </w:pPr>
+            <w:r/>
+            <w:r>
+              <w:rPr>
+                <w:b w:val="0"/>
+                <w:sz w:val="19"/>
+              </w:rPr>
+              <w:t>Để trống = bảng chuẩn công ty, áp cho mọi khách chưa có bảng riêng. Chọn khách = bảng riêng, chỉ khách đó dùng</w:t>
+            </w:r>
+          </w:p>
+        </w:tc>
+      </w:tr>
+    </w:tbl>
+    <w:p>
+      <w:pPr>
+        <w:spacing w:after="40"/>
+      </w:pPr>
+    </w:p>
+    <w:p>
+      <w:pPr>
+        <w:pStyle w:val="Heading2"/>
+      </w:pPr>
+      <w:r>
+        <w:t>13.5 Thêm dòng giá</w:t>
+      </w:r>
+    </w:p>
+    <w:p>
+      <w:pPr>
+        <w:jc w:val="center"/>
+      </w:pPr>
+      <w:r>
+        <w:drawing>
+          <wp:inline xmlns:a="http://schemas.openxmlformats.org/drawingml/2006/main" xmlns:pic="http://schemas.openxmlformats.org/drawingml/2006/picture">
+            <wp:extent cx="5903999" cy="3739199"/>
+            <wp:docPr id="22" name="Picture 22"/>
+            <wp:cNvGraphicFramePr>
+              <a:graphicFrameLocks noChangeAspect="1"/>
+            </wp:cNvGraphicFramePr>
+            <a:graphic>
+              <a:graphicData uri="http://schemas.openxmlformats.org/drawingml/2006/picture">
+                <pic:pic>
+                  <pic:nvPicPr>
+                    <pic:cNvPr id="0" name="m05-them-dong-gia.png"/>
+                    <pic:cNvPicPr/>
+                  </pic:nvPicPr>
+                  <pic:blipFill>
+                    <a:blip r:embed="rId29"/>
+                    <a:stretch>
+                      <a:fillRect/>
+                    </a:stretch>
+                  </pic:blipFill>
+                  <pic:spPr>
+                    <a:xfrm>
+                      <a:off x="0" y="0"/>
+                      <a:ext cx="5903999" cy="3739199"/>
+                    </a:xfrm>
+                    <a:prstGeom prst="rect"/>
+                  </pic:spPr>
+                </pic:pic>
+              </a:graphicData>
+            </a:graphic>
+          </wp:inline>
+        </w:drawing>
+      </w:r>
+    </w:p>
+    <w:p>
+      <w:pPr>
+        <w:spacing w:after="240"/>
+        <w:jc w:val="center"/>
+      </w:pPr>
+      <w:r>
+        <w:rPr>
+          <w:i/>
+          <w:color w:val="6B6B80"/>
+          <w:sz w:val="18"/>
+        </w:rPr>
+        <w:t>Hình 22 — Hộp thoại thêm dòng giá</w:t>
+      </w:r>
+    </w:p>
+    <w:tbl>
+      <w:tblPr>
+        <w:tblStyle w:val="TableGrid"/>
+        <w:tblW w:type="auto" w:w="0"/>
+        <w:jc w:val="center"/>
+        <w:tblLook w:firstColumn="1" w:firstRow="1" w:lastColumn="0" w:lastRow="0" w:noHBand="0" w:noVBand="1" w:val="04A0"/>
+      </w:tblPr>
+      <w:tblGrid>
+        <w:gridCol w:w="3213"/>
+        <w:gridCol w:w="3213"/>
+        <w:gridCol w:w="3213"/>
+      </w:tblGrid>
+      <w:tr>
+        <w:tc>
+          <w:tcPr>
+            <w:tcW w:type="dxa" w:w="2608"/>
+            <w:shd w:val="clear" w:fill="5B3DF5"/>
+          </w:tcPr>
+          <w:p>
+            <w:pPr>
+              <w:spacing w:after="20"/>
+            </w:pPr>
+            <w:r/>
+            <w:r>
+              <w:rPr>
+                <w:b/>
+                <w:color w:val="FFFFFF"/>
+                <w:sz w:val="19"/>
+              </w:rPr>
+              <w:t>Trường</w:t>
+            </w:r>
+          </w:p>
+        </w:tc>
+        <w:tc>
+          <w:tcPr>
+            <w:tcW w:type="dxa" w:w="1247"/>
+            <w:shd w:val="clear" w:fill="5B3DF5"/>
+          </w:tcPr>
+          <w:p>
+            <w:pPr>
+              <w:spacing w:after="20"/>
+            </w:pPr>
+            <w:r/>
+            <w:r>
+              <w:rPr>
+                <w:b/>
+                <w:color w:val="FFFFFF"/>
+                <w:sz w:val="19"/>
+              </w:rPr>
+              <w:t>Bắt buộc</w:t>
+            </w:r>
+          </w:p>
+        </w:tc>
+        <w:tc>
+          <w:tcPr>
+            <w:tcW w:type="dxa" w:w="5443"/>
+            <w:shd w:val="clear" w:fill="5B3DF5"/>
+          </w:tcPr>
+          <w:p>
+            <w:pPr>
+              <w:spacing w:after="20"/>
+            </w:pPr>
+            <w:r/>
+            <w:r>
+              <w:rPr>
+                <w:b/>
+                <w:color w:val="FFFFFF"/>
+                <w:sz w:val="19"/>
+              </w:rPr>
+              <w:t>Nhập gì</w:t>
+            </w:r>
+          </w:p>
+        </w:tc>
+      </w:tr>
+      <w:tr>
+        <w:tc>
+          <w:tcPr>
+            <w:tcW w:type="dxa" w:w="2608"/>
+          </w:tcPr>
+          <w:p>
+            <w:pPr>
+              <w:spacing w:after="20"/>
+            </w:pPr>
+            <w:r/>
+            <w:r>
+              <w:rPr>
+                <w:b w:val="0"/>
+                <w:sz w:val="19"/>
+              </w:rPr>
+              <w:t>Tên dòng giá</w:t>
+            </w:r>
+          </w:p>
+        </w:tc>
+        <w:tc>
+          <w:tcPr>
+            <w:tcW w:type="dxa" w:w="1247"/>
+          </w:tcPr>
+          <w:p>
+            <w:pPr>
+              <w:spacing w:after="20"/>
+            </w:pPr>
+            <w:r/>
+            <w:r>
+              <w:rPr>
+                <w:b w:val="0"/>
+                <w:sz w:val="19"/>
+              </w:rPr>
+              <w:t>✱</w:t>
+            </w:r>
+          </w:p>
+        </w:tc>
+        <w:tc>
+          <w:tcPr>
+            <w:tcW w:type="dxa" w:w="5443"/>
+          </w:tcPr>
+          <w:p>
+            <w:pPr>
+              <w:spacing w:after="20"/>
+            </w:pPr>
+            <w:r/>
+            <w:r>
+              <w:rPr>
+                <w:b w:val="0"/>
+                <w:sz w:val="19"/>
+              </w:rPr>
+              <w:t>Tên tự đặt để phân biệt: “Thiết kế cấp cao”, “Thiết kế cấp thường”</w:t>
+            </w:r>
+          </w:p>
+        </w:tc>
+      </w:tr>
+      <w:tr>
+        <w:tc>
+          <w:tcPr>
+            <w:tcW w:type="dxa" w:w="2608"/>
+          </w:tcPr>
+          <w:p>
+            <w:pPr>
+              <w:spacing w:after="20"/>
+            </w:pPr>
+            <w:r/>
+            <w:r>
+              <w:rPr>
+                <w:b w:val="0"/>
+                <w:sz w:val="19"/>
+              </w:rPr>
+              <w:t>Loại dịch vụ</w:t>
+            </w:r>
+          </w:p>
+        </w:tc>
+        <w:tc>
+          <w:tcPr>
+            <w:tcW w:type="dxa" w:w="1247"/>
+          </w:tcPr>
+          <w:p>
+            <w:pPr>
+              <w:spacing w:after="20"/>
+            </w:pPr>
+            <w:r/>
+            <w:r>
+              <w:rPr>
+                <w:b w:val="0"/>
+                <w:sz w:val="19"/>
+              </w:rPr>
+              <w:t>✱</w:t>
+            </w:r>
+          </w:p>
+        </w:tc>
+        <w:tc>
+          <w:tcPr>
+            <w:tcW w:type="dxa" w:w="5443"/>
+          </w:tcPr>
+          <w:p>
+            <w:pPr>
+              <w:spacing w:after="20"/>
+            </w:pPr>
+            <w:r/>
+            <w:r>
+              <w:rPr>
+                <w:b w:val="0"/>
+                <w:sz w:val="19"/>
+              </w:rPr>
+              <w:t>Nhãn phân loại. Nhiều dòng dùng chung một loại được</w:t>
+            </w:r>
+          </w:p>
+        </w:tc>
+      </w:tr>
+      <w:tr>
+        <w:tc>
+          <w:tcPr>
+            <w:tcW w:type="dxa" w:w="2608"/>
+          </w:tcPr>
+          <w:p>
+            <w:pPr>
+              <w:spacing w:after="20"/>
+            </w:pPr>
+            <w:r/>
+            <w:r>
+              <w:rPr>
+                <w:b w:val="0"/>
+                <w:sz w:val="19"/>
+              </w:rPr>
+              <w:t>Cách tính tiền</w:t>
+            </w:r>
+          </w:p>
+        </w:tc>
+        <w:tc>
+          <w:tcPr>
+            <w:tcW w:type="dxa" w:w="1247"/>
+          </w:tcPr>
+          <w:p>
+            <w:pPr>
+              <w:spacing w:after="20"/>
+            </w:pPr>
+            <w:r/>
+          </w:p>
+        </w:tc>
+        <w:tc>
+          <w:tcPr>
+            <w:tcW w:type="dxa" w:w="5443"/>
+          </w:tcPr>
+          <w:p>
+            <w:pPr>
+              <w:spacing w:after="20"/>
+            </w:pPr>
+            <w:r/>
+            <w:r>
+              <w:rPr>
+                <w:b w:val="0"/>
+                <w:sz w:val="19"/>
+              </w:rPr>
+              <w:t>Theo giờ / Trọn gói / Phần trăm / Không tính tiền</w:t>
+            </w:r>
+          </w:p>
+        </w:tc>
+      </w:tr>
+      <w:tr>
+        <w:tc>
+          <w:tcPr>
+            <w:tcW w:type="dxa" w:w="2608"/>
+          </w:tcPr>
+          <w:p>
+            <w:pPr>
+              <w:spacing w:after="20"/>
+            </w:pPr>
+            <w:r/>
+            <w:r>
+              <w:rPr>
+                <w:b w:val="0"/>
+                <w:sz w:val="19"/>
+              </w:rPr>
+              <w:t>Đơn vị</w:t>
+            </w:r>
+          </w:p>
+        </w:tc>
+        <w:tc>
+          <w:tcPr>
+            <w:tcW w:type="dxa" w:w="1247"/>
+          </w:tcPr>
+          <w:p>
+            <w:pPr>
+              <w:spacing w:after="20"/>
+            </w:pPr>
+            <w:r/>
+          </w:p>
+        </w:tc>
+        <w:tc>
+          <w:tcPr>
+            <w:tcW w:type="dxa" w:w="5443"/>
+          </w:tcPr>
+          <w:p>
+            <w:pPr>
+              <w:spacing w:after="20"/>
+            </w:pPr>
+            <w:r/>
+            <w:r>
+              <w:rPr>
+                <w:b w:val="0"/>
+                <w:sz w:val="19"/>
+              </w:rPr>
+              <w:t>giờ, ngày, hoặc gói</w:t>
+            </w:r>
+          </w:p>
+        </w:tc>
+      </w:tr>
+      <w:tr>
+        <w:tc>
+          <w:tcPr>
+            <w:tcW w:type="dxa" w:w="2608"/>
+          </w:tcPr>
+          <w:p>
+            <w:pPr>
+              <w:spacing w:after="20"/>
+            </w:pPr>
+            <w:r/>
+            <w:r>
+              <w:rPr>
+                <w:b w:val="0"/>
+                <w:sz w:val="19"/>
+              </w:rPr>
+              <w:t>Đơn giá</w:t>
+            </w:r>
+          </w:p>
+        </w:tc>
+        <w:tc>
+          <w:tcPr>
+            <w:tcW w:type="dxa" w:w="1247"/>
+          </w:tcPr>
+          <w:p>
+            <w:pPr>
+              <w:spacing w:after="20"/>
+            </w:pPr>
+            <w:r/>
+            <w:r>
+              <w:rPr>
+                <w:b w:val="0"/>
+                <w:sz w:val="19"/>
+              </w:rPr>
+              <w:t>✱</w:t>
+            </w:r>
+          </w:p>
+        </w:tc>
+        <w:tc>
+          <w:tcPr>
+            <w:tcW w:type="dxa" w:w="5443"/>
+          </w:tcPr>
+          <w:p>
+            <w:pPr>
+              <w:spacing w:after="20"/>
+            </w:pPr>
+            <w:r/>
+            <w:r>
+              <w:rPr>
+                <w:b w:val="0"/>
+                <w:sz w:val="19"/>
+              </w:rPr>
+              <w:t>Giá bán một đơn vị</w:t>
+            </w:r>
+          </w:p>
+        </w:tc>
+      </w:tr>
+      <w:tr>
+        <w:tc>
+          <w:tcPr>
+            <w:tcW w:type="dxa" w:w="2608"/>
+          </w:tcPr>
+          <w:p>
+            <w:pPr>
+              <w:spacing w:after="20"/>
+            </w:pPr>
+            <w:r/>
+            <w:r>
+              <w:rPr>
+                <w:b w:val="0"/>
+                <w:sz w:val="19"/>
+              </w:rPr>
+              <w:t>Giá vốn dự kiến</w:t>
+            </w:r>
+          </w:p>
+        </w:tc>
+        <w:tc>
+          <w:tcPr>
+            <w:tcW w:type="dxa" w:w="1247"/>
+          </w:tcPr>
+          <w:p>
+            <w:pPr>
+              <w:spacing w:after="20"/>
+            </w:pPr>
+            <w:r/>
+          </w:p>
+        </w:tc>
+        <w:tc>
+          <w:tcPr>
+            <w:tcW w:type="dxa" w:w="5443"/>
+          </w:tcPr>
+          <w:p>
+            <w:pPr>
+              <w:spacing w:after="20"/>
+            </w:pPr>
+            <w:r/>
+            <w:r>
+              <w:rPr>
+                <w:b w:val="0"/>
+                <w:sz w:val="19"/>
+              </w:rPr>
+              <w:t>Để ước lãi ngay lúc báo giá, chưa cần log giờ thật</w:t>
+            </w:r>
+          </w:p>
+        </w:tc>
+      </w:tr>
+      <w:tr>
+        <w:tc>
+          <w:tcPr>
+            <w:tcW w:type="dxa" w:w="2608"/>
+          </w:tcPr>
+          <w:p>
+            <w:pPr>
+              <w:spacing w:after="20"/>
+            </w:pPr>
+            <w:r/>
+            <w:r>
+              <w:rPr>
+                <w:b w:val="0"/>
+                <w:sz w:val="19"/>
+              </w:rPr>
+              <w:t>Giảm giá / phụ giá (%)</w:t>
+            </w:r>
+          </w:p>
+        </w:tc>
+        <w:tc>
+          <w:tcPr>
+            <w:tcW w:type="dxa" w:w="1247"/>
+          </w:tcPr>
+          <w:p>
+            <w:pPr>
+              <w:spacing w:after="20"/>
+            </w:pPr>
+            <w:r/>
+          </w:p>
+        </w:tc>
+        <w:tc>
+          <w:tcPr>
+            <w:tcW w:type="dxa" w:w="5443"/>
+          </w:tcPr>
+          <w:p>
+            <w:pPr>
+              <w:spacing w:after="20"/>
+            </w:pPr>
+            <w:r/>
+            <w:r>
+              <w:rPr>
+                <w:b w:val="0"/>
+                <w:sz w:val="19"/>
+              </w:rPr>
+              <w:t>Âm là giảm, dương là cộng thêm</w:t>
+            </w:r>
+          </w:p>
+        </w:tc>
+      </w:tr>
+      <w:tr>
+        <w:tc>
+          <w:tcPr>
+            <w:tcW w:type="dxa" w:w="2608"/>
+          </w:tcPr>
+          <w:p>
+            <w:pPr>
+              <w:spacing w:after="20"/>
+            </w:pPr>
+            <w:r/>
+            <w:r>
+              <w:rPr>
+                <w:b w:val="0"/>
+                <w:sz w:val="19"/>
+              </w:rPr>
+              <w:t>Cho ghi giờ / chi phí</w:t>
+            </w:r>
+          </w:p>
+        </w:tc>
+        <w:tc>
+          <w:tcPr>
+            <w:tcW w:type="dxa" w:w="1247"/>
+          </w:tcPr>
+          <w:p>
+            <w:pPr>
+              <w:spacing w:after="20"/>
+            </w:pPr>
+            <w:r/>
+          </w:p>
+        </w:tc>
+        <w:tc>
+          <w:tcPr>
+            <w:tcW w:type="dxa" w:w="5443"/>
+          </w:tcPr>
+          <w:p>
+            <w:pPr>
+              <w:spacing w:after="20"/>
+            </w:pPr>
+            <w:r/>
+            <w:r>
+              <w:rPr>
+                <w:b w:val="0"/>
+                <w:sz w:val="19"/>
+              </w:rPr>
+              <w:t>Quyết định dòng này có nhận log giờ hay phiếu chi không</w:t>
+            </w:r>
+          </w:p>
+        </w:tc>
+      </w:tr>
+    </w:tbl>
+    <w:p>
+      <w:pPr>
+        <w:spacing w:after="40"/>
+      </w:pPr>
+    </w:p>
+    <w:tbl>
+      <w:tblPr>
+        <w:tblStyle w:val="TableGrid"/>
+        <w:tblW w:type="auto" w:w="0"/>
+        <w:tblLook w:firstColumn="1" w:firstRow="1" w:lastColumn="0" w:lastRow="0" w:noHBand="0" w:noVBand="1" w:val="04A0"/>
+      </w:tblPr>
+      <w:tblGrid>
+        <w:gridCol w:w="9638"/>
+      </w:tblGrid>
+      <w:tr>
+        <w:tc>
+          <w:tcPr>
+            <w:tcW w:type="dxa" w:w="9638"/>
+            <w:shd w:val="clear" w:fill="EEF0FE"/>
+          </w:tcPr>
+          <w:p>
+            <w:pPr>
+              <w:spacing w:after="60" w:before="60"/>
+            </w:pPr>
+            <w:r/>
+            <w:r>
+              <w:rPr>
+                <w:sz w:val="19"/>
+              </w:rPr>
+              <w:t>Tên dòng giá TÁCH khỏi loại dịch vụ chính là để bán được nhiều mức giá cho cùng một loại lao động.</w:t>
+            </w:r>
+          </w:p>
+        </w:tc>
+      </w:tr>
+    </w:tbl>
+    <w:p>
+      <w:pPr>
+        <w:spacing w:after="40"/>
+      </w:pPr>
+    </w:p>
+    <w:p>
+      <w:r>
+        <w:br w:type="page"/>
+      </w:r>
+    </w:p>
+    <w:p>
+      <w:pPr>
+        <w:pStyle w:val="Heading2"/>
+      </w:pPr>
+      <w:r>
+        <w:t>13.6 Thêm mức giá vốn</w:t>
+      </w:r>
+    </w:p>
+    <w:p>
+      <w:pPr>
+        <w:jc w:val="center"/>
+      </w:pPr>
+      <w:r>
+        <w:drawing>
+          <wp:inline xmlns:a="http://schemas.openxmlformats.org/drawingml/2006/main" xmlns:pic="http://schemas.openxmlformats.org/drawingml/2006/picture">
+            <wp:extent cx="5903999" cy="3739199"/>
+            <wp:docPr id="23" name="Picture 23"/>
+            <wp:cNvGraphicFramePr>
+              <a:graphicFrameLocks noChangeAspect="1"/>
+            </wp:cNvGraphicFramePr>
+            <a:graphic>
+              <a:graphicData uri="http://schemas.openxmlformats.org/drawingml/2006/picture">
+                <pic:pic>
+                  <pic:nvPicPr>
+                    <pic:cNvPr id="0" name="m06-them-muc-gia-von.png"/>
+                    <pic:cNvPicPr/>
+                  </pic:nvPicPr>
+                  <pic:blipFill>
+                    <a:blip r:embed="rId30"/>
+                    <a:stretch>
+                      <a:fillRect/>
+                    </a:stretch>
+                  </pic:blipFill>
+                  <pic:spPr>
+                    <a:xfrm>
+                      <a:off x="0" y="0"/>
+                      <a:ext cx="5903999" cy="3739199"/>
+                    </a:xfrm>
+                    <a:prstGeom prst="rect"/>
+                  </pic:spPr>
+                </pic:pic>
+              </a:graphicData>
+            </a:graphic>
+          </wp:inline>
+        </w:drawing>
+      </w:r>
+    </w:p>
+    <w:p>
+      <w:pPr>
+        <w:spacing w:after="240"/>
+        <w:jc w:val="center"/>
+      </w:pPr>
+      <w:r>
+        <w:rPr>
+          <w:i/>
+          <w:color w:val="6B6B80"/>
+          <w:sz w:val="18"/>
+        </w:rPr>
+        <w:t>Hình 23 — Hộp thoại thêm mức giá vốn</w:t>
+      </w:r>
+    </w:p>
+    <w:tbl>
+      <w:tblPr>
+        <w:tblStyle w:val="TableGrid"/>
+        <w:tblW w:type="auto" w:w="0"/>
+        <w:jc w:val="center"/>
+        <w:tblLook w:firstColumn="1" w:firstRow="1" w:lastColumn="0" w:lastRow="0" w:noHBand="0" w:noVBand="1" w:val="04A0"/>
+      </w:tblPr>
+      <w:tblGrid>
+        <w:gridCol w:w="3213"/>
+        <w:gridCol w:w="3213"/>
+        <w:gridCol w:w="3213"/>
+      </w:tblGrid>
+      <w:tr>
+        <w:tc>
+          <w:tcPr>
+            <w:tcW w:type="dxa" w:w="2608"/>
+            <w:shd w:val="clear" w:fill="5B3DF5"/>
+          </w:tcPr>
+          <w:p>
+            <w:pPr>
+              <w:spacing w:after="20"/>
+            </w:pPr>
+            <w:r/>
+            <w:r>
+              <w:rPr>
+                <w:b/>
+                <w:color w:val="FFFFFF"/>
+                <w:sz w:val="19"/>
+              </w:rPr>
+              <w:t>Trường</w:t>
+            </w:r>
+          </w:p>
+        </w:tc>
+        <w:tc>
+          <w:tcPr>
+            <w:tcW w:type="dxa" w:w="1247"/>
+            <w:shd w:val="clear" w:fill="5B3DF5"/>
+          </w:tcPr>
+          <w:p>
+            <w:pPr>
+              <w:spacing w:after="20"/>
+            </w:pPr>
+            <w:r/>
+            <w:r>
+              <w:rPr>
+                <w:b/>
+                <w:color w:val="FFFFFF"/>
+                <w:sz w:val="19"/>
+              </w:rPr>
+              <w:t>Bắt buộc</w:t>
+            </w:r>
+          </w:p>
+        </w:tc>
+        <w:tc>
+          <w:tcPr>
+            <w:tcW w:type="dxa" w:w="5443"/>
+            <w:shd w:val="clear" w:fill="5B3DF5"/>
+          </w:tcPr>
+          <w:p>
+            <w:pPr>
+              <w:spacing w:after="20"/>
+            </w:pPr>
+            <w:r/>
+            <w:r>
+              <w:rPr>
+                <w:b/>
+                <w:color w:val="FFFFFF"/>
+                <w:sz w:val="19"/>
+              </w:rPr>
+              <w:t>Nhập gì</w:t>
+            </w:r>
+          </w:p>
+        </w:tc>
+      </w:tr>
+      <w:tr>
+        <w:tc>
+          <w:tcPr>
+            <w:tcW w:type="dxa" w:w="2608"/>
+          </w:tcPr>
+          <w:p>
+            <w:pPr>
+              <w:spacing w:after="20"/>
+            </w:pPr>
+            <w:r/>
+            <w:r>
+              <w:rPr>
+                <w:b w:val="0"/>
+                <w:sz w:val="19"/>
+              </w:rPr>
+              <w:t>Kỳ lương</w:t>
+            </w:r>
+          </w:p>
+        </w:tc>
+        <w:tc>
+          <w:tcPr>
+            <w:tcW w:type="dxa" w:w="1247"/>
+          </w:tcPr>
+          <w:p>
+            <w:pPr>
+              <w:spacing w:after="20"/>
+            </w:pPr>
+            <w:r/>
+          </w:p>
+        </w:tc>
+        <w:tc>
+          <w:tcPr>
+            <w:tcW w:type="dxa" w:w="5443"/>
+          </w:tcPr>
+          <w:p>
+            <w:pPr>
+              <w:spacing w:after="20"/>
+            </w:pPr>
+            <w:r/>
+            <w:r>
+              <w:rPr>
+                <w:b w:val="0"/>
+                <w:sz w:val="19"/>
+              </w:rPr>
+              <w:t>Theo giờ / tuần / hai tuần / tháng / năm</w:t>
+            </w:r>
+          </w:p>
+        </w:tc>
+      </w:tr>
+      <w:tr>
+        <w:tc>
+          <w:tcPr>
+            <w:tcW w:type="dxa" w:w="2608"/>
+          </w:tcPr>
+          <w:p>
+            <w:pPr>
+              <w:spacing w:after="20"/>
+            </w:pPr>
+            <w:r/>
+            <w:r>
+              <w:rPr>
+                <w:b w:val="0"/>
+                <w:sz w:val="19"/>
+              </w:rPr>
+              <w:t>Số tiền</w:t>
+            </w:r>
+          </w:p>
+        </w:tc>
+        <w:tc>
+          <w:tcPr>
+            <w:tcW w:type="dxa" w:w="1247"/>
+          </w:tcPr>
+          <w:p>
+            <w:pPr>
+              <w:spacing w:after="20"/>
+            </w:pPr>
+            <w:r/>
+            <w:r>
+              <w:rPr>
+                <w:b w:val="0"/>
+                <w:sz w:val="19"/>
+              </w:rPr>
+              <w:t>✱</w:t>
+            </w:r>
+          </w:p>
+        </w:tc>
+        <w:tc>
+          <w:tcPr>
+            <w:tcW w:type="dxa" w:w="5443"/>
+          </w:tcPr>
+          <w:p>
+            <w:pPr>
+              <w:spacing w:after="20"/>
+            </w:pPr>
+            <w:r/>
+            <w:r>
+              <w:rPr>
+                <w:b w:val="0"/>
+                <w:sz w:val="19"/>
+              </w:rPr>
+              <w:t>Lương của trọn một kỳ, chưa chia giờ</w:t>
+            </w:r>
+          </w:p>
+        </w:tc>
+      </w:tr>
+      <w:tr>
+        <w:tc>
+          <w:tcPr>
+            <w:tcW w:type="dxa" w:w="2608"/>
+          </w:tcPr>
+          <w:p>
+            <w:pPr>
+              <w:spacing w:after="20"/>
+            </w:pPr>
+            <w:r/>
+            <w:r>
+              <w:rPr>
+                <w:b w:val="0"/>
+                <w:sz w:val="19"/>
+              </w:rPr>
+              <w:t>Tiền tệ</w:t>
+            </w:r>
+          </w:p>
+        </w:tc>
+        <w:tc>
+          <w:tcPr>
+            <w:tcW w:type="dxa" w:w="1247"/>
+          </w:tcPr>
+          <w:p>
+            <w:pPr>
+              <w:spacing w:after="20"/>
+            </w:pPr>
+            <w:r/>
+          </w:p>
+        </w:tc>
+        <w:tc>
+          <w:tcPr>
+            <w:tcW w:type="dxa" w:w="5443"/>
+          </w:tcPr>
+          <w:p>
+            <w:pPr>
+              <w:spacing w:after="20"/>
+            </w:pPr>
+            <w:r/>
+            <w:r>
+              <w:rPr>
+                <w:b w:val="0"/>
+                <w:sz w:val="19"/>
+              </w:rPr>
+              <w:t>VND, USD, EUR</w:t>
+            </w:r>
+          </w:p>
+        </w:tc>
+      </w:tr>
+      <w:tr>
+        <w:tc>
+          <w:tcPr>
+            <w:tcW w:type="dxa" w:w="2608"/>
+          </w:tcPr>
+          <w:p>
+            <w:pPr>
+              <w:spacing w:after="20"/>
+            </w:pPr>
+            <w:r/>
+            <w:r>
+              <w:rPr>
+                <w:b w:val="0"/>
+                <w:sz w:val="19"/>
+              </w:rPr>
+              <w:t>Lịch làm việc</w:t>
+            </w:r>
+          </w:p>
+        </w:tc>
+        <w:tc>
+          <w:tcPr>
+            <w:tcW w:type="dxa" w:w="1247"/>
+          </w:tcPr>
+          <w:p>
+            <w:pPr>
+              <w:spacing w:after="20"/>
+            </w:pPr>
+            <w:r/>
+            <w:r>
+              <w:rPr>
+                <w:b w:val="0"/>
+                <w:sz w:val="19"/>
+              </w:rPr>
+              <w:t>✱</w:t>
+            </w:r>
+          </w:p>
+        </w:tc>
+        <w:tc>
+          <w:tcPr>
+            <w:tcW w:type="dxa" w:w="5443"/>
+          </w:tcPr>
+          <w:p>
+            <w:pPr>
+              <w:spacing w:after="20"/>
+            </w:pPr>
+            <w:r/>
+            <w:r>
+              <w:rPr>
+                <w:b w:val="0"/>
+                <w:sz w:val="19"/>
+              </w:rPr>
+              <w:t>Số giờ từng ngày trong tuần. Tổng phải khác 0, hệ thống lấy đây để quy ra giá vốn mỗi giờ</w:t>
+            </w:r>
+          </w:p>
+        </w:tc>
+      </w:tr>
+      <w:tr>
+        <w:tc>
+          <w:tcPr>
+            <w:tcW w:type="dxa" w:w="2608"/>
+          </w:tcPr>
+          <w:p>
+            <w:pPr>
+              <w:spacing w:after="20"/>
+            </w:pPr>
+            <w:r/>
+            <w:r>
+              <w:rPr>
+                <w:b w:val="0"/>
+                <w:sz w:val="19"/>
+              </w:rPr>
+              <w:t>Áp dụng từ</w:t>
+            </w:r>
+          </w:p>
+        </w:tc>
+        <w:tc>
+          <w:tcPr>
+            <w:tcW w:type="dxa" w:w="1247"/>
+          </w:tcPr>
+          <w:p>
+            <w:pPr>
+              <w:spacing w:after="20"/>
+            </w:pPr>
+            <w:r/>
+            <w:r>
+              <w:rPr>
+                <w:b w:val="0"/>
+                <w:sz w:val="19"/>
+              </w:rPr>
+              <w:t>✱</w:t>
+            </w:r>
+          </w:p>
+        </w:tc>
+        <w:tc>
+          <w:tcPr>
+            <w:tcW w:type="dxa" w:w="5443"/>
+          </w:tcPr>
+          <w:p>
+            <w:pPr>
+              <w:spacing w:after="20"/>
+            </w:pPr>
+            <w:r/>
+            <w:r>
+              <w:rPr>
+                <w:b w:val="0"/>
+                <w:sz w:val="19"/>
+              </w:rPr>
+              <w:t>Ngày mức lương này bắt đầu có hiệu lực</w:t>
+            </w:r>
+          </w:p>
+        </w:tc>
+      </w:tr>
+      <w:tr>
+        <w:tc>
+          <w:tcPr>
+            <w:tcW w:type="dxa" w:w="2608"/>
+          </w:tcPr>
+          <w:p>
+            <w:pPr>
+              <w:spacing w:after="20"/>
+            </w:pPr>
+            <w:r/>
+            <w:r>
+              <w:rPr>
+                <w:b w:val="0"/>
+                <w:sz w:val="19"/>
+              </w:rPr>
+              <w:t>Kết thúc</w:t>
+            </w:r>
+          </w:p>
+        </w:tc>
+        <w:tc>
+          <w:tcPr>
+            <w:tcW w:type="dxa" w:w="1247"/>
+          </w:tcPr>
+          <w:p>
+            <w:pPr>
+              <w:spacing w:after="20"/>
+            </w:pPr>
+            <w:r/>
+          </w:p>
+        </w:tc>
+        <w:tc>
+          <w:tcPr>
+            <w:tcW w:type="dxa" w:w="5443"/>
+          </w:tcPr>
+          <w:p>
+            <w:pPr>
+              <w:spacing w:after="20"/>
+            </w:pPr>
+            <w:r/>
+            <w:r>
+              <w:rPr>
+                <w:b w:val="0"/>
+                <w:sz w:val="19"/>
+              </w:rPr>
+              <w:t>Để trống nghĩa là còn hiệu lực đến nay. Điền khi biết trước ngày đổi lương</w:t>
+            </w:r>
+          </w:p>
+        </w:tc>
+      </w:tr>
+      <w:tr>
+        <w:tc>
+          <w:tcPr>
+            <w:tcW w:type="dxa" w:w="2608"/>
+          </w:tcPr>
+          <w:p>
+            <w:pPr>
+              <w:spacing w:after="20"/>
+            </w:pPr>
+            <w:r/>
+            <w:r>
+              <w:rPr>
+                <w:b w:val="0"/>
+                <w:sz w:val="19"/>
+              </w:rPr>
+              <w:t>Cộng chi phí gián tiếp</w:t>
+            </w:r>
+          </w:p>
+        </w:tc>
+        <w:tc>
+          <w:tcPr>
+            <w:tcW w:type="dxa" w:w="1247"/>
+          </w:tcPr>
+          <w:p>
+            <w:pPr>
+              <w:spacing w:after="20"/>
+            </w:pPr>
+            <w:r/>
+          </w:p>
+        </w:tc>
+        <w:tc>
+          <w:tcPr>
+            <w:tcW w:type="dxa" w:w="5443"/>
+          </w:tcPr>
+          <w:p>
+            <w:pPr>
+              <w:spacing w:after="20"/>
+            </w:pPr>
+            <w:r/>
+            <w:r>
+              <w:rPr>
+                <w:b w:val="0"/>
+                <w:sz w:val="19"/>
+              </w:rPr>
+              <w:t>Bật cho nhân viên chính thức. Tắt cho cộng tác viên vì họ không dùng văn phòng, không có bộ phận hỗ trợ</w:t>
+            </w:r>
+          </w:p>
+        </w:tc>
+      </w:tr>
+      <w:tr>
+        <w:tc>
+          <w:tcPr>
+            <w:tcW w:type="dxa" w:w="2608"/>
+          </w:tcPr>
+          <w:p>
+            <w:pPr>
+              <w:spacing w:after="20"/>
+            </w:pPr>
+            <w:r/>
+            <w:r>
+              <w:rPr>
+                <w:b w:val="0"/>
+                <w:sz w:val="19"/>
+              </w:rPr>
+              <w:t>Ghi chú</w:t>
+            </w:r>
+          </w:p>
+        </w:tc>
+        <w:tc>
+          <w:tcPr>
+            <w:tcW w:type="dxa" w:w="1247"/>
+          </w:tcPr>
+          <w:p>
+            <w:pPr>
+              <w:spacing w:after="20"/>
+            </w:pPr>
+            <w:r/>
+          </w:p>
+        </w:tc>
+        <w:tc>
+          <w:tcPr>
+            <w:tcW w:type="dxa" w:w="5443"/>
+          </w:tcPr>
+          <w:p>
+            <w:pPr>
+              <w:spacing w:after="20"/>
+            </w:pPr>
+            <w:r/>
+            <w:r>
+              <w:rPr>
+                <w:b w:val="0"/>
+                <w:sz w:val="19"/>
+              </w:rPr>
+              <w:t>Lý do đổi mức: “Tăng lương giữa năm”, “Lập trình viên cấp cao”</w:t>
+            </w:r>
+          </w:p>
+        </w:tc>
+      </w:tr>
+    </w:tbl>
+    <w:p>
+      <w:pPr>
+        <w:spacing w:after="40"/>
+      </w:pPr>
+    </w:p>
+    <w:tbl>
+      <w:tblPr>
+        <w:tblStyle w:val="TableGrid"/>
+        <w:tblW w:type="auto" w:w="0"/>
+        <w:tblLook w:firstColumn="1" w:firstRow="1" w:lastColumn="0" w:lastRow="0" w:noHBand="0" w:noVBand="1" w:val="04A0"/>
+      </w:tblPr>
+      <w:tblGrid>
+        <w:gridCol w:w="9638"/>
+      </w:tblGrid>
+      <w:tr>
+        <w:tc>
+          <w:tcPr>
+            <w:tcW w:type="dxa" w:w="9638"/>
+            <w:shd w:val="clear" w:fill="EEF0FE"/>
+          </w:tcPr>
+          <w:p>
+            <w:pPr>
+              <w:spacing w:after="60" w:before="60"/>
+            </w:pPr>
+            <w:r/>
+            <w:r>
+              <w:rPr>
+                <w:sz w:val="19"/>
+              </w:rPr>
+              <w:t>Thêm mức mới KHÔNG xoá mức cũ. Hệ thống giữ cả lịch sử, và giờ log ở quá khứ vẫn tính theo mức đang hiệu lực lúc đó.</w:t>
+            </w:r>
+          </w:p>
+        </w:tc>
+      </w:tr>
+    </w:tbl>
+    <w:p>
+      <w:pPr>
+        <w:spacing w:after="40"/>
+      </w:pPr>
+    </w:p>
+    <w:p>
+      <w:r>
+        <w:br w:type="page"/>
+      </w:r>
+    </w:p>
+    <w:p>
+      <w:pPr>
+        <w:pStyle w:val="Heading2"/>
+      </w:pPr>
+      <w:r>
+        <w:t>13.7 Thêm hợp đồng</w:t>
+      </w:r>
+    </w:p>
+    <w:p>
+      <w:pPr>
+        <w:jc w:val="center"/>
+      </w:pPr>
+      <w:r>
+        <w:drawing>
+          <wp:inline xmlns:a="http://schemas.openxmlformats.org/drawingml/2006/main" xmlns:pic="http://schemas.openxmlformats.org/drawingml/2006/picture">
+            <wp:extent cx="5903999" cy="3739199"/>
+            <wp:docPr id="24" name="Picture 24"/>
+            <wp:cNvGraphicFramePr>
+              <a:graphicFrameLocks noChangeAspect="1"/>
+            </wp:cNvGraphicFramePr>
+            <a:graphic>
+              <a:graphicData uri="http://schemas.openxmlformats.org/drawingml/2006/picture">
+                <pic:pic>
+                  <pic:nvPicPr>
+                    <pic:cNvPr id="0" name="m07-them-hop-dong.png"/>
+                    <pic:cNvPicPr/>
+                  </pic:nvPicPr>
+                  <pic:blipFill>
+                    <a:blip r:embed="rId31"/>
+                    <a:stretch>
+                      <a:fillRect/>
+                    </a:stretch>
+                  </pic:blipFill>
+                  <pic:spPr>
+                    <a:xfrm>
+                      <a:off x="0" y="0"/>
+                      <a:ext cx="5903999" cy="3739199"/>
+                    </a:xfrm>
+                    <a:prstGeom prst="rect"/>
+                  </pic:spPr>
+                </pic:pic>
+              </a:graphicData>
+            </a:graphic>
+          </wp:inline>
+        </w:drawing>
+      </w:r>
+    </w:p>
+    <w:p>
+      <w:pPr>
+        <w:spacing w:after="240"/>
+        <w:jc w:val="center"/>
+      </w:pPr>
+      <w:r>
+        <w:rPr>
+          <w:i/>
+          <w:color w:val="6B6B80"/>
+          <w:sz w:val="18"/>
+        </w:rPr>
+        <w:t>Hình 24 — Hộp thoại thêm hợp đồng</w:t>
+      </w:r>
+    </w:p>
+    <w:tbl>
+      <w:tblPr>
+        <w:tblStyle w:val="TableGrid"/>
+        <w:tblW w:type="auto" w:w="0"/>
+        <w:jc w:val="center"/>
+        <w:tblLook w:firstColumn="1" w:firstRow="1" w:lastColumn="0" w:lastRow="0" w:noHBand="0" w:noVBand="1" w:val="04A0"/>
+      </w:tblPr>
+      <w:tblGrid>
+        <w:gridCol w:w="3213"/>
+        <w:gridCol w:w="3213"/>
+        <w:gridCol w:w="3213"/>
+      </w:tblGrid>
+      <w:tr>
+        <w:tc>
+          <w:tcPr>
+            <w:tcW w:type="dxa" w:w="2608"/>
+            <w:shd w:val="clear" w:fill="5B3DF5"/>
+          </w:tcPr>
+          <w:p>
+            <w:pPr>
+              <w:spacing w:after="20"/>
+            </w:pPr>
+            <w:r/>
+            <w:r>
+              <w:rPr>
+                <w:b/>
+                <w:color w:val="FFFFFF"/>
+                <w:sz w:val="19"/>
+              </w:rPr>
+              <w:t>Trường</w:t>
+            </w:r>
+          </w:p>
+        </w:tc>
+        <w:tc>
+          <w:tcPr>
+            <w:tcW w:type="dxa" w:w="1247"/>
+            <w:shd w:val="clear" w:fill="5B3DF5"/>
+          </w:tcPr>
+          <w:p>
+            <w:pPr>
+              <w:spacing w:after="20"/>
+            </w:pPr>
+            <w:r/>
+            <w:r>
+              <w:rPr>
+                <w:b/>
+                <w:color w:val="FFFFFF"/>
+                <w:sz w:val="19"/>
+              </w:rPr>
+              <w:t>Bắt buộc</w:t>
+            </w:r>
+          </w:p>
+        </w:tc>
+        <w:tc>
+          <w:tcPr>
+            <w:tcW w:type="dxa" w:w="5443"/>
+            <w:shd w:val="clear" w:fill="5B3DF5"/>
+          </w:tcPr>
+          <w:p>
+            <w:pPr>
+              <w:spacing w:after="20"/>
+            </w:pPr>
+            <w:r/>
+            <w:r>
+              <w:rPr>
+                <w:b/>
+                <w:color w:val="FFFFFF"/>
+                <w:sz w:val="19"/>
+              </w:rPr>
+              <w:t>Nhập gì</w:t>
+            </w:r>
+          </w:p>
+        </w:tc>
+      </w:tr>
+      <w:tr>
+        <w:tc>
+          <w:tcPr>
+            <w:tcW w:type="dxa" w:w="2608"/>
+          </w:tcPr>
+          <w:p>
+            <w:pPr>
+              <w:spacing w:after="20"/>
+            </w:pPr>
+            <w:r/>
+            <w:r>
+              <w:rPr>
+                <w:b w:val="0"/>
+                <w:sz w:val="19"/>
+              </w:rPr>
+              <w:t>Tên hợp đồng</w:t>
+            </w:r>
+          </w:p>
+        </w:tc>
+        <w:tc>
+          <w:tcPr>
+            <w:tcW w:type="dxa" w:w="1247"/>
+          </w:tcPr>
+          <w:p>
+            <w:pPr>
+              <w:spacing w:after="20"/>
+            </w:pPr>
+            <w:r/>
+            <w:r>
+              <w:rPr>
+                <w:b w:val="0"/>
+                <w:sz w:val="19"/>
+              </w:rPr>
+              <w:t>✱</w:t>
+            </w:r>
+          </w:p>
+        </w:tc>
+        <w:tc>
+          <w:tcPr>
+            <w:tcW w:type="dxa" w:w="5443"/>
+          </w:tcPr>
+          <w:p>
+            <w:pPr>
+              <w:spacing w:after="20"/>
+            </w:pPr>
+            <w:r/>
+            <w:r>
+              <w:rPr>
+                <w:b w:val="0"/>
+                <w:sz w:val="19"/>
+              </w:rPr>
+              <w:t>Ví dụ: Core Banking — Giai đoạn 1</w:t>
+            </w:r>
+          </w:p>
+        </w:tc>
+      </w:tr>
+      <w:tr>
+        <w:tc>
+          <w:tcPr>
+            <w:tcW w:type="dxa" w:w="2608"/>
+          </w:tcPr>
+          <w:p>
+            <w:pPr>
+              <w:spacing w:after="20"/>
+            </w:pPr>
+            <w:r/>
+            <w:r>
+              <w:rPr>
+                <w:b w:val="0"/>
+                <w:sz w:val="19"/>
+              </w:rPr>
+              <w:t>Khách hàng</w:t>
+            </w:r>
+          </w:p>
+        </w:tc>
+        <w:tc>
+          <w:tcPr>
+            <w:tcW w:type="dxa" w:w="1247"/>
+          </w:tcPr>
+          <w:p>
+            <w:pPr>
+              <w:spacing w:after="20"/>
+            </w:pPr>
+            <w:r/>
+            <w:r>
+              <w:rPr>
+                <w:b w:val="0"/>
+                <w:sz w:val="19"/>
+              </w:rPr>
+              <w:t>✱</w:t>
+            </w:r>
+          </w:p>
+        </w:tc>
+        <w:tc>
+          <w:tcPr>
+            <w:tcW w:type="dxa" w:w="5443"/>
+          </w:tcPr>
+          <w:p>
+            <w:pPr>
+              <w:spacing w:after="20"/>
+            </w:pPr>
+            <w:r/>
+            <w:r>
+              <w:rPr>
+                <w:b w:val="0"/>
+                <w:sz w:val="19"/>
+              </w:rPr>
+              <w:t>Quyết định bảng giá nào được áp</w:t>
+            </w:r>
+          </w:p>
+        </w:tc>
+      </w:tr>
+      <w:tr>
+        <w:tc>
+          <w:tcPr>
+            <w:tcW w:type="dxa" w:w="2608"/>
+          </w:tcPr>
+          <w:p>
+            <w:pPr>
+              <w:spacing w:after="20"/>
+            </w:pPr>
+            <w:r/>
+            <w:r>
+              <w:rPr>
+                <w:b w:val="0"/>
+                <w:sz w:val="19"/>
+              </w:rPr>
+              <w:t>Số hợp đồng</w:t>
+            </w:r>
+          </w:p>
+        </w:tc>
+        <w:tc>
+          <w:tcPr>
+            <w:tcW w:type="dxa" w:w="1247"/>
+          </w:tcPr>
+          <w:p>
+            <w:pPr>
+              <w:spacing w:after="20"/>
+            </w:pPr>
+            <w:r/>
+          </w:p>
+        </w:tc>
+        <w:tc>
+          <w:tcPr>
+            <w:tcW w:type="dxa" w:w="5443"/>
+          </w:tcPr>
+          <w:p>
+            <w:pPr>
+              <w:spacing w:after="20"/>
+            </w:pPr>
+            <w:r/>
+            <w:r>
+              <w:rPr>
+                <w:b w:val="0"/>
+                <w:sz w:val="19"/>
+              </w:rPr>
+              <w:t>Mã nội bộ: HD-2026-001</w:t>
+            </w:r>
+          </w:p>
+        </w:tc>
+      </w:tr>
+      <w:tr>
+        <w:tc>
+          <w:tcPr>
+            <w:tcW w:type="dxa" w:w="2608"/>
+          </w:tcPr>
+          <w:p>
+            <w:pPr>
+              <w:spacing w:after="20"/>
+            </w:pPr>
+            <w:r/>
+            <w:r>
+              <w:rPr>
+                <w:b w:val="0"/>
+                <w:sz w:val="19"/>
+              </w:rPr>
+              <w:t>Từ ngày / Đến ngày</w:t>
+            </w:r>
+          </w:p>
+        </w:tc>
+        <w:tc>
+          <w:tcPr>
+            <w:tcW w:type="dxa" w:w="1247"/>
+          </w:tcPr>
+          <w:p>
+            <w:pPr>
+              <w:spacing w:after="20"/>
+            </w:pPr>
+            <w:r/>
+          </w:p>
+        </w:tc>
+        <w:tc>
+          <w:tcPr>
+            <w:tcW w:type="dxa" w:w="5443"/>
+          </w:tcPr>
+          <w:p>
+            <w:pPr>
+              <w:spacing w:after="20"/>
+            </w:pPr>
+            <w:r/>
+            <w:r>
+              <w:rPr>
+                <w:b w:val="0"/>
+                <w:sz w:val="19"/>
+              </w:rPr>
+              <w:t>Khoảng thời gian hợp đồng, dùng để cảnh báo cạn ngân sách</w:t>
+            </w:r>
+          </w:p>
+        </w:tc>
+      </w:tr>
+    </w:tbl>
+    <w:p>
+      <w:pPr>
+        <w:spacing w:after="40"/>
+      </w:pPr>
+    </w:p>
+    <w:p>
+      <w:pPr>
+        <w:pStyle w:val="Heading2"/>
+      </w:pPr>
+      <w:r>
+        <w:t>13.8 Hai đường thêm hạng mục</w:t>
+      </w:r>
+    </w:p>
+    <w:p>
+      <w:r>
+        <w:rPr>
+          <w:b w:val="0"/>
+          <w:i w:val="0"/>
+        </w:rPr>
+        <w:t>Cả hai nút đều nằm dưới từng nhóm trong tab Hạng mục.</w:t>
+      </w:r>
+    </w:p>
+    <w:p>
+      <w:pPr>
+        <w:jc w:val="center"/>
+      </w:pPr>
+      <w:r>
+        <w:drawing>
+          <wp:inline xmlns:a="http://schemas.openxmlformats.org/drawingml/2006/main" xmlns:pic="http://schemas.openxmlformats.org/drawingml/2006/picture">
+            <wp:extent cx="5903999" cy="3739199"/>
+            <wp:docPr id="25" name="Picture 25"/>
+            <wp:cNvGraphicFramePr>
+              <a:graphicFrameLocks noChangeAspect="1"/>
+            </wp:cNvGraphicFramePr>
+            <a:graphic>
+              <a:graphicData uri="http://schemas.openxmlformats.org/drawingml/2006/picture">
+                <pic:pic>
+                  <pic:nvPicPr>
+                    <pic:cNvPr id="0" name="m08-them-hang-muc-trong.png"/>
+                    <pic:cNvPicPr/>
+                  </pic:nvPicPr>
+                  <pic:blipFill>
+                    <a:blip r:embed="rId32"/>
+                    <a:stretch>
+                      <a:fillRect/>
+                    </a:stretch>
+                  </pic:blipFill>
+                  <pic:spPr>
+                    <a:xfrm>
+                      <a:off x="0" y="0"/>
+                      <a:ext cx="5903999" cy="3739199"/>
+                    </a:xfrm>
+                    <a:prstGeom prst="rect"/>
+                  </pic:spPr>
+                </pic:pic>
+              </a:graphicData>
+            </a:graphic>
+          </wp:inline>
+        </w:drawing>
+      </w:r>
+    </w:p>
+    <w:p>
+      <w:pPr>
+        <w:spacing w:after="240"/>
+        <w:jc w:val="center"/>
+      </w:pPr>
+      <w:r>
+        <w:rPr>
+          <w:i/>
+          <w:color w:val="6B6B80"/>
+          <w:sz w:val="18"/>
+        </w:rPr>
+        <w:t>Hình 25 — Hạng mục mới, nhập tay từ đầu</w:t>
+      </w:r>
+    </w:p>
+    <w:tbl>
+      <w:tblPr>
+        <w:tblStyle w:val="TableGrid"/>
+        <w:tblW w:type="auto" w:w="0"/>
+        <w:jc w:val="center"/>
+        <w:tblLook w:firstColumn="1" w:firstRow="1" w:lastColumn="0" w:lastRow="0" w:noHBand="0" w:noVBand="1" w:val="04A0"/>
+      </w:tblPr>
+      <w:tblGrid>
+        <w:gridCol w:w="3213"/>
+        <w:gridCol w:w="3213"/>
+        <w:gridCol w:w="3213"/>
+      </w:tblGrid>
+      <w:tr>
+        <w:tc>
+          <w:tcPr>
+            <w:tcW w:type="dxa" w:w="2608"/>
+            <w:shd w:val="clear" w:fill="5B3DF5"/>
+          </w:tcPr>
+          <w:p>
+            <w:pPr>
+              <w:spacing w:after="20"/>
+            </w:pPr>
+            <w:r/>
+            <w:r>
+              <w:rPr>
+                <w:b/>
+                <w:color w:val="FFFFFF"/>
+                <w:sz w:val="19"/>
+              </w:rPr>
+              <w:t>Trường</w:t>
+            </w:r>
+          </w:p>
+        </w:tc>
+        <w:tc>
+          <w:tcPr>
+            <w:tcW w:type="dxa" w:w="1247"/>
+            <w:shd w:val="clear" w:fill="5B3DF5"/>
+          </w:tcPr>
+          <w:p>
+            <w:pPr>
+              <w:spacing w:after="20"/>
+            </w:pPr>
+            <w:r/>
+            <w:r>
+              <w:rPr>
+                <w:b/>
+                <w:color w:val="FFFFFF"/>
+                <w:sz w:val="19"/>
+              </w:rPr>
+              <w:t>Bắt buộc</w:t>
+            </w:r>
+          </w:p>
+        </w:tc>
+        <w:tc>
+          <w:tcPr>
+            <w:tcW w:type="dxa" w:w="5443"/>
+            <w:shd w:val="clear" w:fill="5B3DF5"/>
+          </w:tcPr>
+          <w:p>
+            <w:pPr>
+              <w:spacing w:after="20"/>
+            </w:pPr>
+            <w:r/>
+            <w:r>
+              <w:rPr>
+                <w:b/>
+                <w:color w:val="FFFFFF"/>
+                <w:sz w:val="19"/>
+              </w:rPr>
+              <w:t>Nhập gì</w:t>
+            </w:r>
+          </w:p>
+        </w:tc>
+      </w:tr>
+      <w:tr>
+        <w:tc>
+          <w:tcPr>
+            <w:tcW w:type="dxa" w:w="2608"/>
+          </w:tcPr>
+          <w:p>
+            <w:pPr>
+              <w:spacing w:after="20"/>
+            </w:pPr>
+            <w:r/>
+            <w:r>
+              <w:rPr>
+                <w:b w:val="0"/>
+                <w:sz w:val="19"/>
+              </w:rPr>
+              <w:t>Tên hạng mục</w:t>
+            </w:r>
+          </w:p>
+        </w:tc>
+        <w:tc>
+          <w:tcPr>
+            <w:tcW w:type="dxa" w:w="1247"/>
+          </w:tcPr>
+          <w:p>
+            <w:pPr>
+              <w:spacing w:after="20"/>
+            </w:pPr>
+            <w:r/>
+            <w:r>
+              <w:rPr>
+                <w:b w:val="0"/>
+                <w:sz w:val="19"/>
+              </w:rPr>
+              <w:t>✱</w:t>
+            </w:r>
+          </w:p>
+        </w:tc>
+        <w:tc>
+          <w:tcPr>
+            <w:tcW w:type="dxa" w:w="5443"/>
+          </w:tcPr>
+          <w:p>
+            <w:pPr>
+              <w:spacing w:after="20"/>
+            </w:pPr>
+            <w:r/>
+            <w:r>
+              <w:rPr>
+                <w:b w:val="0"/>
+                <w:sz w:val="19"/>
+              </w:rPr>
+              <w:t>Việc cụ thể bán cho khách</w:t>
+            </w:r>
+          </w:p>
+        </w:tc>
+      </w:tr>
+      <w:tr>
+        <w:tc>
+          <w:tcPr>
+            <w:tcW w:type="dxa" w:w="2608"/>
+          </w:tcPr>
+          <w:p>
+            <w:pPr>
+              <w:spacing w:after="20"/>
+            </w:pPr>
+            <w:r/>
+            <w:r>
+              <w:rPr>
+                <w:b w:val="0"/>
+                <w:sz w:val="19"/>
+              </w:rPr>
+              <w:t>Loại dịch vụ</w:t>
+            </w:r>
+          </w:p>
+        </w:tc>
+        <w:tc>
+          <w:tcPr>
+            <w:tcW w:type="dxa" w:w="1247"/>
+          </w:tcPr>
+          <w:p>
+            <w:pPr>
+              <w:spacing w:after="20"/>
+            </w:pPr>
+            <w:r/>
+            <w:r>
+              <w:rPr>
+                <w:b w:val="0"/>
+                <w:sz w:val="19"/>
+              </w:rPr>
+              <w:t>✱</w:t>
+            </w:r>
+          </w:p>
+        </w:tc>
+        <w:tc>
+          <w:tcPr>
+            <w:tcW w:type="dxa" w:w="5443"/>
+          </w:tcPr>
+          <w:p>
+            <w:pPr>
+              <w:spacing w:after="20"/>
+            </w:pPr>
+            <w:r/>
+            <w:r>
+              <w:rPr>
+                <w:b w:val="0"/>
+                <w:sz w:val="19"/>
+              </w:rPr>
+              <w:t>Để gộp báo cáo theo mảng</w:t>
+            </w:r>
+          </w:p>
+        </w:tc>
+      </w:tr>
+      <w:tr>
+        <w:tc>
+          <w:tcPr>
+            <w:tcW w:type="dxa" w:w="2608"/>
+          </w:tcPr>
+          <w:p>
+            <w:pPr>
+              <w:spacing w:after="20"/>
+            </w:pPr>
+            <w:r/>
+            <w:r>
+              <w:rPr>
+                <w:b w:val="0"/>
+                <w:sz w:val="19"/>
+              </w:rPr>
+              <w:t>Cách tính tiền</w:t>
+            </w:r>
+          </w:p>
+        </w:tc>
+        <w:tc>
+          <w:tcPr>
+            <w:tcW w:type="dxa" w:w="1247"/>
+          </w:tcPr>
+          <w:p>
+            <w:pPr>
+              <w:spacing w:after="20"/>
+            </w:pPr>
+            <w:r/>
+          </w:p>
+        </w:tc>
+        <w:tc>
+          <w:tcPr>
+            <w:tcW w:type="dxa" w:w="5443"/>
+          </w:tcPr>
+          <w:p>
+            <w:pPr>
+              <w:spacing w:after="20"/>
+            </w:pPr>
+            <w:r/>
+            <w:r>
+              <w:rPr>
+                <w:b w:val="0"/>
+                <w:sz w:val="19"/>
+              </w:rPr>
+              <w:t>Bốn kiểu, xem mục 6.3</w:t>
+            </w:r>
+          </w:p>
+        </w:tc>
+      </w:tr>
+      <w:tr>
+        <w:tc>
+          <w:tcPr>
+            <w:tcW w:type="dxa" w:w="2608"/>
+          </w:tcPr>
+          <w:p>
+            <w:pPr>
+              <w:spacing w:after="20"/>
+            </w:pPr>
+            <w:r/>
+            <w:r>
+              <w:rPr>
+                <w:b w:val="0"/>
+                <w:sz w:val="19"/>
+              </w:rPr>
+              <w:t>Số lượng / Tỷ lệ</w:t>
+            </w:r>
+          </w:p>
+        </w:tc>
+        <w:tc>
+          <w:tcPr>
+            <w:tcW w:type="dxa" w:w="1247"/>
+          </w:tcPr>
+          <w:p>
+            <w:pPr>
+              <w:spacing w:after="20"/>
+            </w:pPr>
+            <w:r/>
+            <w:r>
+              <w:rPr>
+                <w:b w:val="0"/>
+                <w:sz w:val="19"/>
+              </w:rPr>
+              <w:t>✱</w:t>
+            </w:r>
+          </w:p>
+        </w:tc>
+        <w:tc>
+          <w:tcPr>
+            <w:tcW w:type="dxa" w:w="5443"/>
+          </w:tcPr>
+          <w:p>
+            <w:pPr>
+              <w:spacing w:after="20"/>
+            </w:pPr>
+            <w:r/>
+            <w:r>
+              <w:rPr>
+                <w:b w:val="0"/>
+                <w:sz w:val="19"/>
+              </w:rPr>
+              <w:t>Kiểu Phần trăm thì ô này là tỷ lệ %</w:t>
+            </w:r>
+          </w:p>
+        </w:tc>
+      </w:tr>
+      <w:tr>
+        <w:tc>
+          <w:tcPr>
+            <w:tcW w:type="dxa" w:w="2608"/>
+          </w:tcPr>
+          <w:p>
+            <w:pPr>
+              <w:spacing w:after="20"/>
+            </w:pPr>
+            <w:r/>
+            <w:r>
+              <w:rPr>
+                <w:b w:val="0"/>
+                <w:sz w:val="19"/>
+              </w:rPr>
+              <w:t>Đơn vị, Đơn giá</w:t>
+            </w:r>
+          </w:p>
+        </w:tc>
+        <w:tc>
+          <w:tcPr>
+            <w:tcW w:type="dxa" w:w="1247"/>
+          </w:tcPr>
+          <w:p>
+            <w:pPr>
+              <w:spacing w:after="20"/>
+            </w:pPr>
+            <w:r/>
+            <w:r>
+              <w:rPr>
+                <w:b w:val="0"/>
+                <w:sz w:val="19"/>
+              </w:rPr>
+              <w:t>✱</w:t>
+            </w:r>
+          </w:p>
+        </w:tc>
+        <w:tc>
+          <w:tcPr>
+            <w:tcW w:type="dxa" w:w="5443"/>
+          </w:tcPr>
+          <w:p>
+            <w:pPr>
+              <w:spacing w:after="20"/>
+            </w:pPr>
+            <w:r/>
+            <w:r>
+              <w:rPr>
+                <w:b w:val="0"/>
+                <w:sz w:val="19"/>
+              </w:rPr>
+              <w:t>Ẩn khi chọn kiểu Phần trăm</w:t>
+            </w:r>
+          </w:p>
+        </w:tc>
+      </w:tr>
+      <w:tr>
+        <w:tc>
+          <w:tcPr>
+            <w:tcW w:type="dxa" w:w="2608"/>
+          </w:tcPr>
+          <w:p>
+            <w:pPr>
+              <w:spacing w:after="20"/>
+            </w:pPr>
+            <w:r/>
+            <w:r>
+              <w:rPr>
+                <w:b w:val="0"/>
+                <w:sz w:val="19"/>
+              </w:rPr>
+              <w:t>Giờ dự kiến</w:t>
+            </w:r>
+          </w:p>
+        </w:tc>
+        <w:tc>
+          <w:tcPr>
+            <w:tcW w:type="dxa" w:w="1247"/>
+          </w:tcPr>
+          <w:p>
+            <w:pPr>
+              <w:spacing w:after="20"/>
+            </w:pPr>
+            <w:r/>
+          </w:p>
+        </w:tc>
+        <w:tc>
+          <w:tcPr>
+            <w:tcW w:type="dxa" w:w="5443"/>
+          </w:tcPr>
+          <w:p>
+            <w:pPr>
+              <w:spacing w:after="20"/>
+            </w:pPr>
+            <w:r/>
+            <w:r>
+              <w:rPr>
+                <w:b w:val="0"/>
+                <w:sz w:val="19"/>
+              </w:rPr>
+              <w:t>Để trống thì lấy bằng số lượng</w:t>
+            </w:r>
+          </w:p>
+        </w:tc>
+      </w:tr>
+      <w:tr>
+        <w:tc>
+          <w:tcPr>
+            <w:tcW w:type="dxa" w:w="2608"/>
+          </w:tcPr>
+          <w:p>
+            <w:pPr>
+              <w:spacing w:after="20"/>
+            </w:pPr>
+            <w:r/>
+            <w:r>
+              <w:rPr>
+                <w:b w:val="0"/>
+                <w:sz w:val="19"/>
+              </w:rPr>
+              <w:t>Cho ghi giờ / chi phí</w:t>
+            </w:r>
+          </w:p>
+        </w:tc>
+        <w:tc>
+          <w:tcPr>
+            <w:tcW w:type="dxa" w:w="1247"/>
+          </w:tcPr>
+          <w:p>
+            <w:pPr>
+              <w:spacing w:after="20"/>
+            </w:pPr>
+            <w:r/>
+          </w:p>
+        </w:tc>
+        <w:tc>
+          <w:tcPr>
+            <w:tcW w:type="dxa" w:w="5443"/>
+          </w:tcPr>
+          <w:p>
+            <w:pPr>
+              <w:spacing w:after="20"/>
+            </w:pPr>
+            <w:r/>
+            <w:r>
+              <w:rPr>
+                <w:b w:val="0"/>
+                <w:sz w:val="19"/>
+              </w:rPr>
+              <w:t>Bật tắt được lại sau bằng hai icon trên bảng</w:t>
+            </w:r>
+          </w:p>
+        </w:tc>
+      </w:tr>
+    </w:tbl>
+    <w:p>
+      <w:pPr>
+        <w:spacing w:after="40"/>
+      </w:pPr>
+    </w:p>
+    <w:tbl>
+      <w:tblPr>
+        <w:tblStyle w:val="TableGrid"/>
+        <w:tblW w:type="auto" w:w="0"/>
+        <w:tblLook w:firstColumn="1" w:firstRow="1" w:lastColumn="0" w:lastRow="0" w:noHBand="0" w:noVBand="1" w:val="04A0"/>
+      </w:tblPr>
+      <w:tblGrid>
+        <w:gridCol w:w="9638"/>
+      </w:tblGrid>
+      <w:tr>
+        <w:tc>
+          <w:tcPr>
+            <w:tcW w:type="dxa" w:w="9638"/>
+            <w:shd w:val="clear" w:fill="EEF0FE"/>
+          </w:tcPr>
+          <w:p>
+            <w:pPr>
+              <w:spacing w:after="60" w:before="60"/>
+            </w:pPr>
+            <w:r/>
+            <w:r>
+              <w:rPr>
+                <w:sz w:val="19"/>
+              </w:rPr>
+              <w:t>Dùng khi có khoản thoả thuận riêng không nằm trong biểu giá chuẩn.</w:t>
+            </w:r>
+          </w:p>
+        </w:tc>
+      </w:tr>
+    </w:tbl>
+    <w:p>
+      <w:pPr>
+        <w:spacing w:after="40"/>
+      </w:pPr>
+    </w:p>
+    <w:p>
+      <w:pPr>
+        <w:jc w:val="center"/>
+      </w:pPr>
+      <w:r>
+        <w:drawing>
+          <wp:inline xmlns:a="http://schemas.openxmlformats.org/drawingml/2006/main" xmlns:pic="http://schemas.openxmlformats.org/drawingml/2006/picture">
+            <wp:extent cx="5903999" cy="3739199"/>
+            <wp:docPr id="26" name="Picture 26"/>
+            <wp:cNvGraphicFramePr>
+              <a:graphicFrameLocks noChangeAspect="1"/>
+            </wp:cNvGraphicFramePr>
+            <a:graphic>
+              <a:graphicData uri="http://schemas.openxmlformats.org/drawingml/2006/picture">
+                <pic:pic>
+                  <pic:nvPicPr>
+                    <pic:cNvPr id="0" name="m09-rut-tu-bang-gia.png"/>
+                    <pic:cNvPicPr/>
+                  </pic:nvPicPr>
+                  <pic:blipFill>
+                    <a:blip r:embed="rId33"/>
+                    <a:stretch>
+                      <a:fillRect/>
+                    </a:stretch>
+                  </pic:blipFill>
+                  <pic:spPr>
+                    <a:xfrm>
+                      <a:off x="0" y="0"/>
+                      <a:ext cx="5903999" cy="3739199"/>
+                    </a:xfrm>
+                    <a:prstGeom prst="rect"/>
+                  </pic:spPr>
+                </pic:pic>
+              </a:graphicData>
+            </a:graphic>
+          </wp:inline>
+        </w:drawing>
+      </w:r>
+    </w:p>
+    <w:p>
+      <w:pPr>
+        <w:spacing w:after="240"/>
+        <w:jc w:val="center"/>
+      </w:pPr>
+      <w:r>
+        <w:rPr>
+          <w:i/>
+          <w:color w:val="6B6B80"/>
+          <w:sz w:val="18"/>
+        </w:rPr>
+        <w:t>Hình 26 — Rút từ bảng giá</w:t>
+      </w:r>
+    </w:p>
+    <w:p>
+      <w:r>
+        <w:rPr>
+          <w:b w:val="0"/>
+          <w:i w:val="0"/>
+        </w:rPr>
+        <w:t>Chọn một dòng giá có sẵn, hệ thống điền trước đơn giá và cách tính. Chỉ cần nhập số lượng.</w:t>
+      </w:r>
+    </w:p>
+    <w:tbl>
+      <w:tblPr>
+        <w:tblStyle w:val="TableGrid"/>
+        <w:tblW w:type="auto" w:w="0"/>
+        <w:tblLook w:firstColumn="1" w:firstRow="1" w:lastColumn="0" w:lastRow="0" w:noHBand="0" w:noVBand="1" w:val="04A0"/>
+      </w:tblPr>
+      <w:tblGrid>
+        <w:gridCol w:w="9638"/>
+      </w:tblGrid>
+      <w:tr>
+        <w:tc>
+          <w:tcPr>
+            <w:tcW w:type="dxa" w:w="9638"/>
+            <w:shd w:val="clear" w:fill="EEF0FE"/>
+          </w:tcPr>
+          <w:p>
+            <w:pPr>
+              <w:spacing w:after="60" w:before="60"/>
+            </w:pPr>
+            <w:r/>
+            <w:r>
+              <w:rPr>
+                <w:sz w:val="19"/>
+              </w:rPr>
+              <w:t>Đây là đường nên dùng khi giá đã đàm phán và ghi trong bảng giá — tránh gõ lại sai số.</w:t>
+            </w:r>
+          </w:p>
+        </w:tc>
+      </w:tr>
+    </w:tbl>
+    <w:p>
+      <w:pPr>
+        <w:spacing w:after="40"/>
+      </w:pPr>
+    </w:p>
+    <w:p>
+      <w:r>
+        <w:br w:type="page"/>
+      </w:r>
+    </w:p>
+    <w:p>
+      <w:pPr>
+        <w:pStyle w:val="Heading2"/>
+      </w:pPr>
+      <w:r>
+        <w:t>13.9 Ghi nhận giờ</w:t>
+      </w:r>
+    </w:p>
+    <w:p>
+      <w:pPr>
+        <w:jc w:val="center"/>
+      </w:pPr>
+      <w:r>
+        <w:drawing>
+          <wp:inline xmlns:a="http://schemas.openxmlformats.org/drawingml/2006/main" xmlns:pic="http://schemas.openxmlformats.org/drawingml/2006/picture">
+            <wp:extent cx="5903999" cy="3739199"/>
+            <wp:docPr id="27" name="Picture 27"/>
+            <wp:cNvGraphicFramePr>
+              <a:graphicFrameLocks noChangeAspect="1"/>
+            </wp:cNvGraphicFramePr>
+            <a:graphic>
+              <a:graphicData uri="http://schemas.openxmlformats.org/drawingml/2006/picture">
+                <pic:pic>
+                  <pic:nvPicPr>
+                    <pic:cNvPr id="0" name="m10-ghi-nhan-gio.png"/>
+                    <pic:cNvPicPr/>
+                  </pic:nvPicPr>
+                  <pic:blipFill>
+                    <a:blip r:embed="rId34"/>
+                    <a:stretch>
+                      <a:fillRect/>
+                    </a:stretch>
+                  </pic:blipFill>
+                  <pic:spPr>
+                    <a:xfrm>
+                      <a:off x="0" y="0"/>
+                      <a:ext cx="5903999" cy="3739199"/>
+                    </a:xfrm>
+                    <a:prstGeom prst="rect"/>
+                  </pic:spPr>
+                </pic:pic>
+              </a:graphicData>
+            </a:graphic>
+          </wp:inline>
+        </w:drawing>
+      </w:r>
+    </w:p>
+    <w:p>
+      <w:pPr>
+        <w:spacing w:after="240"/>
+        <w:jc w:val="center"/>
+      </w:pPr>
+      <w:r>
+        <w:rPr>
+          <w:i/>
+          <w:color w:val="6B6B80"/>
+          <w:sz w:val="18"/>
+        </w:rPr>
+        <w:t>Hình 27 — Hộp thoại ghi giờ</w:t>
+      </w:r>
+    </w:p>
+    <w:tbl>
+      <w:tblPr>
+        <w:tblStyle w:val="TableGrid"/>
+        <w:tblW w:type="auto" w:w="0"/>
+        <w:jc w:val="center"/>
+        <w:tblLook w:firstColumn="1" w:firstRow="1" w:lastColumn="0" w:lastRow="0" w:noHBand="0" w:noVBand="1" w:val="04A0"/>
+      </w:tblPr>
+      <w:tblGrid>
+        <w:gridCol w:w="3213"/>
+        <w:gridCol w:w="3213"/>
+        <w:gridCol w:w="3213"/>
+      </w:tblGrid>
+      <w:tr>
+        <w:tc>
+          <w:tcPr>
+            <w:tcW w:type="dxa" w:w="2608"/>
+            <w:shd w:val="clear" w:fill="5B3DF5"/>
+          </w:tcPr>
+          <w:p>
+            <w:pPr>
+              <w:spacing w:after="20"/>
+            </w:pPr>
+            <w:r/>
+            <w:r>
+              <w:rPr>
+                <w:b/>
+                <w:color w:val="FFFFFF"/>
+                <w:sz w:val="19"/>
+              </w:rPr>
+              <w:t>Trường</w:t>
+            </w:r>
+          </w:p>
+        </w:tc>
+        <w:tc>
+          <w:tcPr>
+            <w:tcW w:type="dxa" w:w="1247"/>
+            <w:shd w:val="clear" w:fill="5B3DF5"/>
+          </w:tcPr>
+          <w:p>
+            <w:pPr>
+              <w:spacing w:after="20"/>
+            </w:pPr>
+            <w:r/>
+            <w:r>
+              <w:rPr>
+                <w:b/>
+                <w:color w:val="FFFFFF"/>
+                <w:sz w:val="19"/>
+              </w:rPr>
+              <w:t>Bắt buộc</w:t>
+            </w:r>
+          </w:p>
+        </w:tc>
+        <w:tc>
+          <w:tcPr>
+            <w:tcW w:type="dxa" w:w="5443"/>
+            <w:shd w:val="clear" w:fill="5B3DF5"/>
+          </w:tcPr>
+          <w:p>
+            <w:pPr>
+              <w:spacing w:after="20"/>
+            </w:pPr>
+            <w:r/>
+            <w:r>
+              <w:rPr>
+                <w:b/>
+                <w:color w:val="FFFFFF"/>
+                <w:sz w:val="19"/>
+              </w:rPr>
+              <w:t>Nhập gì</w:t>
+            </w:r>
+          </w:p>
+        </w:tc>
+      </w:tr>
+      <w:tr>
+        <w:tc>
+          <w:tcPr>
+            <w:tcW w:type="dxa" w:w="2608"/>
+          </w:tcPr>
+          <w:p>
+            <w:pPr>
+              <w:spacing w:after="20"/>
+            </w:pPr>
+            <w:r/>
+            <w:r>
+              <w:rPr>
+                <w:b w:val="0"/>
+                <w:sz w:val="19"/>
+              </w:rPr>
+              <w:t>Hạng mục</w:t>
+            </w:r>
+          </w:p>
+        </w:tc>
+        <w:tc>
+          <w:tcPr>
+            <w:tcW w:type="dxa" w:w="1247"/>
+          </w:tcPr>
+          <w:p>
+            <w:pPr>
+              <w:spacing w:after="20"/>
+            </w:pPr>
+            <w:r/>
+            <w:r>
+              <w:rPr>
+                <w:b w:val="0"/>
+                <w:sz w:val="19"/>
+              </w:rPr>
+              <w:t>✱</w:t>
+            </w:r>
+          </w:p>
+        </w:tc>
+        <w:tc>
+          <w:tcPr>
+            <w:tcW w:type="dxa" w:w="5443"/>
+          </w:tcPr>
+          <w:p>
+            <w:pPr>
+              <w:spacing w:after="20"/>
+            </w:pPr>
+            <w:r/>
+            <w:r>
+              <w:rPr>
+                <w:b w:val="0"/>
+                <w:sz w:val="19"/>
+              </w:rPr>
+              <w:t>Chỉ hiện hạng mục đang bật “cho ghi giờ”</w:t>
+            </w:r>
+          </w:p>
+        </w:tc>
+      </w:tr>
+      <w:tr>
+        <w:tc>
+          <w:tcPr>
+            <w:tcW w:type="dxa" w:w="2608"/>
+          </w:tcPr>
+          <w:p>
+            <w:pPr>
+              <w:spacing w:after="20"/>
+            </w:pPr>
+            <w:r/>
+            <w:r>
+              <w:rPr>
+                <w:b w:val="0"/>
+                <w:sz w:val="19"/>
+              </w:rPr>
+              <w:t>Ngày</w:t>
+            </w:r>
+          </w:p>
+        </w:tc>
+        <w:tc>
+          <w:tcPr>
+            <w:tcW w:type="dxa" w:w="1247"/>
+          </w:tcPr>
+          <w:p>
+            <w:pPr>
+              <w:spacing w:after="20"/>
+            </w:pPr>
+            <w:r/>
+            <w:r>
+              <w:rPr>
+                <w:b w:val="0"/>
+                <w:sz w:val="19"/>
+              </w:rPr>
+              <w:t>✱</w:t>
+            </w:r>
+          </w:p>
+        </w:tc>
+        <w:tc>
+          <w:tcPr>
+            <w:tcW w:type="dxa" w:w="5443"/>
+          </w:tcPr>
+          <w:p>
+            <w:pPr>
+              <w:spacing w:after="20"/>
+            </w:pPr>
+            <w:r/>
+            <w:r>
+              <w:rPr>
+                <w:b w:val="0"/>
+                <w:sz w:val="19"/>
+              </w:rPr>
+              <w:t>Mặc định hôm nay</w:t>
+            </w:r>
+          </w:p>
+        </w:tc>
+      </w:tr>
+      <w:tr>
+        <w:tc>
+          <w:tcPr>
+            <w:tcW w:type="dxa" w:w="2608"/>
+          </w:tcPr>
+          <w:p>
+            <w:pPr>
+              <w:spacing w:after="20"/>
+            </w:pPr>
+            <w:r/>
+            <w:r>
+              <w:rPr>
+                <w:b w:val="0"/>
+                <w:sz w:val="19"/>
+              </w:rPr>
+              <w:t>Thời lượng</w:t>
+            </w:r>
+          </w:p>
+        </w:tc>
+        <w:tc>
+          <w:tcPr>
+            <w:tcW w:type="dxa" w:w="1247"/>
+          </w:tcPr>
+          <w:p>
+            <w:pPr>
+              <w:spacing w:after="20"/>
+            </w:pPr>
+            <w:r/>
+            <w:r>
+              <w:rPr>
+                <w:b w:val="0"/>
+                <w:sz w:val="19"/>
+              </w:rPr>
+              <w:t>✱</w:t>
+            </w:r>
+          </w:p>
+        </w:tc>
+        <w:tc>
+          <w:tcPr>
+            <w:tcW w:type="dxa" w:w="5443"/>
+          </w:tcPr>
+          <w:p>
+            <w:pPr>
+              <w:spacing w:after="20"/>
+            </w:pPr>
+            <w:r/>
+            <w:r>
+              <w:rPr>
+                <w:b w:val="0"/>
+                <w:sz w:val="19"/>
+              </w:rPr>
+              <w:t>Ba cách nhập: 2h30 · 9-5 · 150 — xem mục 7.2</w:t>
+            </w:r>
+          </w:p>
+        </w:tc>
+      </w:tr>
+      <w:tr>
+        <w:tc>
+          <w:tcPr>
+            <w:tcW w:type="dxa" w:w="2608"/>
+          </w:tcPr>
+          <w:p>
+            <w:pPr>
+              <w:spacing w:after="20"/>
+            </w:pPr>
+            <w:r/>
+            <w:r>
+              <w:rPr>
+                <w:b w:val="0"/>
+                <w:sz w:val="19"/>
+              </w:rPr>
+              <w:t>Ghi chú</w:t>
+            </w:r>
+          </w:p>
+        </w:tc>
+        <w:tc>
+          <w:tcPr>
+            <w:tcW w:type="dxa" w:w="1247"/>
+          </w:tcPr>
+          <w:p>
+            <w:pPr>
+              <w:spacing w:after="20"/>
+            </w:pPr>
+            <w:r/>
+          </w:p>
+        </w:tc>
+        <w:tc>
+          <w:tcPr>
+            <w:tcW w:type="dxa" w:w="5443"/>
+          </w:tcPr>
+          <w:p>
+            <w:pPr>
+              <w:spacing w:after="20"/>
+            </w:pPr>
+            <w:r/>
+            <w:r>
+              <w:rPr>
+                <w:b w:val="0"/>
+                <w:sz w:val="19"/>
+              </w:rPr>
+              <w:t>Mô tả ngắn việc đã làm, hiện trong báo cáo</w:t>
+            </w:r>
+          </w:p>
+        </w:tc>
+      </w:tr>
+    </w:tbl>
+    <w:p>
+      <w:pPr>
+        <w:spacing w:after="40"/>
+      </w:pPr>
+    </w:p>
+    <w:p>
+      <w:pPr>
+        <w:pStyle w:val="Heading2"/>
+      </w:pPr>
+      <w:r>
+        <w:t>13.10 Sửa dòng giờ đã ghi</w:t>
+      </w:r>
+    </w:p>
+    <w:p>
+      <w:pPr>
+        <w:jc w:val="center"/>
+      </w:pPr>
+      <w:r>
+        <w:drawing>
+          <wp:inline xmlns:a="http://schemas.openxmlformats.org/drawingml/2006/main" xmlns:pic="http://schemas.openxmlformats.org/drawingml/2006/picture">
+            <wp:extent cx="5903999" cy="3739199"/>
+            <wp:docPr id="28" name="Picture 28"/>
+            <wp:cNvGraphicFramePr>
+              <a:graphicFrameLocks noChangeAspect="1"/>
+            </wp:cNvGraphicFramePr>
+            <a:graphic>
+              <a:graphicData uri="http://schemas.openxmlformats.org/drawingml/2006/picture">
+                <pic:pic>
+                  <pic:nvPicPr>
+                    <pic:cNvPr id="0" name="m11-sua-dong-gio.png"/>
+                    <pic:cNvPicPr/>
+                  </pic:nvPicPr>
+                  <pic:blipFill>
+                    <a:blip r:embed="rId35"/>
+                    <a:stretch>
+                      <a:fillRect/>
+                    </a:stretch>
+                  </pic:blipFill>
+                  <pic:spPr>
+                    <a:xfrm>
+                      <a:off x="0" y="0"/>
+                      <a:ext cx="5903999" cy="3739199"/>
+                    </a:xfrm>
+                    <a:prstGeom prst="rect"/>
+                  </pic:spPr>
+                </pic:pic>
+              </a:graphicData>
+            </a:graphic>
+          </wp:inline>
+        </w:drawing>
+      </w:r>
+    </w:p>
+    <w:p>
+      <w:pPr>
+        <w:spacing w:after="240"/>
+        <w:jc w:val="center"/>
+      </w:pPr>
+      <w:r>
+        <w:rPr>
+          <w:i/>
+          <w:color w:val="6B6B80"/>
+          <w:sz w:val="18"/>
+        </w:rPr>
+        <w:t>Hình 28 — Hộp thoại sửa dòng giờ</w:t>
+      </w:r>
+    </w:p>
+    <w:p>
+      <w:r>
+        <w:rPr>
+          <w:b w:val="0"/>
+          <w:i w:val="0"/>
+        </w:rPr>
+        <w:t>Mở từ menu ba chấm ở màn Giờ của tôi, hoặc nút bút chì ở màn Giờ toàn công ty và trong chi tiết công việc.</w:t>
+      </w:r>
+    </w:p>
+    <w:tbl>
+      <w:tblPr>
+        <w:tblStyle w:val="TableGrid"/>
+        <w:tblW w:type="auto" w:w="0"/>
+        <w:jc w:val="center"/>
+        <w:tblLook w:firstColumn="1" w:firstRow="1" w:lastColumn="0" w:lastRow="0" w:noHBand="0" w:noVBand="1" w:val="04A0"/>
+      </w:tblPr>
+      <w:tblGrid>
+        <w:gridCol w:w="4819"/>
+        <w:gridCol w:w="4819"/>
+      </w:tblGrid>
+      <w:tr>
+        <w:tc>
+          <w:tcPr>
+            <w:tcW w:type="dxa" w:w="2268"/>
+            <w:shd w:val="clear" w:fill="5B3DF5"/>
+          </w:tcPr>
+          <w:p>
+            <w:pPr>
+              <w:spacing w:after="20"/>
+            </w:pPr>
+            <w:r/>
+            <w:r>
+              <w:rPr>
+                <w:b/>
+                <w:color w:val="FFFFFF"/>
+                <w:sz w:val="19"/>
+              </w:rPr>
+              <w:t>Sửa được</w:t>
+            </w:r>
+          </w:p>
+        </w:tc>
+        <w:tc>
+          <w:tcPr>
+            <w:tcW w:type="dxa" w:w="7030"/>
+            <w:shd w:val="clear" w:fill="5B3DF5"/>
+          </w:tcPr>
+          <w:p>
+            <w:pPr>
+              <w:spacing w:after="20"/>
+            </w:pPr>
+            <w:r/>
+            <w:r>
+              <w:rPr>
+                <w:b/>
+                <w:color w:val="FFFFFF"/>
+                <w:sz w:val="19"/>
+              </w:rPr>
+              <w:t>Lưu ý</w:t>
+            </w:r>
+          </w:p>
+        </w:tc>
+      </w:tr>
+      <w:tr>
+        <w:tc>
+          <w:tcPr>
+            <w:tcW w:type="dxa" w:w="2268"/>
+          </w:tcPr>
+          <w:p>
+            <w:pPr>
+              <w:spacing w:after="20"/>
+            </w:pPr>
+            <w:r/>
+            <w:r>
+              <w:rPr>
+                <w:b w:val="0"/>
+                <w:sz w:val="19"/>
+              </w:rPr>
+              <w:t>Hạng mục</w:t>
+            </w:r>
+          </w:p>
+        </w:tc>
+        <w:tc>
+          <w:tcPr>
+            <w:tcW w:type="dxa" w:w="7030"/>
+          </w:tcPr>
+          <w:p>
+            <w:pPr>
+              <w:spacing w:after="20"/>
+            </w:pPr>
+            <w:r/>
+            <w:r>
+              <w:rPr>
+                <w:b w:val="0"/>
+                <w:sz w:val="19"/>
+              </w:rPr>
+              <w:t>Đổi hạng mục thì chi phí được TÍNH LẠI theo giá vốn của hợp đồng mới</w:t>
+            </w:r>
+          </w:p>
+        </w:tc>
+      </w:tr>
+      <w:tr>
+        <w:tc>
+          <w:tcPr>
+            <w:tcW w:type="dxa" w:w="2268"/>
+          </w:tcPr>
+          <w:p>
+            <w:pPr>
+              <w:spacing w:after="20"/>
+            </w:pPr>
+            <w:r/>
+            <w:r>
+              <w:rPr>
+                <w:b w:val="0"/>
+                <w:sz w:val="19"/>
+              </w:rPr>
+              <w:t>Ngày</w:t>
+            </w:r>
+          </w:p>
+        </w:tc>
+        <w:tc>
+          <w:tcPr>
+            <w:tcW w:type="dxa" w:w="7030"/>
+          </w:tcPr>
+          <w:p>
+            <w:pPr>
+              <w:spacing w:after="20"/>
+            </w:pPr>
+            <w:r/>
+            <w:r>
+              <w:rPr>
+                <w:b w:val="0"/>
+                <w:sz w:val="19"/>
+              </w:rPr>
+              <w:t>Chuyển dòng giờ sang ngày khác</w:t>
+            </w:r>
+          </w:p>
+        </w:tc>
+      </w:tr>
+      <w:tr>
+        <w:tc>
+          <w:tcPr>
+            <w:tcW w:type="dxa" w:w="2268"/>
+          </w:tcPr>
+          <w:p>
+            <w:pPr>
+              <w:spacing w:after="20"/>
+            </w:pPr>
+            <w:r/>
+            <w:r>
+              <w:rPr>
+                <w:b w:val="0"/>
+                <w:sz w:val="19"/>
+              </w:rPr>
+              <w:t>Thời lượng</w:t>
+            </w:r>
+          </w:p>
+        </w:tc>
+        <w:tc>
+          <w:tcPr>
+            <w:tcW w:type="dxa" w:w="7030"/>
+          </w:tcPr>
+          <w:p>
+            <w:pPr>
+              <w:spacing w:after="20"/>
+            </w:pPr>
+            <w:r/>
+            <w:r>
+              <w:rPr>
+                <w:b w:val="0"/>
+                <w:sz w:val="19"/>
+              </w:rPr>
+              <w:t>Nhập thời lượng hoặc chuyển sang nhập khoảng giờ</w:t>
+            </w:r>
+          </w:p>
+        </w:tc>
+      </w:tr>
+      <w:tr>
+        <w:tc>
+          <w:tcPr>
+            <w:tcW w:type="dxa" w:w="2268"/>
+          </w:tcPr>
+          <w:p>
+            <w:pPr>
+              <w:spacing w:after="20"/>
+            </w:pPr>
+            <w:r/>
+            <w:r>
+              <w:rPr>
+                <w:b w:val="0"/>
+                <w:sz w:val="19"/>
+              </w:rPr>
+              <w:t>Ghi chú</w:t>
+            </w:r>
+          </w:p>
+        </w:tc>
+        <w:tc>
+          <w:tcPr>
+            <w:tcW w:type="dxa" w:w="7030"/>
+          </w:tcPr>
+          <w:p>
+            <w:pPr>
+              <w:spacing w:after="20"/>
+            </w:pPr>
+            <w:r/>
+            <w:r>
+              <w:rPr>
+                <w:b w:val="0"/>
+                <w:sz w:val="19"/>
+              </w:rPr>
+              <w:t>Sửa tự do</w:t>
+            </w:r>
+          </w:p>
+        </w:tc>
+      </w:tr>
+    </w:tbl>
+    <w:p>
+      <w:pPr>
+        <w:spacing w:after="40"/>
+      </w:pPr>
+    </w:p>
+    <w:tbl>
+      <w:tblPr>
+        <w:tblStyle w:val="TableGrid"/>
+        <w:tblW w:type="auto" w:w="0"/>
+        <w:tblLook w:firstColumn="1" w:firstRow="1" w:lastColumn="0" w:lastRow="0" w:noHBand="0" w:noVBand="1" w:val="04A0"/>
+      </w:tblPr>
+      <w:tblGrid>
+        <w:gridCol w:w="9638"/>
+      </w:tblGrid>
+      <w:tr>
+        <w:tc>
+          <w:tcPr>
+            <w:tcW w:type="dxa" w:w="9638"/>
+            <w:shd w:val="clear" w:fill="FEF6E7"/>
+          </w:tcPr>
+          <w:p>
+            <w:pPr>
+              <w:spacing w:after="60" w:before="60"/>
+            </w:pPr>
+            <w:r/>
+            <w:r>
+              <w:rPr>
+                <w:sz w:val="19"/>
+              </w:rPr>
+              <w:t>Dòng ĐÃ DUYỆT bị khoá, không sửa được. Phải bỏ duyệt trước.</w:t>
+            </w:r>
+          </w:p>
+        </w:tc>
+      </w:tr>
+    </w:tbl>
+    <w:p>
+      <w:pPr>
+        <w:spacing w:after="40"/>
+      </w:pPr>
+    </w:p>
+    <w:p>
+      <w:r>
+        <w:br w:type="page"/>
+      </w:r>
+    </w:p>
+    <w:p>
+      <w:pPr>
+        <w:pStyle w:val="Heading2"/>
+      </w:pPr>
+      <w:r>
+        <w:t>13.11 Thêm chi phí</w:t>
+      </w:r>
+    </w:p>
+    <w:p>
+      <w:pPr>
+        <w:jc w:val="center"/>
+      </w:pPr>
+      <w:r>
+        <w:drawing>
+          <wp:inline xmlns:a="http://schemas.openxmlformats.org/drawingml/2006/main" xmlns:pic="http://schemas.openxmlformats.org/drawingml/2006/picture">
+            <wp:extent cx="5903999" cy="3739199"/>
+            <wp:docPr id="29" name="Picture 29"/>
+            <wp:cNvGraphicFramePr>
+              <a:graphicFrameLocks noChangeAspect="1"/>
+            </wp:cNvGraphicFramePr>
+            <a:graphic>
+              <a:graphicData uri="http://schemas.openxmlformats.org/drawingml/2006/picture">
+                <pic:pic>
+                  <pic:nvPicPr>
+                    <pic:cNvPr id="0" name="m12-them-chi-phi.png"/>
+                    <pic:cNvPicPr/>
+                  </pic:nvPicPr>
+                  <pic:blipFill>
+                    <a:blip r:embed="rId36"/>
+                    <a:stretch>
+                      <a:fillRect/>
+                    </a:stretch>
+                  </pic:blipFill>
+                  <pic:spPr>
+                    <a:xfrm>
+                      <a:off x="0" y="0"/>
+                      <a:ext cx="5903999" cy="3739199"/>
+                    </a:xfrm>
+                    <a:prstGeom prst="rect"/>
+                  </pic:spPr>
+                </pic:pic>
+              </a:graphicData>
+            </a:graphic>
+          </wp:inline>
+        </w:drawing>
+      </w:r>
+    </w:p>
+    <w:p>
+      <w:pPr>
+        <w:spacing w:after="240"/>
+        <w:jc w:val="center"/>
+      </w:pPr>
+      <w:r>
+        <w:rPr>
+          <w:i/>
+          <w:color w:val="6B6B80"/>
+          <w:sz w:val="18"/>
+        </w:rPr>
+        <w:t>Hình 29 — Hộp thoại thêm chi phí</w:t>
+      </w:r>
+    </w:p>
+    <w:tbl>
+      <w:tblPr>
+        <w:tblStyle w:val="TableGrid"/>
+        <w:tblW w:type="auto" w:w="0"/>
+        <w:jc w:val="center"/>
+        <w:tblLook w:firstColumn="1" w:firstRow="1" w:lastColumn="0" w:lastRow="0" w:noHBand="0" w:noVBand="1" w:val="04A0"/>
+      </w:tblPr>
+      <w:tblGrid>
+        <w:gridCol w:w="3213"/>
+        <w:gridCol w:w="3213"/>
+        <w:gridCol w:w="3213"/>
+      </w:tblGrid>
+      <w:tr>
+        <w:tc>
+          <w:tcPr>
+            <w:tcW w:type="dxa" w:w="2608"/>
+            <w:shd w:val="clear" w:fill="5B3DF5"/>
+          </w:tcPr>
+          <w:p>
+            <w:pPr>
+              <w:spacing w:after="20"/>
+            </w:pPr>
+            <w:r/>
+            <w:r>
+              <w:rPr>
+                <w:b/>
+                <w:color w:val="FFFFFF"/>
+                <w:sz w:val="19"/>
+              </w:rPr>
+              <w:t>Trường</w:t>
+            </w:r>
+          </w:p>
+        </w:tc>
+        <w:tc>
+          <w:tcPr>
+            <w:tcW w:type="dxa" w:w="1247"/>
+            <w:shd w:val="clear" w:fill="5B3DF5"/>
+          </w:tcPr>
+          <w:p>
+            <w:pPr>
+              <w:spacing w:after="20"/>
+            </w:pPr>
+            <w:r/>
+            <w:r>
+              <w:rPr>
+                <w:b/>
+                <w:color w:val="FFFFFF"/>
+                <w:sz w:val="19"/>
+              </w:rPr>
+              <w:t>Bắt buộc</w:t>
+            </w:r>
+          </w:p>
+        </w:tc>
+        <w:tc>
+          <w:tcPr>
+            <w:tcW w:type="dxa" w:w="5443"/>
+            <w:shd w:val="clear" w:fill="5B3DF5"/>
+          </w:tcPr>
+          <w:p>
+            <w:pPr>
+              <w:spacing w:after="20"/>
+            </w:pPr>
+            <w:r/>
+            <w:r>
+              <w:rPr>
+                <w:b/>
+                <w:color w:val="FFFFFF"/>
+                <w:sz w:val="19"/>
+              </w:rPr>
+              <w:t>Nhập gì</w:t>
+            </w:r>
+          </w:p>
+        </w:tc>
+      </w:tr>
+      <w:tr>
+        <w:tc>
+          <w:tcPr>
+            <w:tcW w:type="dxa" w:w="2608"/>
+          </w:tcPr>
+          <w:p>
+            <w:pPr>
+              <w:spacing w:after="20"/>
+            </w:pPr>
+            <w:r/>
+            <w:r>
+              <w:rPr>
+                <w:b w:val="0"/>
+                <w:sz w:val="19"/>
+              </w:rPr>
+              <w:t>Người nộp</w:t>
+            </w:r>
+          </w:p>
+        </w:tc>
+        <w:tc>
+          <w:tcPr>
+            <w:tcW w:type="dxa" w:w="1247"/>
+          </w:tcPr>
+          <w:p>
+            <w:pPr>
+              <w:spacing w:after="20"/>
+            </w:pPr>
+            <w:r/>
+            <w:r>
+              <w:rPr>
+                <w:b w:val="0"/>
+                <w:sz w:val="19"/>
+              </w:rPr>
+              <w:t>✱</w:t>
+            </w:r>
+          </w:p>
+        </w:tc>
+        <w:tc>
+          <w:tcPr>
+            <w:tcW w:type="dxa" w:w="5443"/>
+          </w:tcPr>
+          <w:p>
+            <w:pPr>
+              <w:spacing w:after="20"/>
+            </w:pPr>
+            <w:r/>
+            <w:r>
+              <w:rPr>
+                <w:b w:val="0"/>
+                <w:sz w:val="19"/>
+              </w:rPr>
+              <w:t>Ai bỏ tiền ra hoặc ai đứng tên phiếu</w:t>
+            </w:r>
+          </w:p>
+        </w:tc>
+      </w:tr>
+      <w:tr>
+        <w:tc>
+          <w:tcPr>
+            <w:tcW w:type="dxa" w:w="2608"/>
+          </w:tcPr>
+          <w:p>
+            <w:pPr>
+              <w:spacing w:after="20"/>
+            </w:pPr>
+            <w:r/>
+            <w:r>
+              <w:rPr>
+                <w:b w:val="0"/>
+                <w:sz w:val="19"/>
+              </w:rPr>
+              <w:t>Ngày chi</w:t>
+            </w:r>
+          </w:p>
+        </w:tc>
+        <w:tc>
+          <w:tcPr>
+            <w:tcW w:type="dxa" w:w="1247"/>
+          </w:tcPr>
+          <w:p>
+            <w:pPr>
+              <w:spacing w:after="20"/>
+            </w:pPr>
+            <w:r/>
+            <w:r>
+              <w:rPr>
+                <w:b w:val="0"/>
+                <w:sz w:val="19"/>
+              </w:rPr>
+              <w:t>✱</w:t>
+            </w:r>
+          </w:p>
+        </w:tc>
+        <w:tc>
+          <w:tcPr>
+            <w:tcW w:type="dxa" w:w="5443"/>
+          </w:tcPr>
+          <w:p>
+            <w:pPr>
+              <w:spacing w:after="20"/>
+            </w:pPr>
+            <w:r/>
+            <w:r>
+              <w:rPr>
+                <w:b w:val="0"/>
+                <w:sz w:val="19"/>
+              </w:rPr>
+              <w:t>Ngày phát sinh khoản chi</w:t>
+            </w:r>
+          </w:p>
+        </w:tc>
+      </w:tr>
+      <w:tr>
+        <w:tc>
+          <w:tcPr>
+            <w:tcW w:type="dxa" w:w="2608"/>
+          </w:tcPr>
+          <w:p>
+            <w:pPr>
+              <w:spacing w:after="20"/>
+            </w:pPr>
+            <w:r/>
+            <w:r>
+              <w:rPr>
+                <w:b w:val="0"/>
+                <w:sz w:val="19"/>
+              </w:rPr>
+              <w:t>Nhà cung cấp</w:t>
+            </w:r>
+          </w:p>
+        </w:tc>
+        <w:tc>
+          <w:tcPr>
+            <w:tcW w:type="dxa" w:w="1247"/>
+          </w:tcPr>
+          <w:p>
+            <w:pPr>
+              <w:spacing w:after="20"/>
+            </w:pPr>
+            <w:r/>
+          </w:p>
+        </w:tc>
+        <w:tc>
+          <w:tcPr>
+            <w:tcW w:type="dxa" w:w="5443"/>
+          </w:tcPr>
+          <w:p>
+            <w:pPr>
+              <w:spacing w:after="20"/>
+            </w:pPr>
+            <w:r/>
+            <w:r>
+              <w:rPr>
+                <w:b w:val="0"/>
+                <w:sz w:val="19"/>
+              </w:rPr>
+              <w:t>Bên nhận tiền: Oracle Việt Nam, FPT Telecom</w:t>
+            </w:r>
+          </w:p>
+        </w:tc>
+      </w:tr>
+      <w:tr>
+        <w:tc>
+          <w:tcPr>
+            <w:tcW w:type="dxa" w:w="2608"/>
+          </w:tcPr>
+          <w:p>
+            <w:pPr>
+              <w:spacing w:after="20"/>
+            </w:pPr>
+            <w:r/>
+            <w:r>
+              <w:rPr>
+                <w:b w:val="0"/>
+                <w:sz w:val="19"/>
+              </w:rPr>
+              <w:t>Hoàn ứng</w:t>
+            </w:r>
+          </w:p>
+        </w:tc>
+        <w:tc>
+          <w:tcPr>
+            <w:tcW w:type="dxa" w:w="1247"/>
+          </w:tcPr>
+          <w:p>
+            <w:pPr>
+              <w:spacing w:after="20"/>
+            </w:pPr>
+            <w:r/>
+          </w:p>
+        </w:tc>
+        <w:tc>
+          <w:tcPr>
+            <w:tcW w:type="dxa" w:w="5443"/>
+          </w:tcPr>
+          <w:p>
+            <w:pPr>
+              <w:spacing w:after="20"/>
+            </w:pPr>
+            <w:r/>
+            <w:r>
+              <w:rPr>
+                <w:b w:val="0"/>
+                <w:sz w:val="19"/>
+              </w:rPr>
+              <w:t>Có = nhân viên ứng trước, công ty trả lại. Chọn Có thì cột thanh toán đổi nhãn thành Chưa hoàn / Đã hoàn</w:t>
+            </w:r>
+          </w:p>
+        </w:tc>
+      </w:tr>
+      <w:tr>
+        <w:tc>
+          <w:tcPr>
+            <w:tcW w:type="dxa" w:w="2608"/>
+          </w:tcPr>
+          <w:p>
+            <w:pPr>
+              <w:spacing w:after="20"/>
+            </w:pPr>
+            <w:r/>
+            <w:r>
+              <w:rPr>
+                <w:b w:val="0"/>
+                <w:sz w:val="19"/>
+              </w:rPr>
+              <w:t>Hạn thanh toán</w:t>
+            </w:r>
+          </w:p>
+        </w:tc>
+        <w:tc>
+          <w:tcPr>
+            <w:tcW w:type="dxa" w:w="1247"/>
+          </w:tcPr>
+          <w:p>
+            <w:pPr>
+              <w:spacing w:after="20"/>
+            </w:pPr>
+            <w:r/>
+          </w:p>
+        </w:tc>
+        <w:tc>
+          <w:tcPr>
+            <w:tcW w:type="dxa" w:w="5443"/>
+          </w:tcPr>
+          <w:p>
+            <w:pPr>
+              <w:spacing w:after="20"/>
+            </w:pPr>
+            <w:r/>
+            <w:r>
+              <w:rPr>
+                <w:b w:val="0"/>
+                <w:sz w:val="19"/>
+              </w:rPr>
+              <w:t>Ngày phải trả nhà cung cấp</w:t>
+            </w:r>
+          </w:p>
+        </w:tc>
+      </w:tr>
+      <w:tr>
+        <w:tc>
+          <w:tcPr>
+            <w:tcW w:type="dxa" w:w="2608"/>
+          </w:tcPr>
+          <w:p>
+            <w:pPr>
+              <w:spacing w:after="20"/>
+            </w:pPr>
+            <w:r/>
+            <w:r>
+              <w:rPr>
+                <w:b w:val="0"/>
+                <w:sz w:val="19"/>
+              </w:rPr>
+              <w:t>Tiền tệ</w:t>
+            </w:r>
+          </w:p>
+        </w:tc>
+        <w:tc>
+          <w:tcPr>
+            <w:tcW w:type="dxa" w:w="1247"/>
+          </w:tcPr>
+          <w:p>
+            <w:pPr>
+              <w:spacing w:after="20"/>
+            </w:pPr>
+            <w:r/>
+          </w:p>
+        </w:tc>
+        <w:tc>
+          <w:tcPr>
+            <w:tcW w:type="dxa" w:w="5443"/>
+          </w:tcPr>
+          <w:p>
+            <w:pPr>
+              <w:spacing w:after="20"/>
+            </w:pPr>
+            <w:r/>
+            <w:r>
+              <w:rPr>
+                <w:b w:val="0"/>
+                <w:sz w:val="19"/>
+              </w:rPr>
+              <w:t>VND, USD, EUR</w:t>
+            </w:r>
+          </w:p>
+        </w:tc>
+      </w:tr>
+      <w:tr>
+        <w:tc>
+          <w:tcPr>
+            <w:tcW w:type="dxa" w:w="2608"/>
+          </w:tcPr>
+          <w:p>
+            <w:pPr>
+              <w:spacing w:after="20"/>
+            </w:pPr>
+            <w:r/>
+            <w:r>
+              <w:rPr>
+                <w:b w:val="0"/>
+                <w:sz w:val="19"/>
+              </w:rPr>
+              <w:t>Tệp đính kèm</w:t>
+            </w:r>
+          </w:p>
+        </w:tc>
+        <w:tc>
+          <w:tcPr>
+            <w:tcW w:type="dxa" w:w="1247"/>
+          </w:tcPr>
+          <w:p>
+            <w:pPr>
+              <w:spacing w:after="20"/>
+            </w:pPr>
+            <w:r/>
+          </w:p>
+        </w:tc>
+        <w:tc>
+          <w:tcPr>
+            <w:tcW w:type="dxa" w:w="5443"/>
+          </w:tcPr>
+          <w:p>
+            <w:pPr>
+              <w:spacing w:after="20"/>
+            </w:pPr>
+            <w:r/>
+            <w:r>
+              <w:rPr>
+                <w:b w:val="0"/>
+                <w:sz w:val="19"/>
+              </w:rPr>
+              <w:t>Tên file hoá đơn</w:t>
+            </w:r>
+          </w:p>
+        </w:tc>
+      </w:tr>
+      <w:tr>
+        <w:tc>
+          <w:tcPr>
+            <w:tcW w:type="dxa" w:w="2608"/>
+          </w:tcPr>
+          <w:p>
+            <w:pPr>
+              <w:spacing w:after="20"/>
+            </w:pPr>
+            <w:r/>
+            <w:r>
+              <w:rPr>
+                <w:b w:val="0"/>
+                <w:sz w:val="19"/>
+              </w:rPr>
+              <w:t>Hạng mục</w:t>
+            </w:r>
+          </w:p>
+        </w:tc>
+        <w:tc>
+          <w:tcPr>
+            <w:tcW w:type="dxa" w:w="1247"/>
+          </w:tcPr>
+          <w:p>
+            <w:pPr>
+              <w:spacing w:after="20"/>
+            </w:pPr>
+            <w:r/>
+            <w:r>
+              <w:rPr>
+                <w:b w:val="0"/>
+                <w:sz w:val="19"/>
+              </w:rPr>
+              <w:t>✱</w:t>
+            </w:r>
+          </w:p>
+        </w:tc>
+        <w:tc>
+          <w:tcPr>
+            <w:tcW w:type="dxa" w:w="5443"/>
+          </w:tcPr>
+          <w:p>
+            <w:pPr>
+              <w:spacing w:after="20"/>
+            </w:pPr>
+            <w:r/>
+            <w:r>
+              <w:rPr>
+                <w:b w:val="0"/>
+                <w:sz w:val="19"/>
+              </w:rPr>
+              <w:t>Chỉ hiện hạng mục đang bật “cho ghi chi phí”</w:t>
+            </w:r>
+          </w:p>
+        </w:tc>
+      </w:tr>
+      <w:tr>
+        <w:tc>
+          <w:tcPr>
+            <w:tcW w:type="dxa" w:w="2608"/>
+          </w:tcPr>
+          <w:p>
+            <w:pPr>
+              <w:spacing w:after="20"/>
+            </w:pPr>
+            <w:r/>
+            <w:r>
+              <w:rPr>
+                <w:b w:val="0"/>
+                <w:sz w:val="19"/>
+              </w:rPr>
+              <w:t>Nội dung</w:t>
+            </w:r>
+          </w:p>
+        </w:tc>
+        <w:tc>
+          <w:tcPr>
+            <w:tcW w:type="dxa" w:w="1247"/>
+          </w:tcPr>
+          <w:p>
+            <w:pPr>
+              <w:spacing w:after="20"/>
+            </w:pPr>
+            <w:r/>
+            <w:r>
+              <w:rPr>
+                <w:b w:val="0"/>
+                <w:sz w:val="19"/>
+              </w:rPr>
+              <w:t>✱</w:t>
+            </w:r>
+          </w:p>
+        </w:tc>
+        <w:tc>
+          <w:tcPr>
+            <w:tcW w:type="dxa" w:w="5443"/>
+          </w:tcPr>
+          <w:p>
+            <w:pPr>
+              <w:spacing w:after="20"/>
+            </w:pPr>
+            <w:r/>
+            <w:r>
+              <w:rPr>
+                <w:b w:val="0"/>
+                <w:sz w:val="19"/>
+              </w:rPr>
+              <w:t>Mô tả khoản chi, hiện ở cột đầu bảng</w:t>
+            </w:r>
+          </w:p>
+        </w:tc>
+      </w:tr>
+      <w:tr>
+        <w:tc>
+          <w:tcPr>
+            <w:tcW w:type="dxa" w:w="2608"/>
+          </w:tcPr>
+          <w:p>
+            <w:pPr>
+              <w:spacing w:after="20"/>
+            </w:pPr>
+            <w:r/>
+            <w:r>
+              <w:rPr>
+                <w:b w:val="0"/>
+                <w:sz w:val="19"/>
+              </w:rPr>
+              <w:t>Các dòng chi</w:t>
+            </w:r>
+          </w:p>
+        </w:tc>
+        <w:tc>
+          <w:tcPr>
+            <w:tcW w:type="dxa" w:w="1247"/>
+          </w:tcPr>
+          <w:p>
+            <w:pPr>
+              <w:spacing w:after="20"/>
+            </w:pPr>
+            <w:r/>
+            <w:r>
+              <w:rPr>
+                <w:b w:val="0"/>
+                <w:sz w:val="19"/>
+              </w:rPr>
+              <w:t>✱</w:t>
+            </w:r>
+          </w:p>
+        </w:tc>
+        <w:tc>
+          <w:tcPr>
+            <w:tcW w:type="dxa" w:w="5443"/>
+          </w:tcPr>
+          <w:p>
+            <w:pPr>
+              <w:spacing w:after="20"/>
+            </w:pPr>
+            <w:r/>
+            <w:r>
+              <w:rPr>
+                <w:b w:val="0"/>
+                <w:sz w:val="19"/>
+              </w:rPr>
+              <w:t>Một phiếu nhiều dòng: chuyến công tác gồm vé, khách sạn, taxi. Mỗi dòng có đơn giá, số lượng, thuế %</w:t>
+            </w:r>
+          </w:p>
+        </w:tc>
+      </w:tr>
+      <w:tr>
+        <w:tc>
+          <w:tcPr>
+            <w:tcW w:type="dxa" w:w="2608"/>
+          </w:tcPr>
+          <w:p>
+            <w:pPr>
+              <w:spacing w:after="20"/>
+            </w:pPr>
+            <w:r/>
+            <w:r>
+              <w:rPr>
+                <w:b w:val="0"/>
+                <w:sz w:val="19"/>
+              </w:rPr>
+              <w:t>Đơn giá đã gồm thuế</w:t>
+            </w:r>
+          </w:p>
+        </w:tc>
+        <w:tc>
+          <w:tcPr>
+            <w:tcW w:type="dxa" w:w="1247"/>
+          </w:tcPr>
+          <w:p>
+            <w:pPr>
+              <w:spacing w:after="20"/>
+            </w:pPr>
+            <w:r/>
+          </w:p>
+        </w:tc>
+        <w:tc>
+          <w:tcPr>
+            <w:tcW w:type="dxa" w:w="5443"/>
+          </w:tcPr>
+          <w:p>
+            <w:pPr>
+              <w:spacing w:after="20"/>
+            </w:pPr>
+            <w:r/>
+            <w:r>
+              <w:rPr>
+                <w:b w:val="0"/>
+                <w:sz w:val="19"/>
+              </w:rPr>
+              <w:t>Tích khi đơn giá nhập vào đã bao gồm VAT</w:t>
+            </w:r>
+          </w:p>
+        </w:tc>
+      </w:tr>
+      <w:tr>
+        <w:tc>
+          <w:tcPr>
+            <w:tcW w:type="dxa" w:w="2608"/>
+          </w:tcPr>
+          <w:p>
+            <w:pPr>
+              <w:spacing w:after="20"/>
+            </w:pPr>
+            <w:r/>
+            <w:r>
+              <w:rPr>
+                <w:b w:val="0"/>
+                <w:sz w:val="19"/>
+              </w:rPr>
+              <w:t>Phụ giá</w:t>
+            </w:r>
+          </w:p>
+        </w:tc>
+        <w:tc>
+          <w:tcPr>
+            <w:tcW w:type="dxa" w:w="1247"/>
+          </w:tcPr>
+          <w:p>
+            <w:pPr>
+              <w:spacing w:after="20"/>
+            </w:pPr>
+            <w:r/>
+          </w:p>
+        </w:tc>
+        <w:tc>
+          <w:tcPr>
+            <w:tcW w:type="dxa" w:w="5443"/>
+          </w:tcPr>
+          <w:p>
+            <w:pPr>
+              <w:spacing w:after="20"/>
+            </w:pPr>
+            <w:r/>
+            <w:r>
+              <w:rPr>
+                <w:b w:val="0"/>
+                <w:sz w:val="19"/>
+              </w:rPr>
+              <w:t>Phần cộng thêm khi tính lại cho khách. Cộng phần trăm hoặc cộng số tiền cố định</w:t>
+            </w:r>
+          </w:p>
+        </w:tc>
+      </w:tr>
+    </w:tbl>
+    <w:p>
+      <w:pPr>
+        <w:spacing w:after="40"/>
+      </w:pPr>
+    </w:p>
+    <w:tbl>
+      <w:tblPr>
+        <w:tblStyle w:val="TableGrid"/>
+        <w:tblW w:type="auto" w:w="0"/>
+        <w:tblLook w:firstColumn="1" w:firstRow="1" w:lastColumn="0" w:lastRow="0" w:noHBand="0" w:noVBand="1" w:val="04A0"/>
+      </w:tblPr>
+      <w:tblGrid>
+        <w:gridCol w:w="9638"/>
+      </w:tblGrid>
+      <w:tr>
+        <w:tc>
+          <w:tcPr>
+            <w:tcW w:type="dxa" w:w="9638"/>
+            <w:shd w:val="clear" w:fill="EEF0FE"/>
+          </w:tcPr>
+          <w:p>
+            <w:pPr>
+              <w:spacing w:after="60" w:before="60"/>
+            </w:pPr>
+            <w:r/>
+            <w:r>
+              <w:rPr>
+                <w:sz w:val="19"/>
+              </w:rPr>
+              <w:t>Phụ giá tính trên TIỀN TRƯỚC THUẾ, không tính trên tiền đã gồm thuế — xem mục 9.3.</w:t>
             </w:r>
           </w:p>
         </w:tc>

</xml_diff>

<commit_message>
docs: chuyển bảng mô tả thành phần màn hình sang gạch đầu dòng
Lượt trước tôi mới đổi format cho chương 13, còn 12 chương chính vẫn dùng
bảng — nên đọc vẫn thấy y như cũ. Đổi nốt.

Tám bảng dạng "# · Thành phần · Giải thích" nay thành danh sách đánh số, tên
thành phần in đậm rồi gạch ngang rồi mô tả. Số thứ tự giữ nguyên để khớp dấu
đánh trên ảnh chụp màn hình.

Giữ lại các bảng thật sự cần dạng lưới — so sánh hai cột (Giá bán vs Giá vốn,
Số lượng vs Ước tính), ma trận trạng thái ảnh hưởng số liệu, danh mục case dữ
liệu mẫu. Productive cũng dùng bảng cho những chỗ này.

Bảng giảm từ 66 xuống 58.

Co-Authored-By: Claude Opus 5 <noreply@anthropic.com>
</commit_message>
<xml_diff>
--- a/docs/HeyE-Kiem-soat-chi-phi-Huong-dan.docx
+++ b/docs/HeyE-Kiem-soat-chi-phi-Huong-dan.docx
@@ -3674,253 +3674,86 @@
         <w:t>Hình 2 — Danh sách bảng giá</w:t>
       </w:r>
     </w:p>
-    <w:tbl>
-      <w:tblPr>
-        <w:tblStyle w:val="TableGrid"/>
-        <w:tblW w:type="auto" w:w="0"/>
-        <w:jc w:val="center"/>
-        <w:tblLook w:firstColumn="1" w:firstRow="1" w:lastColumn="0" w:lastRow="0" w:noHBand="0" w:noVBand="1" w:val="04A0"/>
-      </w:tblPr>
-      <w:tblGrid>
-        <w:gridCol w:w="3213"/>
-        <w:gridCol w:w="3213"/>
-        <w:gridCol w:w="3213"/>
-      </w:tblGrid>
-      <w:tr>
-        <w:tc>
-          <w:tcPr>
-            <w:tcW w:type="dxa" w:w="567"/>
-            <w:shd w:val="clear" w:fill="5B3DF5"/>
-          </w:tcPr>
-          <w:p>
-            <w:pPr>
-              <w:spacing w:after="20"/>
-            </w:pPr>
-            <w:r/>
-            <w:r>
-              <w:rPr>
-                <w:b/>
-                <w:color w:val="FFFFFF"/>
-                <w:sz w:val="19"/>
-              </w:rPr>
-              <w:t>#</w:t>
-            </w:r>
-          </w:p>
-        </w:tc>
-        <w:tc>
-          <w:tcPr>
-            <w:tcW w:type="dxa" w:w="2494"/>
-            <w:shd w:val="clear" w:fill="5B3DF5"/>
-          </w:tcPr>
-          <w:p>
-            <w:pPr>
-              <w:spacing w:after="20"/>
-            </w:pPr>
-            <w:r/>
-            <w:r>
-              <w:rPr>
-                <w:b/>
-                <w:color w:val="FFFFFF"/>
-                <w:sz w:val="19"/>
-              </w:rPr>
-              <w:t>Thành phần</w:t>
-            </w:r>
-          </w:p>
-        </w:tc>
-        <w:tc>
-          <w:tcPr>
-            <w:tcW w:type="dxa" w:w="6123"/>
-            <w:shd w:val="clear" w:fill="5B3DF5"/>
-          </w:tcPr>
-          <w:p>
-            <w:pPr>
-              <w:spacing w:after="20"/>
-            </w:pPr>
-            <w:r/>
-            <w:r>
-              <w:rPr>
-                <w:b/>
-                <w:color w:val="FFFFFF"/>
-                <w:sz w:val="19"/>
-              </w:rPr>
-              <w:t>Giải thích</w:t>
-            </w:r>
-          </w:p>
-        </w:tc>
-      </w:tr>
-      <w:tr>
-        <w:tc>
-          <w:tcPr>
-            <w:tcW w:type="dxa" w:w="567"/>
-          </w:tcPr>
-          <w:p>
-            <w:pPr>
-              <w:spacing w:after="20"/>
-            </w:pPr>
-            <w:r/>
-            <w:r>
-              <w:rPr>
-                <w:b w:val="0"/>
-                <w:sz w:val="19"/>
-              </w:rPr>
-              <w:t>1</w:t>
-            </w:r>
-          </w:p>
-        </w:tc>
-        <w:tc>
-          <w:tcPr>
-            <w:tcW w:type="dxa" w:w="2494"/>
-          </w:tcPr>
-          <w:p>
-            <w:pPr>
-              <w:spacing w:after="20"/>
-            </w:pPr>
-            <w:r/>
-            <w:r>
-              <w:rPr>
-                <w:b w:val="0"/>
-                <w:sz w:val="19"/>
-              </w:rPr>
-              <w:t>Cột của bảng danh sách</w:t>
-            </w:r>
-          </w:p>
-        </w:tc>
-        <w:tc>
-          <w:tcPr>
-            <w:tcW w:type="dxa" w:w="6123"/>
-          </w:tcPr>
-          <w:p>
-            <w:pPr>
-              <w:spacing w:after="20"/>
-            </w:pPr>
-            <w:r/>
-            <w:r>
-              <w:rPr>
-                <w:b w:val="0"/>
-                <w:sz w:val="19"/>
-              </w:rPr>
-              <w:t>Tên bảng giá · Áp dụng cho khách nào · Số dòng giá · Trạng thái · Ngày tạo</w:t>
-            </w:r>
-          </w:p>
-        </w:tc>
-      </w:tr>
-      <w:tr>
-        <w:tc>
-          <w:tcPr>
-            <w:tcW w:type="dxa" w:w="567"/>
-          </w:tcPr>
-          <w:p>
-            <w:pPr>
-              <w:spacing w:after="20"/>
-            </w:pPr>
-            <w:r/>
-            <w:r>
-              <w:rPr>
-                <w:b w:val="0"/>
-                <w:sz w:val="19"/>
-              </w:rPr>
-              <w:t>2</w:t>
-            </w:r>
-          </w:p>
-        </w:tc>
-        <w:tc>
-          <w:tcPr>
-            <w:tcW w:type="dxa" w:w="2494"/>
-          </w:tcPr>
-          <w:p>
-            <w:pPr>
-              <w:spacing w:after="20"/>
-            </w:pPr>
-            <w:r/>
-            <w:r>
-              <w:rPr>
-                <w:b w:val="0"/>
-                <w:sz w:val="19"/>
-              </w:rPr>
-              <w:t>Một dòng bảng giá</w:t>
-            </w:r>
-          </w:p>
-        </w:tc>
-        <w:tc>
-          <w:tcPr>
-            <w:tcW w:type="dxa" w:w="6123"/>
-          </w:tcPr>
-          <w:p>
-            <w:pPr>
-              <w:spacing w:after="20"/>
-            </w:pPr>
-            <w:r/>
-            <w:r>
-              <w:rPr>
-                <w:b w:val="0"/>
-                <w:sz w:val="19"/>
-              </w:rPr>
-              <w:t>Bấm vào để mở chi tiết. Menu ba chấm bên phải: Đổi tên · Nhân bản · Lưu trữ · Xoá</w:t>
-            </w:r>
-          </w:p>
-        </w:tc>
-      </w:tr>
-      <w:tr>
-        <w:tc>
-          <w:tcPr>
-            <w:tcW w:type="dxa" w:w="567"/>
-          </w:tcPr>
-          <w:p>
-            <w:pPr>
-              <w:spacing w:after="20"/>
-            </w:pPr>
-            <w:r/>
-            <w:r>
-              <w:rPr>
-                <w:b w:val="0"/>
-                <w:sz w:val="19"/>
-              </w:rPr>
-              <w:t>3</w:t>
-            </w:r>
-          </w:p>
-        </w:tc>
-        <w:tc>
-          <w:tcPr>
-            <w:tcW w:type="dxa" w:w="2494"/>
-          </w:tcPr>
-          <w:p>
-            <w:pPr>
-              <w:spacing w:after="20"/>
-            </w:pPr>
-            <w:r/>
-            <w:r>
-              <w:rPr>
-                <w:b w:val="0"/>
-                <w:sz w:val="19"/>
-              </w:rPr>
-              <w:t>Nút Thêm bảng giá</w:t>
-            </w:r>
-          </w:p>
-        </w:tc>
-        <w:tc>
-          <w:tcPr>
-            <w:tcW w:type="dxa" w:w="6123"/>
-          </w:tcPr>
-          <w:p>
-            <w:pPr>
-              <w:spacing w:after="20"/>
-            </w:pPr>
-            <w:r/>
-            <w:r>
-              <w:rPr>
-                <w:b w:val="0"/>
-                <w:sz w:val="19"/>
-              </w:rPr>
-              <w:t>Tạo bảng mới, chọn áp dụng cho khách nào hoặc để trống = chuẩn công ty</w:t>
-            </w:r>
-          </w:p>
-        </w:tc>
-      </w:tr>
-    </w:tbl>
     <w:p>
       <w:pPr>
-        <w:spacing w:after="40"/>
-      </w:pPr>
+        <w:spacing w:after="80"/>
+        <w:ind w:left="340"/>
+      </w:pPr>
+      <w:r>
+        <w:rPr>
+          <w:b/>
+          <w:color w:val="5B3DF5"/>
+          <w:sz w:val="20"/>
+        </w:rPr>
+        <w:t xml:space="preserve">1. </w:t>
+      </w:r>
+      <w:r>
+        <w:rPr>
+          <w:b/>
+          <w:sz w:val="20"/>
+        </w:rPr>
+        <w:t>Cột của bảng danh sách</w:t>
+      </w:r>
+      <w:r>
+        <w:rPr>
+          <w:sz w:val="20"/>
+        </w:rPr>
+        <w:t xml:space="preserve"> — tên bảng giá · Áp dụng cho khách nào · Số dòng giá · Trạng thái · Ngày tạo</w:t>
+      </w:r>
+    </w:p>
+    <w:p>
+      <w:pPr>
+        <w:spacing w:after="80"/>
+        <w:ind w:left="340"/>
+      </w:pPr>
+      <w:r>
+        <w:rPr>
+          <w:b/>
+          <w:color w:val="5B3DF5"/>
+          <w:sz w:val="20"/>
+        </w:rPr>
+        <w:t xml:space="preserve">2. </w:t>
+      </w:r>
+      <w:r>
+        <w:rPr>
+          <w:b/>
+          <w:sz w:val="20"/>
+        </w:rPr>
+        <w:t>Một dòng bảng giá</w:t>
+      </w:r>
+      <w:r>
+        <w:rPr>
+          <w:sz w:val="20"/>
+        </w:rPr>
+        <w:t xml:space="preserve"> — bấm vào để mở chi tiết. Menu ba chấm bên phải: Đổi tên · Nhân bản · Lưu trữ · Xoá</w:t>
+      </w:r>
+    </w:p>
+    <w:p>
+      <w:pPr>
+        <w:spacing w:after="80"/>
+        <w:ind w:left="340"/>
+      </w:pPr>
+      <w:r>
+        <w:rPr>
+          <w:b/>
+          <w:color w:val="5B3DF5"/>
+          <w:sz w:val="20"/>
+        </w:rPr>
+        <w:t xml:space="preserve">3. </w:t>
+      </w:r>
+      <w:r>
+        <w:rPr>
+          <w:b/>
+          <w:sz w:val="20"/>
+        </w:rPr>
+        <w:t>Nút Thêm bảng giá</w:t>
+      </w:r>
+      <w:r>
+        <w:rPr>
+          <w:sz w:val="20"/>
+        </w:rPr>
+        <w:t xml:space="preserve"> — tạo bảng mới, chọn áp dụng cho khách nào hoặc để trống = chuẩn công ty</w:t>
+      </w:r>
     </w:p>
     <w:p>
       <w:pPr>
@@ -4231,197 +4064,59 @@
         <w:t>Hình 3 — Chi tiết một bảng giá</w:t>
       </w:r>
     </w:p>
-    <w:tbl>
-      <w:tblPr>
-        <w:tblStyle w:val="TableGrid"/>
-        <w:tblW w:type="auto" w:w="0"/>
-        <w:jc w:val="center"/>
-        <w:tblLook w:firstColumn="1" w:firstRow="1" w:lastColumn="0" w:lastRow="0" w:noHBand="0" w:noVBand="1" w:val="04A0"/>
-      </w:tblPr>
-      <w:tblGrid>
-        <w:gridCol w:w="3213"/>
-        <w:gridCol w:w="3213"/>
-        <w:gridCol w:w="3213"/>
-      </w:tblGrid>
-      <w:tr>
-        <w:tc>
-          <w:tcPr>
-            <w:tcW w:type="dxa" w:w="567"/>
-            <w:shd w:val="clear" w:fill="5B3DF5"/>
-          </w:tcPr>
-          <w:p>
-            <w:pPr>
-              <w:spacing w:after="20"/>
-            </w:pPr>
-            <w:r/>
-            <w:r>
-              <w:rPr>
-                <w:b/>
-                <w:color w:val="FFFFFF"/>
-                <w:sz w:val="19"/>
-              </w:rPr>
-              <w:t>#</w:t>
-            </w:r>
-          </w:p>
-        </w:tc>
-        <w:tc>
-          <w:tcPr>
-            <w:tcW w:type="dxa" w:w="2494"/>
-            <w:shd w:val="clear" w:fill="5B3DF5"/>
-          </w:tcPr>
-          <w:p>
-            <w:pPr>
-              <w:spacing w:after="20"/>
-            </w:pPr>
-            <w:r/>
-            <w:r>
-              <w:rPr>
-                <w:b/>
-                <w:color w:val="FFFFFF"/>
-                <w:sz w:val="19"/>
-              </w:rPr>
-              <w:t>Thành phần</w:t>
-            </w:r>
-          </w:p>
-        </w:tc>
-        <w:tc>
-          <w:tcPr>
-            <w:tcW w:type="dxa" w:w="6123"/>
-            <w:shd w:val="clear" w:fill="5B3DF5"/>
-          </w:tcPr>
-          <w:p>
-            <w:pPr>
-              <w:spacing w:after="20"/>
-            </w:pPr>
-            <w:r/>
-            <w:r>
-              <w:rPr>
-                <w:b/>
-                <w:color w:val="FFFFFF"/>
-                <w:sz w:val="19"/>
-              </w:rPr>
-              <w:t>Giải thích</w:t>
-            </w:r>
-          </w:p>
-        </w:tc>
-      </w:tr>
-      <w:tr>
-        <w:tc>
-          <w:tcPr>
-            <w:tcW w:type="dxa" w:w="567"/>
-          </w:tcPr>
-          <w:p>
-            <w:pPr>
-              <w:spacing w:after="20"/>
-            </w:pPr>
-            <w:r/>
-            <w:r>
-              <w:rPr>
-                <w:b w:val="0"/>
-                <w:sz w:val="19"/>
-              </w:rPr>
-              <w:t>1</w:t>
-            </w:r>
-          </w:p>
-        </w:tc>
-        <w:tc>
-          <w:tcPr>
-            <w:tcW w:type="dxa" w:w="2494"/>
-          </w:tcPr>
-          <w:p>
-            <w:pPr>
-              <w:spacing w:after="20"/>
-            </w:pPr>
-            <w:r/>
-            <w:r>
-              <w:rPr>
-                <w:b w:val="0"/>
-                <w:sz w:val="19"/>
-              </w:rPr>
-              <w:t>Nút quay lại</w:t>
-            </w:r>
-          </w:p>
-        </w:tc>
-        <w:tc>
-          <w:tcPr>
-            <w:tcW w:type="dxa" w:w="6123"/>
-          </w:tcPr>
-          <w:p>
-            <w:pPr>
-              <w:spacing w:after="20"/>
-            </w:pPr>
-            <w:r/>
-            <w:r>
-              <w:rPr>
-                <w:b w:val="0"/>
-                <w:sz w:val="19"/>
-              </w:rPr>
-              <w:t>Về danh sách bảng giá</w:t>
-            </w:r>
-          </w:p>
-        </w:tc>
-      </w:tr>
-      <w:tr>
-        <w:tc>
-          <w:tcPr>
-            <w:tcW w:type="dxa" w:w="567"/>
-          </w:tcPr>
-          <w:p>
-            <w:pPr>
-              <w:spacing w:after="20"/>
-            </w:pPr>
-            <w:r/>
-            <w:r>
-              <w:rPr>
-                <w:b w:val="0"/>
-                <w:sz w:val="19"/>
-              </w:rPr>
-              <w:t>2</w:t>
-            </w:r>
-          </w:p>
-        </w:tc>
-        <w:tc>
-          <w:tcPr>
-            <w:tcW w:type="dxa" w:w="2494"/>
-          </w:tcPr>
-          <w:p>
-            <w:pPr>
-              <w:spacing w:after="20"/>
-            </w:pPr>
-            <w:r/>
-            <w:r>
-              <w:rPr>
-                <w:b w:val="0"/>
-                <w:sz w:val="19"/>
-              </w:rPr>
-              <w:t>Thêm dòng giá</w:t>
-            </w:r>
-          </w:p>
-        </w:tc>
-        <w:tc>
-          <w:tcPr>
-            <w:tcW w:type="dxa" w:w="6123"/>
-          </w:tcPr>
-          <w:p>
-            <w:pPr>
-              <w:spacing w:after="20"/>
-            </w:pPr>
-            <w:r/>
-            <w:r>
-              <w:rPr>
-                <w:b w:val="0"/>
-                <w:sz w:val="19"/>
-              </w:rPr>
-              <w:t>Mỗi dòng gồm: tên dòng, loại dịch vụ, đơn vị, đơn giá</w:t>
-            </w:r>
-          </w:p>
-        </w:tc>
-      </w:tr>
-    </w:tbl>
     <w:p>
       <w:pPr>
-        <w:spacing w:after="40"/>
-      </w:pPr>
+        <w:spacing w:after="80"/>
+        <w:ind w:left="340"/>
+      </w:pPr>
+      <w:r>
+        <w:rPr>
+          <w:b/>
+          <w:color w:val="5B3DF5"/>
+          <w:sz w:val="20"/>
+        </w:rPr>
+        <w:t xml:space="preserve">1. </w:t>
+      </w:r>
+      <w:r>
+        <w:rPr>
+          <w:b/>
+          <w:sz w:val="20"/>
+        </w:rPr>
+        <w:t>Nút quay lại</w:t>
+      </w:r>
+      <w:r>
+        <w:rPr>
+          <w:sz w:val="20"/>
+        </w:rPr>
+        <w:t xml:space="preserve"> — về danh sách bảng giá</w:t>
+      </w:r>
+    </w:p>
+    <w:p>
+      <w:pPr>
+        <w:spacing w:after="80"/>
+        <w:ind w:left="340"/>
+      </w:pPr>
+      <w:r>
+        <w:rPr>
+          <w:b/>
+          <w:color w:val="5B3DF5"/>
+          <w:sz w:val="20"/>
+        </w:rPr>
+        <w:t xml:space="preserve">2. </w:t>
+      </w:r>
+      <w:r>
+        <w:rPr>
+          <w:b/>
+          <w:sz w:val="20"/>
+        </w:rPr>
+        <w:t>Thêm dòng giá</w:t>
+      </w:r>
+      <w:r>
+        <w:rPr>
+          <w:sz w:val="20"/>
+        </w:rPr>
+        <w:t xml:space="preserve"> — mỗi dòng gồm: tên dòng, loại dịch vụ, đơn vị, đơn giá</w:t>
+      </w:r>
     </w:p>
     <w:p>
       <w:pPr>
@@ -4590,197 +4285,59 @@
         <w:t>Hình 4 — Danh sách giá vốn nhân sự</w:t>
       </w:r>
     </w:p>
-    <w:tbl>
-      <w:tblPr>
-        <w:tblStyle w:val="TableGrid"/>
-        <w:tblW w:type="auto" w:w="0"/>
-        <w:jc w:val="center"/>
-        <w:tblLook w:firstColumn="1" w:firstRow="1" w:lastColumn="0" w:lastRow="0" w:noHBand="0" w:noVBand="1" w:val="04A0"/>
-      </w:tblPr>
-      <w:tblGrid>
-        <w:gridCol w:w="3213"/>
-        <w:gridCol w:w="3213"/>
-        <w:gridCol w:w="3213"/>
-      </w:tblGrid>
-      <w:tr>
-        <w:tc>
-          <w:tcPr>
-            <w:tcW w:type="dxa" w:w="567"/>
-            <w:shd w:val="clear" w:fill="5B3DF5"/>
-          </w:tcPr>
-          <w:p>
-            <w:pPr>
-              <w:spacing w:after="20"/>
-            </w:pPr>
-            <w:r/>
-            <w:r>
-              <w:rPr>
-                <w:b/>
-                <w:color w:val="FFFFFF"/>
-                <w:sz w:val="19"/>
-              </w:rPr>
-              <w:t>#</w:t>
-            </w:r>
-          </w:p>
-        </w:tc>
-        <w:tc>
-          <w:tcPr>
-            <w:tcW w:type="dxa" w:w="2494"/>
-            <w:shd w:val="clear" w:fill="5B3DF5"/>
-          </w:tcPr>
-          <w:p>
-            <w:pPr>
-              <w:spacing w:after="20"/>
-            </w:pPr>
-            <w:r/>
-            <w:r>
-              <w:rPr>
-                <w:b/>
-                <w:color w:val="FFFFFF"/>
-                <w:sz w:val="19"/>
-              </w:rPr>
-              <w:t>Thành phần</w:t>
-            </w:r>
-          </w:p>
-        </w:tc>
-        <w:tc>
-          <w:tcPr>
-            <w:tcW w:type="dxa" w:w="6123"/>
-            <w:shd w:val="clear" w:fill="5B3DF5"/>
-          </w:tcPr>
-          <w:p>
-            <w:pPr>
-              <w:spacing w:after="20"/>
-            </w:pPr>
-            <w:r/>
-            <w:r>
-              <w:rPr>
-                <w:b/>
-                <w:color w:val="FFFFFF"/>
-                <w:sz w:val="19"/>
-              </w:rPr>
-              <w:t>Giải thích</w:t>
-            </w:r>
-          </w:p>
-        </w:tc>
-      </w:tr>
-      <w:tr>
-        <w:tc>
-          <w:tcPr>
-            <w:tcW w:type="dxa" w:w="567"/>
-          </w:tcPr>
-          <w:p>
-            <w:pPr>
-              <w:spacing w:after="20"/>
-            </w:pPr>
-            <w:r/>
-            <w:r>
-              <w:rPr>
-                <w:b w:val="0"/>
-                <w:sz w:val="19"/>
-              </w:rPr>
-              <w:t>1</w:t>
-            </w:r>
-          </w:p>
-        </w:tc>
-        <w:tc>
-          <w:tcPr>
-            <w:tcW w:type="dxa" w:w="2494"/>
-          </w:tcPr>
-          <w:p>
-            <w:pPr>
-              <w:spacing w:after="20"/>
-            </w:pPr>
-            <w:r/>
-            <w:r>
-              <w:rPr>
-                <w:b w:val="0"/>
-                <w:sz w:val="19"/>
-              </w:rPr>
-              <w:t>Cột bảng</w:t>
-            </w:r>
-          </w:p>
-        </w:tc>
-        <w:tc>
-          <w:tcPr>
-            <w:tcW w:type="dxa" w:w="6123"/>
-          </w:tcPr>
-          <w:p>
-            <w:pPr>
-              <w:spacing w:after="20"/>
-            </w:pPr>
-            <w:r/>
-            <w:r>
-              <w:rPr>
-                <w:b w:val="0"/>
-                <w:sz w:val="19"/>
-              </w:rPr>
-              <w:t>Nhân sự · Kỳ lương · Lương kỳ · Giờ mỗi tuần · Giá vốn mỗi giờ</w:t>
-            </w:r>
-          </w:p>
-        </w:tc>
-      </w:tr>
-      <w:tr>
-        <w:tc>
-          <w:tcPr>
-            <w:tcW w:type="dxa" w:w="567"/>
-          </w:tcPr>
-          <w:p>
-            <w:pPr>
-              <w:spacing w:after="20"/>
-            </w:pPr>
-            <w:r/>
-            <w:r>
-              <w:rPr>
-                <w:b w:val="0"/>
-                <w:sz w:val="19"/>
-              </w:rPr>
-              <w:t>2</w:t>
-            </w:r>
-          </w:p>
-        </w:tc>
-        <w:tc>
-          <w:tcPr>
-            <w:tcW w:type="dxa" w:w="2494"/>
-          </w:tcPr>
-          <w:p>
-            <w:pPr>
-              <w:spacing w:after="20"/>
-            </w:pPr>
-            <w:r/>
-            <w:r>
-              <w:rPr>
-                <w:b w:val="0"/>
-                <w:sz w:val="19"/>
-              </w:rPr>
-              <w:t>Ô chi phí gián tiếp</w:t>
-            </w:r>
-          </w:p>
-        </w:tc>
-        <w:tc>
-          <w:tcPr>
-            <w:tcW w:type="dxa" w:w="6123"/>
-          </w:tcPr>
-          <w:p>
-            <w:pPr>
-              <w:spacing w:after="20"/>
-            </w:pPr>
-            <w:r/>
-            <w:r>
-              <w:rPr>
-                <w:b w:val="0"/>
-                <w:sz w:val="19"/>
-              </w:rPr>
-              <w:t>Hiển thị mức phân bổ hiện tại (153.061 đ/giờ), bấm vào để cấu hình</w:t>
-            </w:r>
-          </w:p>
-        </w:tc>
-      </w:tr>
-    </w:tbl>
     <w:p>
       <w:pPr>
-        <w:spacing w:after="40"/>
-      </w:pPr>
+        <w:spacing w:after="80"/>
+        <w:ind w:left="340"/>
+      </w:pPr>
+      <w:r>
+        <w:rPr>
+          <w:b/>
+          <w:color w:val="5B3DF5"/>
+          <w:sz w:val="20"/>
+        </w:rPr>
+        <w:t xml:space="preserve">1. </w:t>
+      </w:r>
+      <w:r>
+        <w:rPr>
+          <w:b/>
+          <w:sz w:val="20"/>
+        </w:rPr>
+        <w:t>Cột bảng</w:t>
+      </w:r>
+      <w:r>
+        <w:rPr>
+          <w:sz w:val="20"/>
+        </w:rPr>
+        <w:t xml:space="preserve"> — nhân sự · Kỳ lương · Lương kỳ · Giờ mỗi tuần · Giá vốn mỗi giờ</w:t>
+      </w:r>
+    </w:p>
+    <w:p>
+      <w:pPr>
+        <w:spacing w:after="80"/>
+        <w:ind w:left="340"/>
+      </w:pPr>
+      <w:r>
+        <w:rPr>
+          <w:b/>
+          <w:color w:val="5B3DF5"/>
+          <w:sz w:val="20"/>
+        </w:rPr>
+        <w:t xml:space="preserve">2. </w:t>
+      </w:r>
+      <w:r>
+        <w:rPr>
+          <w:b/>
+          <w:sz w:val="20"/>
+        </w:rPr>
+        <w:t>Ô chi phí gián tiếp</w:t>
+      </w:r>
+      <w:r>
+        <w:rPr>
+          <w:sz w:val="20"/>
+        </w:rPr>
+        <w:t xml:space="preserve"> — hiển thị mức phân bổ hiện tại (153.061 đ/giờ), bấm vào để cấu hình</w:t>
+      </w:r>
     </w:p>
     <w:p>
       <w:r>
@@ -5212,197 +4769,59 @@
         <w:t>Hình 5 — Chi tiết giá vốn một người</w:t>
       </w:r>
     </w:p>
-    <w:tbl>
-      <w:tblPr>
-        <w:tblStyle w:val="TableGrid"/>
-        <w:tblW w:type="auto" w:w="0"/>
-        <w:jc w:val="center"/>
-        <w:tblLook w:firstColumn="1" w:firstRow="1" w:lastColumn="0" w:lastRow="0" w:noHBand="0" w:noVBand="1" w:val="04A0"/>
-      </w:tblPr>
-      <w:tblGrid>
-        <w:gridCol w:w="3213"/>
-        <w:gridCol w:w="3213"/>
-        <w:gridCol w:w="3213"/>
-      </w:tblGrid>
-      <w:tr>
-        <w:tc>
-          <w:tcPr>
-            <w:tcW w:type="dxa" w:w="567"/>
-            <w:shd w:val="clear" w:fill="5B3DF5"/>
-          </w:tcPr>
-          <w:p>
-            <w:pPr>
-              <w:spacing w:after="20"/>
-            </w:pPr>
-            <w:r/>
-            <w:r>
-              <w:rPr>
-                <w:b/>
-                <w:color w:val="FFFFFF"/>
-                <w:sz w:val="17"/>
-              </w:rPr>
-              <w:t>#</w:t>
-            </w:r>
-          </w:p>
-        </w:tc>
-        <w:tc>
-          <w:tcPr>
-            <w:tcW w:type="dxa" w:w="2494"/>
-            <w:shd w:val="clear" w:fill="5B3DF5"/>
-          </w:tcPr>
-          <w:p>
-            <w:pPr>
-              <w:spacing w:after="20"/>
-            </w:pPr>
-            <w:r/>
-            <w:r>
-              <w:rPr>
-                <w:b/>
-                <w:color w:val="FFFFFF"/>
-                <w:sz w:val="17"/>
-              </w:rPr>
-              <w:t>Thành phần</w:t>
-            </w:r>
-          </w:p>
-        </w:tc>
-        <w:tc>
-          <w:tcPr>
-            <w:tcW w:type="dxa" w:w="6123"/>
-            <w:shd w:val="clear" w:fill="5B3DF5"/>
-          </w:tcPr>
-          <w:p>
-            <w:pPr>
-              <w:spacing w:after="20"/>
-            </w:pPr>
-            <w:r/>
-            <w:r>
-              <w:rPr>
-                <w:b/>
-                <w:color w:val="FFFFFF"/>
-                <w:sz w:val="17"/>
-              </w:rPr>
-              <w:t>Giải thích</w:t>
-            </w:r>
-          </w:p>
-        </w:tc>
-      </w:tr>
-      <w:tr>
-        <w:tc>
-          <w:tcPr>
-            <w:tcW w:type="dxa" w:w="567"/>
-          </w:tcPr>
-          <w:p>
-            <w:pPr>
-              <w:spacing w:after="20"/>
-            </w:pPr>
-            <w:r/>
-            <w:r>
-              <w:rPr>
-                <w:b w:val="0"/>
-                <w:sz w:val="17"/>
-              </w:rPr>
-              <w:t>1</w:t>
-            </w:r>
-          </w:p>
-        </w:tc>
-        <w:tc>
-          <w:tcPr>
-            <w:tcW w:type="dxa" w:w="2494"/>
-          </w:tcPr>
-          <w:p>
-            <w:pPr>
-              <w:spacing w:after="20"/>
-            </w:pPr>
-            <w:r/>
-            <w:r>
-              <w:rPr>
-                <w:b w:val="0"/>
-                <w:sz w:val="17"/>
-              </w:rPr>
-              <w:t>Biểu đồ giá vốn theo thời gian</w:t>
-            </w:r>
-          </w:p>
-        </w:tc>
-        <w:tc>
-          <w:tcPr>
-            <w:tcW w:type="dxa" w:w="6123"/>
-          </w:tcPr>
-          <w:p>
-            <w:pPr>
-              <w:spacing w:after="20"/>
-            </w:pPr>
-            <w:r/>
-            <w:r>
-              <w:rPr>
-                <w:b w:val="0"/>
-                <w:sz w:val="17"/>
-              </w:rPr>
-              <w:t>Vẽ dạng BẬC THANG vì giá vốn đổi đột ngột tại ngày hiệu lực, không tăng dần. Trục dọc không bắt đầu từ 0 để thấy rõ chênh lệch</w:t>
-            </w:r>
-          </w:p>
-        </w:tc>
-      </w:tr>
-      <w:tr>
-        <w:tc>
-          <w:tcPr>
-            <w:tcW w:type="dxa" w:w="567"/>
-          </w:tcPr>
-          <w:p>
-            <w:pPr>
-              <w:spacing w:after="20"/>
-            </w:pPr>
-            <w:r/>
-            <w:r>
-              <w:rPr>
-                <w:b w:val="0"/>
-                <w:sz w:val="17"/>
-              </w:rPr>
-              <w:t>2</w:t>
-            </w:r>
-          </w:p>
-        </w:tc>
-        <w:tc>
-          <w:tcPr>
-            <w:tcW w:type="dxa" w:w="2494"/>
-          </w:tcPr>
-          <w:p>
-            <w:pPr>
-              <w:spacing w:after="20"/>
-            </w:pPr>
-            <w:r/>
-            <w:r>
-              <w:rPr>
-                <w:b w:val="0"/>
-                <w:sz w:val="17"/>
-              </w:rPr>
-              <w:t>Lịch sử mức giá</w:t>
-            </w:r>
-          </w:p>
-        </w:tc>
-        <w:tc>
-          <w:tcPr>
-            <w:tcW w:type="dxa" w:w="6123"/>
-          </w:tcPr>
-          <w:p>
-            <w:pPr>
-              <w:spacing w:after="20"/>
-            </w:pPr>
-            <w:r/>
-            <w:r>
-              <w:rPr>
-                <w:b w:val="0"/>
-                <w:sz w:val="17"/>
-              </w:rPr>
-              <w:t>Mỗi lần tăng lương là một dòng mới. Dòng cũ giữ nguyên, đảm bảo chi phí đã tính của giờ cũ không bị đổi</w:t>
-            </w:r>
-          </w:p>
-        </w:tc>
-      </w:tr>
-    </w:tbl>
     <w:p>
       <w:pPr>
-        <w:spacing w:after="40"/>
-      </w:pPr>
+        <w:spacing w:after="80"/>
+        <w:ind w:left="340"/>
+      </w:pPr>
+      <w:r>
+        <w:rPr>
+          <w:b/>
+          <w:color w:val="5B3DF5"/>
+          <w:sz w:val="20"/>
+        </w:rPr>
+        <w:t xml:space="preserve">1. </w:t>
+      </w:r>
+      <w:r>
+        <w:rPr>
+          <w:b/>
+          <w:sz w:val="20"/>
+        </w:rPr>
+        <w:t>Biểu đồ giá vốn theo thời gian</w:t>
+      </w:r>
+      <w:r>
+        <w:rPr>
+          <w:sz w:val="20"/>
+        </w:rPr>
+        <w:t xml:space="preserve"> — vẽ dạng BẬC THANG vì giá vốn đổi đột ngột tại ngày hiệu lực, không tăng dần. Trục dọc không bắt đầu từ 0 để thấy rõ chênh lệch</w:t>
+      </w:r>
+    </w:p>
+    <w:p>
+      <w:pPr>
+        <w:spacing w:after="80"/>
+        <w:ind w:left="340"/>
+      </w:pPr>
+      <w:r>
+        <w:rPr>
+          <w:b/>
+          <w:color w:val="5B3DF5"/>
+          <w:sz w:val="20"/>
+        </w:rPr>
+        <w:t xml:space="preserve">2. </w:t>
+      </w:r>
+      <w:r>
+        <w:rPr>
+          <w:b/>
+          <w:sz w:val="20"/>
+        </w:rPr>
+        <w:t>Lịch sử mức giá</w:t>
+      </w:r>
+      <w:r>
+        <w:rPr>
+          <w:sz w:val="20"/>
+        </w:rPr>
+        <w:t xml:space="preserve"> — mỗi lần tăng lương là một dòng mới. Dòng cũ giữ nguyên, đảm bảo chi phí đã tính của giờ cũ không bị đổi</w:t>
+      </w:r>
     </w:p>
     <w:p>
       <w:pPr>
@@ -5879,197 +5298,59 @@
         <w:t>Hình 7 — Tab Tổng quan của hợp đồng</w:t>
       </w:r>
     </w:p>
-    <w:tbl>
-      <w:tblPr>
-        <w:tblStyle w:val="TableGrid"/>
-        <w:tblW w:type="auto" w:w="0"/>
-        <w:jc w:val="center"/>
-        <w:tblLook w:firstColumn="1" w:firstRow="1" w:lastColumn="0" w:lastRow="0" w:noHBand="0" w:noVBand="1" w:val="04A0"/>
-      </w:tblPr>
-      <w:tblGrid>
-        <w:gridCol w:w="3213"/>
-        <w:gridCol w:w="3213"/>
-        <w:gridCol w:w="3213"/>
-      </w:tblGrid>
-      <w:tr>
-        <w:tc>
-          <w:tcPr>
-            <w:tcW w:type="dxa" w:w="567"/>
-            <w:shd w:val="clear" w:fill="5B3DF5"/>
-          </w:tcPr>
-          <w:p>
-            <w:pPr>
-              <w:spacing w:after="20"/>
-            </w:pPr>
-            <w:r/>
-            <w:r>
-              <w:rPr>
-                <w:b/>
-                <w:color w:val="FFFFFF"/>
-                <w:sz w:val="19"/>
-              </w:rPr>
-              <w:t>#</w:t>
-            </w:r>
-          </w:p>
-        </w:tc>
-        <w:tc>
-          <w:tcPr>
-            <w:tcW w:type="dxa" w:w="2494"/>
-            <w:shd w:val="clear" w:fill="5B3DF5"/>
-          </w:tcPr>
-          <w:p>
-            <w:pPr>
-              <w:spacing w:after="20"/>
-            </w:pPr>
-            <w:r/>
-            <w:r>
-              <w:rPr>
-                <w:b/>
-                <w:color w:val="FFFFFF"/>
-                <w:sz w:val="19"/>
-              </w:rPr>
-              <w:t>Thành phần</w:t>
-            </w:r>
-          </w:p>
-        </w:tc>
-        <w:tc>
-          <w:tcPr>
-            <w:tcW w:type="dxa" w:w="6123"/>
-            <w:shd w:val="clear" w:fill="5B3DF5"/>
-          </w:tcPr>
-          <w:p>
-            <w:pPr>
-              <w:spacing w:after="20"/>
-            </w:pPr>
-            <w:r/>
-            <w:r>
-              <w:rPr>
-                <w:b/>
-                <w:color w:val="FFFFFF"/>
-                <w:sz w:val="19"/>
-              </w:rPr>
-              <w:t>Giải thích</w:t>
-            </w:r>
-          </w:p>
-        </w:tc>
-      </w:tr>
-      <w:tr>
-        <w:tc>
-          <w:tcPr>
-            <w:tcW w:type="dxa" w:w="567"/>
-          </w:tcPr>
-          <w:p>
-            <w:pPr>
-              <w:spacing w:after="20"/>
-            </w:pPr>
-            <w:r/>
-            <w:r>
-              <w:rPr>
-                <w:b w:val="0"/>
-                <w:sz w:val="19"/>
-              </w:rPr>
-              <w:t>1</w:t>
-            </w:r>
-          </w:p>
-        </w:tc>
-        <w:tc>
-          <w:tcPr>
-            <w:tcW w:type="dxa" w:w="2494"/>
-          </w:tcPr>
-          <w:p>
-            <w:pPr>
-              <w:spacing w:after="20"/>
-            </w:pPr>
-            <w:r/>
-            <w:r>
-              <w:rPr>
-                <w:b w:val="0"/>
-                <w:sz w:val="19"/>
-              </w:rPr>
-              <w:t>Bốn tab bên trong hợp đồng</w:t>
-            </w:r>
-          </w:p>
-        </w:tc>
-        <w:tc>
-          <w:tcPr>
-            <w:tcW w:type="dxa" w:w="6123"/>
-          </w:tcPr>
-          <w:p>
-            <w:pPr>
-              <w:spacing w:after="20"/>
-            </w:pPr>
-            <w:r/>
-            <w:r>
-              <w:rPr>
-                <w:b w:val="0"/>
-                <w:sz w:val="19"/>
-              </w:rPr>
-              <w:t>Tổng quan (Overview) · Hạng mục (Services) · Giờ (Time) · Chi phí (Expenses). Mọi thứ thuộc về hợp đồng đều nằm trong đây</w:t>
-            </w:r>
-          </w:p>
-        </w:tc>
-      </w:tr>
-      <w:tr>
-        <w:tc>
-          <w:tcPr>
-            <w:tcW w:type="dxa" w:w="567"/>
-          </w:tcPr>
-          <w:p>
-            <w:pPr>
-              <w:spacing w:after="20"/>
-            </w:pPr>
-            <w:r/>
-            <w:r>
-              <w:rPr>
-                <w:b w:val="0"/>
-                <w:sz w:val="19"/>
-              </w:rPr>
-              <w:t>2</w:t>
-            </w:r>
-          </w:p>
-        </w:tc>
-        <w:tc>
-          <w:tcPr>
-            <w:tcW w:type="dxa" w:w="2494"/>
-          </w:tcPr>
-          <w:p>
-            <w:pPr>
-              <w:spacing w:after="20"/>
-            </w:pPr>
-            <w:r/>
-            <w:r>
-              <w:rPr>
-                <w:b w:val="0"/>
-                <w:sz w:val="19"/>
-              </w:rPr>
-              <w:t>Biểu đồ diễn biến</w:t>
-            </w:r>
-          </w:p>
-        </w:tc>
-        <w:tc>
-          <w:tcPr>
-            <w:tcW w:type="dxa" w:w="6123"/>
-          </w:tcPr>
-          <w:p>
-            <w:pPr>
-              <w:spacing w:after="20"/>
-            </w:pPr>
-            <w:r/>
-            <w:r>
-              <w:rPr>
-                <w:b w:val="0"/>
-                <w:sz w:val="19"/>
-              </w:rPr>
-              <w:t>Xem chi tiết ở mục 11</w:t>
-            </w:r>
-          </w:p>
-        </w:tc>
-      </w:tr>
-    </w:tbl>
     <w:p>
       <w:pPr>
-        <w:spacing w:after="40"/>
-      </w:pPr>
+        <w:spacing w:after="80"/>
+        <w:ind w:left="340"/>
+      </w:pPr>
+      <w:r>
+        <w:rPr>
+          <w:b/>
+          <w:color w:val="5B3DF5"/>
+          <w:sz w:val="20"/>
+        </w:rPr>
+        <w:t xml:space="preserve">1. </w:t>
+      </w:r>
+      <w:r>
+        <w:rPr>
+          <w:b/>
+          <w:sz w:val="20"/>
+        </w:rPr>
+        <w:t>Bốn tab bên trong hợp đồng</w:t>
+      </w:r>
+      <w:r>
+        <w:rPr>
+          <w:sz w:val="20"/>
+        </w:rPr>
+        <w:t xml:space="preserve"> — tổng quan (Overview) · Hạng mục (Services) · Giờ (Time) · Chi phí (Expenses). Mọi thứ thuộc về hợp đồng đều nằm trong đây</w:t>
+      </w:r>
+    </w:p>
+    <w:p>
+      <w:pPr>
+        <w:spacing w:after="80"/>
+        <w:ind w:left="340"/>
+      </w:pPr>
+      <w:r>
+        <w:rPr>
+          <w:b/>
+          <w:color w:val="5B3DF5"/>
+          <w:sz w:val="20"/>
+        </w:rPr>
+        <w:t xml:space="preserve">2. </w:t>
+      </w:r>
+      <w:r>
+        <w:rPr>
+          <w:b/>
+          <w:sz w:val="20"/>
+        </w:rPr>
+        <w:t>Biểu đồ diễn biến</w:t>
+      </w:r>
+      <w:r>
+        <w:rPr>
+          <w:sz w:val="20"/>
+        </w:rPr>
+        <w:t xml:space="preserve"> — xem chi tiết ở mục 11</w:t>
+      </w:r>
     </w:p>
     <w:p>
       <w:r>
@@ -6206,141 +5487,32 @@
         <w:t>Hình 8 — Tab Hạng mục</w:t>
       </w:r>
     </w:p>
-    <w:tbl>
-      <w:tblPr>
-        <w:tblStyle w:val="TableGrid"/>
-        <w:tblW w:type="auto" w:w="0"/>
-        <w:jc w:val="center"/>
-        <w:tblLook w:firstColumn="1" w:firstRow="1" w:lastColumn="0" w:lastRow="0" w:noHBand="0" w:noVBand="1" w:val="04A0"/>
-      </w:tblPr>
-      <w:tblGrid>
-        <w:gridCol w:w="3213"/>
-        <w:gridCol w:w="3213"/>
-        <w:gridCol w:w="3213"/>
-      </w:tblGrid>
-      <w:tr>
-        <w:tc>
-          <w:tcPr>
-            <w:tcW w:type="dxa" w:w="567"/>
-            <w:shd w:val="clear" w:fill="5B3DF5"/>
-          </w:tcPr>
-          <w:p>
-            <w:pPr>
-              <w:spacing w:after="20"/>
-            </w:pPr>
-            <w:r/>
-            <w:r>
-              <w:rPr>
-                <w:b/>
-                <w:color w:val="FFFFFF"/>
-                <w:sz w:val="19"/>
-              </w:rPr>
-              <w:t>#</w:t>
-            </w:r>
-          </w:p>
-        </w:tc>
-        <w:tc>
-          <w:tcPr>
-            <w:tcW w:type="dxa" w:w="2494"/>
-            <w:shd w:val="clear" w:fill="5B3DF5"/>
-          </w:tcPr>
-          <w:p>
-            <w:pPr>
-              <w:spacing w:after="20"/>
-            </w:pPr>
-            <w:r/>
-            <w:r>
-              <w:rPr>
-                <w:b/>
-                <w:color w:val="FFFFFF"/>
-                <w:sz w:val="19"/>
-              </w:rPr>
-              <w:t>Cột</w:t>
-            </w:r>
-          </w:p>
-        </w:tc>
-        <w:tc>
-          <w:tcPr>
-            <w:tcW w:type="dxa" w:w="6123"/>
-            <w:shd w:val="clear" w:fill="5B3DF5"/>
-          </w:tcPr>
-          <w:p>
-            <w:pPr>
-              <w:spacing w:after="20"/>
-            </w:pPr>
-            <w:r/>
-            <w:r>
-              <w:rPr>
-                <w:b/>
-                <w:color w:val="FFFFFF"/>
-                <w:sz w:val="19"/>
-              </w:rPr>
-              <w:t>Giải thích</w:t>
-            </w:r>
-          </w:p>
-        </w:tc>
-      </w:tr>
-      <w:tr>
-        <w:tc>
-          <w:tcPr>
-            <w:tcW w:type="dxa" w:w="567"/>
-          </w:tcPr>
-          <w:p>
-            <w:pPr>
-              <w:spacing w:after="20"/>
-            </w:pPr>
-            <w:r/>
-            <w:r>
-              <w:rPr>
-                <w:b w:val="0"/>
-                <w:sz w:val="19"/>
-              </w:rPr>
-              <w:t>1</w:t>
-            </w:r>
-          </w:p>
-        </w:tc>
-        <w:tc>
-          <w:tcPr>
-            <w:tcW w:type="dxa" w:w="2494"/>
-          </w:tcPr>
-          <w:p>
-            <w:pPr>
-              <w:spacing w:after="20"/>
-            </w:pPr>
-            <w:r/>
-            <w:r>
-              <w:rPr>
-                <w:b w:val="0"/>
-                <w:sz w:val="19"/>
-              </w:rPr>
-              <w:t>Toàn bộ header bảng</w:t>
-            </w:r>
-          </w:p>
-        </w:tc>
-        <w:tc>
-          <w:tcPr>
-            <w:tcW w:type="dxa" w:w="6123"/>
-          </w:tcPr>
-          <w:p>
-            <w:pPr>
-              <w:spacing w:after="20"/>
-            </w:pPr>
-            <w:r/>
-            <w:r>
-              <w:rPr>
-                <w:b w:val="0"/>
-                <w:sz w:val="19"/>
-              </w:rPr>
-              <w:t>Nhóm/Hạng mục · Cách tính · Đơn vị · Theo dõi · Ước tính · Số lượng · Đơn giá · Thành tiền</w:t>
-            </w:r>
-          </w:p>
-        </w:tc>
-      </w:tr>
-    </w:tbl>
     <w:p>
       <w:pPr>
-        <w:spacing w:after="40"/>
-      </w:pPr>
+        <w:spacing w:after="80"/>
+        <w:ind w:left="340"/>
+      </w:pPr>
+      <w:r>
+        <w:rPr>
+          <w:b/>
+          <w:color w:val="5B3DF5"/>
+          <w:sz w:val="20"/>
+        </w:rPr>
+        <w:t xml:space="preserve">1. </w:t>
+      </w:r>
+      <w:r>
+        <w:rPr>
+          <w:b/>
+          <w:sz w:val="20"/>
+        </w:rPr>
+        <w:t>Toàn bộ header bảng</w:t>
+      </w:r>
+      <w:r>
+        <w:rPr>
+          <w:sz w:val="20"/>
+        </w:rPr>
+        <w:t xml:space="preserve"> — nhóm/Hạng mục · Cách tính · Đơn vị · Theo dõi · Ước tính · Số lượng · Đơn giá · Thành tiền</w:t>
+      </w:r>
     </w:p>
     <w:p>
       <w:pPr>
@@ -8694,141 +7866,32 @@
         <w:t>Hình 13 — Chế độ Bảng</w:t>
       </w:r>
     </w:p>
-    <w:tbl>
-      <w:tblPr>
-        <w:tblStyle w:val="TableGrid"/>
-        <w:tblW w:type="auto" w:w="0"/>
-        <w:jc w:val="center"/>
-        <w:tblLook w:firstColumn="1" w:firstRow="1" w:lastColumn="0" w:lastRow="0" w:noHBand="0" w:noVBand="1" w:val="04A0"/>
-      </w:tblPr>
-      <w:tblGrid>
-        <w:gridCol w:w="3213"/>
-        <w:gridCol w:w="3213"/>
-        <w:gridCol w:w="3213"/>
-      </w:tblGrid>
-      <w:tr>
-        <w:tc>
-          <w:tcPr>
-            <w:tcW w:type="dxa" w:w="567"/>
-            <w:shd w:val="clear" w:fill="5B3DF5"/>
-          </w:tcPr>
-          <w:p>
-            <w:pPr>
-              <w:spacing w:after="20"/>
-            </w:pPr>
-            <w:r/>
-            <w:r>
-              <w:rPr>
-                <w:b/>
-                <w:color w:val="FFFFFF"/>
-                <w:sz w:val="19"/>
-              </w:rPr>
-              <w:t>#</w:t>
-            </w:r>
-          </w:p>
-        </w:tc>
-        <w:tc>
-          <w:tcPr>
-            <w:tcW w:type="dxa" w:w="1928"/>
-            <w:shd w:val="clear" w:fill="5B3DF5"/>
-          </w:tcPr>
-          <w:p>
-            <w:pPr>
-              <w:spacing w:after="20"/>
-            </w:pPr>
-            <w:r/>
-            <w:r>
-              <w:rPr>
-                <w:b/>
-                <w:color w:val="FFFFFF"/>
-                <w:sz w:val="19"/>
-              </w:rPr>
-              <w:t>Thành phần</w:t>
-            </w:r>
-          </w:p>
-        </w:tc>
-        <w:tc>
-          <w:tcPr>
-            <w:tcW w:type="dxa" w:w="6690"/>
-            <w:shd w:val="clear" w:fill="5B3DF5"/>
-          </w:tcPr>
-          <w:p>
-            <w:pPr>
-              <w:spacing w:after="20"/>
-            </w:pPr>
-            <w:r/>
-            <w:r>
-              <w:rPr>
-                <w:b/>
-                <w:color w:val="FFFFFF"/>
-                <w:sz w:val="19"/>
-              </w:rPr>
-              <w:t>Giải thích</w:t>
-            </w:r>
-          </w:p>
-        </w:tc>
-      </w:tr>
-      <w:tr>
-        <w:tc>
-          <w:tcPr>
-            <w:tcW w:type="dxa" w:w="567"/>
-          </w:tcPr>
-          <w:p>
-            <w:pPr>
-              <w:spacing w:after="20"/>
-            </w:pPr>
-            <w:r/>
-            <w:r>
-              <w:rPr>
-                <w:b w:val="0"/>
-                <w:sz w:val="19"/>
-              </w:rPr>
-              <w:t>1</w:t>
-            </w:r>
-          </w:p>
-        </w:tc>
-        <w:tc>
-          <w:tcPr>
-            <w:tcW w:type="dxa" w:w="1928"/>
-          </w:tcPr>
-          <w:p>
-            <w:pPr>
-              <w:spacing w:after="20"/>
-            </w:pPr>
-            <w:r/>
-            <w:r>
-              <w:rPr>
-                <w:b w:val="0"/>
-                <w:sz w:val="19"/>
-              </w:rPr>
-              <w:t>Thanh công cụ</w:t>
-            </w:r>
-          </w:p>
-        </w:tc>
-        <w:tc>
-          <w:tcPr>
-            <w:tcW w:type="dxa" w:w="6690"/>
-          </w:tcPr>
-          <w:p>
-            <w:pPr>
-              <w:spacing w:after="20"/>
-            </w:pPr>
-            <w:r/>
-            <w:r>
-              <w:rPr>
-                <w:b w:val="0"/>
-                <w:sz w:val="19"/>
-              </w:rPr>
-              <w:t>Cột (chọn cột hiện) · Bộ lọc (chỉ dòng chờ duyệt, lọc theo người) · Nhóm (theo nhân sự / hợp đồng / hạng mục) · Tìm kiếm</w:t>
-            </w:r>
-          </w:p>
-        </w:tc>
-      </w:tr>
-    </w:tbl>
     <w:p>
       <w:pPr>
-        <w:spacing w:after="40"/>
-      </w:pPr>
+        <w:spacing w:after="80"/>
+        <w:ind w:left="340"/>
+      </w:pPr>
+      <w:r>
+        <w:rPr>
+          <w:b/>
+          <w:color w:val="5B3DF5"/>
+          <w:sz w:val="20"/>
+        </w:rPr>
+        <w:t xml:space="preserve">1. </w:t>
+      </w:r>
+      <w:r>
+        <w:rPr>
+          <w:b/>
+          <w:sz w:val="20"/>
+        </w:rPr>
+        <w:t>Thanh công cụ</w:t>
+      </w:r>
+      <w:r>
+        <w:rPr>
+          <w:sz w:val="20"/>
+        </w:rPr>
+        <w:t xml:space="preserve"> — cột (chọn cột hiện) · Bộ lọc (chỉ dòng chờ duyệt, lọc theo người) · Nhóm (theo nhân sự / hợp đồng / hạng mục) · Tìm kiếm</w:t>
+      </w:r>
     </w:p>
     <w:p>
       <w:r>
@@ -8949,141 +8012,32 @@
         <w:t>Hình 14 — Màn Chi phí toàn công ty</w:t>
       </w:r>
     </w:p>
-    <w:tbl>
-      <w:tblPr>
-        <w:tblStyle w:val="TableGrid"/>
-        <w:tblW w:type="auto" w:w="0"/>
-        <w:jc w:val="center"/>
-        <w:tblLook w:firstColumn="1" w:firstRow="1" w:lastColumn="0" w:lastRow="0" w:noHBand="0" w:noVBand="1" w:val="04A0"/>
-      </w:tblPr>
-      <w:tblGrid>
-        <w:gridCol w:w="3213"/>
-        <w:gridCol w:w="3213"/>
-        <w:gridCol w:w="3213"/>
-      </w:tblGrid>
-      <w:tr>
-        <w:tc>
-          <w:tcPr>
-            <w:tcW w:type="dxa" w:w="567"/>
-            <w:shd w:val="clear" w:fill="5B3DF5"/>
-          </w:tcPr>
-          <w:p>
-            <w:pPr>
-              <w:spacing w:after="20"/>
-            </w:pPr>
-            <w:r/>
-            <w:r>
-              <w:rPr>
-                <w:b/>
-                <w:color w:val="FFFFFF"/>
-                <w:sz w:val="19"/>
-              </w:rPr>
-              <w:t>#</w:t>
-            </w:r>
-          </w:p>
-        </w:tc>
-        <w:tc>
-          <w:tcPr>
-            <w:tcW w:type="dxa" w:w="1928"/>
-            <w:shd w:val="clear" w:fill="5B3DF5"/>
-          </w:tcPr>
-          <w:p>
-            <w:pPr>
-              <w:spacing w:after="20"/>
-            </w:pPr>
-            <w:r/>
-            <w:r>
-              <w:rPr>
-                <w:b/>
-                <w:color w:val="FFFFFF"/>
-                <w:sz w:val="19"/>
-              </w:rPr>
-              <w:t>Cột</w:t>
-            </w:r>
-          </w:p>
-        </w:tc>
-        <w:tc>
-          <w:tcPr>
-            <w:tcW w:type="dxa" w:w="6690"/>
-            <w:shd w:val="clear" w:fill="5B3DF5"/>
-          </w:tcPr>
-          <w:p>
-            <w:pPr>
-              <w:spacing w:after="20"/>
-            </w:pPr>
-            <w:r/>
-            <w:r>
-              <w:rPr>
-                <w:b/>
-                <w:color w:val="FFFFFF"/>
-                <w:sz w:val="19"/>
-              </w:rPr>
-              <w:t>Giải thích</w:t>
-            </w:r>
-          </w:p>
-        </w:tc>
-      </w:tr>
-      <w:tr>
-        <w:tc>
-          <w:tcPr>
-            <w:tcW w:type="dxa" w:w="567"/>
-          </w:tcPr>
-          <w:p>
-            <w:pPr>
-              <w:spacing w:after="20"/>
-            </w:pPr>
-            <w:r/>
-            <w:r>
-              <w:rPr>
-                <w:b w:val="0"/>
-                <w:sz w:val="19"/>
-              </w:rPr>
-              <w:t>1</w:t>
-            </w:r>
-          </w:p>
-        </w:tc>
-        <w:tc>
-          <w:tcPr>
-            <w:tcW w:type="dxa" w:w="1928"/>
-          </w:tcPr>
-          <w:p>
-            <w:pPr>
-              <w:spacing w:after="20"/>
-            </w:pPr>
-            <w:r/>
-            <w:r>
-              <w:rPr>
-                <w:b w:val="0"/>
-                <w:sz w:val="19"/>
-              </w:rPr>
-              <w:t>Header bảng</w:t>
-            </w:r>
-          </w:p>
-        </w:tc>
-        <w:tc>
-          <w:tcPr>
-            <w:tcW w:type="dxa" w:w="6690"/>
-          </w:tcPr>
-          <w:p>
-            <w:pPr>
-              <w:spacing w:after="20"/>
-            </w:pPr>
-            <w:r/>
-            <w:r>
-              <w:rPr>
-                <w:b w:val="0"/>
-                <w:sz w:val="19"/>
-              </w:rPr>
-              <w:t>Hạng mục · Nội dung · Ngày · Thanh toán · Tệp · Chi ra · Tính khách · Duyệt</w:t>
-            </w:r>
-          </w:p>
-        </w:tc>
-      </w:tr>
-    </w:tbl>
     <w:p>
       <w:pPr>
-        <w:spacing w:after="40"/>
-      </w:pPr>
+        <w:spacing w:after="80"/>
+        <w:ind w:left="340"/>
+      </w:pPr>
+      <w:r>
+        <w:rPr>
+          <w:b/>
+          <w:color w:val="5B3DF5"/>
+          <w:sz w:val="20"/>
+        </w:rPr>
+        <w:t xml:space="preserve">1. </w:t>
+      </w:r>
+      <w:r>
+        <w:rPr>
+          <w:b/>
+          <w:sz w:val="20"/>
+        </w:rPr>
+        <w:t>Header bảng</w:t>
+      </w:r>
+      <w:r>
+        <w:rPr>
+          <w:sz w:val="20"/>
+        </w:rPr>
+        <w:t xml:space="preserve"> — hạng mục · Nội dung · Ngày · Thanh toán · Tệp · Chi ra · Tính khách · Duyệt</w:t>
+      </w:r>
     </w:p>
     <w:p>
       <w:pPr>

</xml_diff>